<commit_message>
docs: actualización plan de respaldo
</commit_message>
<xml_diff>
--- a/7_Trimestre/Documentación/Planes/Plan de Respaldo de datos.docx
+++ b/7_Trimestre/Documentación/Planes/Plan de Respaldo de datos.docx
@@ -2941,7 +2941,27 @@
           <w:szCs w:val="24"/>
           <w:lang w:eastAsia="es-419"/>
         </w:rPr>
-        <w:t>Proteger la base de datos MySQL frente a pérdida, corrupción o accesos no autorizados.</w:t>
+        <w:t xml:space="preserve">Proteger la base de datos </w:t>
+      </w:r>
+      <w:proofErr w:type="spellStart"/>
+      <w:r>
+        <w:rPr>
+          <w:rFonts w:ascii="Times New Roman" w:eastAsia="Times New Roman" w:hAnsi="Times New Roman" w:cs="Times New Roman"/>
+          <w:sz w:val="24"/>
+          <w:szCs w:val="24"/>
+          <w:lang w:eastAsia="es-419"/>
+        </w:rPr>
+        <w:t>MariaDB</w:t>
+      </w:r>
+      <w:proofErr w:type="spellEnd"/>
+      <w:r>
+        <w:rPr>
+          <w:rFonts w:ascii="Times New Roman" w:eastAsia="Times New Roman" w:hAnsi="Times New Roman" w:cs="Times New Roman"/>
+          <w:sz w:val="24"/>
+          <w:szCs w:val="24"/>
+          <w:lang w:eastAsia="es-419"/>
+        </w:rPr>
+        <w:t xml:space="preserve"> frente a pérdida, corrupción o accesos no autorizados.</w:t>
       </w:r>
     </w:p>
     <w:p>
@@ -3188,7 +3208,31 @@
           <w:lang w:eastAsia="es-419"/>
         </w:rPr>
         <w:lastRenderedPageBreak/>
-        <w:t>Base de datos MySQL:</w:t>
+        <w:t xml:space="preserve">Base de datos </w:t>
+      </w:r>
+      <w:proofErr w:type="spellStart"/>
+      <w:r>
+        <w:rPr>
+          <w:rFonts w:ascii="Times New Roman" w:eastAsia="Times New Roman" w:hAnsi="Times New Roman" w:cs="Times New Roman"/>
+          <w:b/>
+          <w:bCs/>
+          <w:sz w:val="24"/>
+          <w:szCs w:val="24"/>
+          <w:lang w:eastAsia="es-419"/>
+        </w:rPr>
+        <w:t>MariaDB</w:t>
+      </w:r>
+      <w:proofErr w:type="spellEnd"/>
+      <w:r>
+        <w:rPr>
+          <w:rFonts w:ascii="Times New Roman" w:eastAsia="Times New Roman" w:hAnsi="Times New Roman" w:cs="Times New Roman"/>
+          <w:b/>
+          <w:bCs/>
+          <w:sz w:val="24"/>
+          <w:szCs w:val="24"/>
+          <w:lang w:eastAsia="es-419"/>
+        </w:rPr>
+        <w:t>:</w:t>
       </w:r>
       <w:r>
         <w:rPr>
@@ -4249,6 +4293,82 @@
           <w:szCs w:val="24"/>
           <w:lang w:eastAsia="es-419"/>
         </w:rPr>
+        <w:t>0</w:t>
+      </w:r>
+      <w:r>
+        <w:rPr>
+          <w:rFonts w:ascii="Times New Roman" w:eastAsia="Times New Roman" w:hAnsi="Times New Roman" w:cs="Times New Roman"/>
+          <w:sz w:val="24"/>
+          <w:szCs w:val="24"/>
+          <w:lang w:eastAsia="es-419"/>
+        </w:rPr>
+        <w:t>1</w:t>
+      </w:r>
+      <w:r>
+        <w:rPr>
+          <w:rFonts w:ascii="Times New Roman" w:eastAsia="Times New Roman" w:hAnsi="Times New Roman" w:cs="Times New Roman"/>
+          <w:sz w:val="24"/>
+          <w:szCs w:val="24"/>
+          <w:lang w:eastAsia="es-419"/>
+        </w:rPr>
+        <w:t xml:space="preserve"> de </w:t>
+      </w:r>
+      <w:proofErr w:type="gramStart"/>
+      <w:r>
+        <w:rPr>
+          <w:rFonts w:ascii="Times New Roman" w:eastAsia="Times New Roman" w:hAnsi="Times New Roman" w:cs="Times New Roman"/>
+          <w:sz w:val="24"/>
+          <w:szCs w:val="24"/>
+          <w:lang w:eastAsia="es-419"/>
+        </w:rPr>
+        <w:t>Abril</w:t>
+      </w:r>
+      <w:proofErr w:type="gramEnd"/>
+      <w:r>
+        <w:rPr>
+          <w:rFonts w:ascii="Times New Roman" w:eastAsia="Times New Roman" w:hAnsi="Times New Roman" w:cs="Times New Roman"/>
+          <w:sz w:val="24"/>
+          <w:szCs w:val="24"/>
+          <w:lang w:eastAsia="es-419"/>
+        </w:rPr>
+        <w:t xml:space="preserve"> de 2026</w:t>
+      </w:r>
+      <w:r>
+        <w:rPr>
+          <w:rFonts w:ascii="Times New Roman" w:eastAsia="Times New Roman" w:hAnsi="Times New Roman" w:cs="Times New Roman"/>
+          <w:sz w:val="24"/>
+          <w:szCs w:val="24"/>
+          <w:lang w:eastAsia="es-419"/>
+        </w:rPr>
+        <w:br/>
+      </w:r>
+      <w:r>
+        <w:rPr>
+          <w:rFonts w:ascii="Times New Roman" w:eastAsia="Times New Roman" w:hAnsi="Times New Roman" w:cs="Times New Roman"/>
+          <w:b/>
+          <w:bCs/>
+          <w:sz w:val="24"/>
+          <w:szCs w:val="24"/>
+          <w:lang w:eastAsia="es-419"/>
+        </w:rPr>
+        <w:t>Primera ejecución:</w:t>
+      </w:r>
+      <w:r>
+        <w:rPr>
+          <w:rFonts w:ascii="Times New Roman" w:eastAsia="Times New Roman" w:hAnsi="Times New Roman" w:cs="Times New Roman"/>
+          <w:sz w:val="24"/>
+          <w:szCs w:val="24"/>
+          <w:lang w:eastAsia="es-419"/>
+        </w:rPr>
+        <w:t xml:space="preserve"> </w:t>
+      </w:r>
+      <w:r>
+        <w:rPr>
+          <w:rFonts w:ascii="Times New Roman" w:eastAsia="Times New Roman" w:hAnsi="Times New Roman" w:cs="Times New Roman"/>
+          <w:sz w:val="24"/>
+          <w:szCs w:val="24"/>
+          <w:lang w:eastAsia="es-419"/>
+        </w:rPr>
         <w:t>01</w:t>
       </w:r>
       <w:r>
@@ -4258,74 +4378,25 @@
           <w:szCs w:val="24"/>
           <w:lang w:eastAsia="es-419"/>
         </w:rPr>
-        <w:t xml:space="preserve"> de </w:t>
-      </w:r>
-      <w:proofErr w:type="gramStart"/>
-      <w:r>
-        <w:rPr>
-          <w:rFonts w:ascii="Times New Roman" w:eastAsia="Times New Roman" w:hAnsi="Times New Roman" w:cs="Times New Roman"/>
-          <w:sz w:val="24"/>
-          <w:szCs w:val="24"/>
-          <w:lang w:eastAsia="es-419"/>
-        </w:rPr>
-        <w:t>Abril</w:t>
-      </w:r>
-      <w:proofErr w:type="gramEnd"/>
-      <w:r>
-        <w:rPr>
-          <w:rFonts w:ascii="Times New Roman" w:eastAsia="Times New Roman" w:hAnsi="Times New Roman" w:cs="Times New Roman"/>
-          <w:sz w:val="24"/>
-          <w:szCs w:val="24"/>
-          <w:lang w:eastAsia="es-419"/>
-        </w:rPr>
-        <w:t xml:space="preserve"> de 2026</w:t>
-      </w:r>
-      <w:r>
-        <w:rPr>
-          <w:rFonts w:ascii="Times New Roman" w:eastAsia="Times New Roman" w:hAnsi="Times New Roman" w:cs="Times New Roman"/>
-          <w:sz w:val="24"/>
-          <w:szCs w:val="24"/>
-          <w:lang w:eastAsia="es-419"/>
-        </w:rPr>
-        <w:br/>
-      </w:r>
-      <w:r>
-        <w:rPr>
-          <w:rFonts w:ascii="Times New Roman" w:eastAsia="Times New Roman" w:hAnsi="Times New Roman" w:cs="Times New Roman"/>
-          <w:b/>
-          <w:bCs/>
-          <w:sz w:val="24"/>
-          <w:szCs w:val="24"/>
-          <w:lang w:eastAsia="es-419"/>
-        </w:rPr>
-        <w:t>Primera ejecución:</w:t>
-      </w:r>
-      <w:r>
-        <w:rPr>
-          <w:rFonts w:ascii="Times New Roman" w:eastAsia="Times New Roman" w:hAnsi="Times New Roman" w:cs="Times New Roman"/>
-          <w:sz w:val="24"/>
-          <w:szCs w:val="24"/>
-          <w:lang w:eastAsia="es-419"/>
-        </w:rPr>
-        <w:t xml:space="preserve"> </w:t>
-      </w:r>
-      <w:r>
-        <w:rPr>
-          <w:rFonts w:ascii="Times New Roman" w:eastAsia="Times New Roman" w:hAnsi="Times New Roman" w:cs="Times New Roman"/>
-          <w:sz w:val="24"/>
-          <w:szCs w:val="24"/>
-          <w:lang w:eastAsia="es-419"/>
-        </w:rPr>
-        <w:t>01</w:t>
-      </w:r>
-      <w:r>
-        <w:rPr>
-          <w:rFonts w:ascii="Times New Roman" w:eastAsia="Times New Roman" w:hAnsi="Times New Roman" w:cs="Times New Roman"/>
-          <w:sz w:val="24"/>
-          <w:szCs w:val="24"/>
-          <w:lang w:eastAsia="es-419"/>
-        </w:rPr>
-        <w:t xml:space="preserve"> de Abril de 2026 – 02:00 AM</w:t>
+        <w:t xml:space="preserve"> de Abril de 2026 – 0</w:t>
+      </w:r>
+      <w:r>
+        <w:rPr>
+          <w:rFonts w:ascii="Times New Roman" w:eastAsia="Times New Roman" w:hAnsi="Times New Roman" w:cs="Times New Roman"/>
+          <w:sz w:val="24"/>
+          <w:szCs w:val="24"/>
+          <w:lang w:eastAsia="es-419"/>
+        </w:rPr>
+        <w:t>7</w:t>
+      </w:r>
+      <w:r>
+        <w:rPr>
+          <w:rFonts w:ascii="Times New Roman" w:eastAsia="Times New Roman" w:hAnsi="Times New Roman" w:cs="Times New Roman"/>
+          <w:sz w:val="24"/>
+          <w:szCs w:val="24"/>
+          <w:lang w:eastAsia="es-419"/>
+        </w:rPr>
+        <w:t>:00 AM</w:t>
       </w:r>
     </w:p>
     <w:p>
@@ -4728,17 +4799,6 @@
           <w:lang w:eastAsia="es-419"/>
         </w:rPr>
       </w:pPr>
-      <w:r>
-        <w:rPr>
-          <w:rFonts w:ascii="Times New Roman" w:eastAsia="Times New Roman" w:hAnsi="Times New Roman" w:cs="Times New Roman"/>
-          <w:b/>
-          <w:bCs/>
-          <w:sz w:val="24"/>
-          <w:szCs w:val="24"/>
-          <w:lang w:eastAsia="es-419"/>
-        </w:rPr>
-        <w:t xml:space="preserve">MySQL </w:t>
-      </w:r>
       <w:proofErr w:type="spellStart"/>
       <w:r>
         <w:rPr>
@@ -13287,7 +13347,27 @@
           <w:szCs w:val="24"/>
           <w:lang w:eastAsia="es-419"/>
         </w:rPr>
-        <w:t xml:space="preserve">Instalar Node.js, MySQL y </w:t>
+        <w:t xml:space="preserve">Instalar Node.js, </w:t>
+      </w:r>
+      <w:proofErr w:type="spellStart"/>
+      <w:r>
+        <w:rPr>
+          <w:rFonts w:ascii="Times New Roman" w:eastAsia="Times New Roman" w:hAnsi="Times New Roman" w:cs="Times New Roman"/>
+          <w:sz w:val="24"/>
+          <w:szCs w:val="24"/>
+          <w:lang w:eastAsia="es-419"/>
+        </w:rPr>
+        <w:t>MariaDB</w:t>
+      </w:r>
+      <w:proofErr w:type="spellEnd"/>
+      <w:r>
+        <w:rPr>
+          <w:rFonts w:ascii="Times New Roman" w:eastAsia="Times New Roman" w:hAnsi="Times New Roman" w:cs="Times New Roman"/>
+          <w:sz w:val="24"/>
+          <w:szCs w:val="24"/>
+          <w:lang w:eastAsia="es-419"/>
+        </w:rPr>
+        <w:t xml:space="preserve"> y </w:t>
       </w:r>
       <w:proofErr w:type="spellStart"/>
       <w:r>

</xml_diff>

<commit_message>
docs: actualizar plan de respaldo de datos y corrige información según proyecto
</commit_message>
<xml_diff>
--- a/7_Trimestre/Documentación/Planes/Plan de Respaldo de datos.docx
+++ b/7_Trimestre/Documentación/Planes/Plan de Respaldo de datos.docx
@@ -1,6 +1,6 @@
 
 <file path=word/document.xml><?xml version="1.0" encoding="utf-8"?>
-<w:document xmlns:wpc="http://schemas.microsoft.com/office/word/2010/wordprocessingCanvas" xmlns:cx="http://schemas.microsoft.com/office/drawing/2014/chartex" xmlns:cx1="http://schemas.microsoft.com/office/drawing/2015/9/8/chartex" xmlns:cx2="http://schemas.microsoft.com/office/drawing/2015/10/21/chartex" xmlns:cx3="http://schemas.microsoft.com/office/drawing/2016/5/9/chartex" xmlns:cx4="http://schemas.microsoft.com/office/drawing/2016/5/10/chartex" xmlns:cx5="http://schemas.microsoft.com/office/drawing/2016/5/11/chartex" xmlns:cx6="http://schemas.microsoft.com/office/drawing/2016/5/12/chartex" xmlns:cx7="http://schemas.microsoft.com/office/drawing/2016/5/13/chartex" xmlns:cx8="http://schemas.microsoft.com/office/drawing/2016/5/14/chartex" xmlns:mc="http://schemas.openxmlformats.org/markup-compatibility/2006" xmlns:aink="http://schemas.microsoft.com/office/drawing/2016/ink" xmlns:am3d="http://schemas.microsoft.com/office/drawing/2017/model3d" xmlns:o="urn:schemas-microsoft-com:office:office" xmlns:oel="http://schemas.microsoft.com/office/2019/extlst" xmlns:r="http://schemas.openxmlformats.org/officeDocument/2006/relationships" xmlns:m="http://schemas.openxmlformats.org/officeDocument/2006/math" xmlns:v="urn:schemas-microsoft-com:vml" xmlns:wp14="http://schemas.microsoft.com/office/word/2010/wordprocessingDrawing" xmlns:wp="http://schemas.openxmlformats.org/drawingml/2006/wordprocessingDrawing" xmlns:w10="urn:schemas-microsoft-com:office:word" xmlns:w="http://schemas.openxmlformats.org/wordprocessingml/2006/main" xmlns:w14="http://schemas.microsoft.com/office/word/2010/wordml" xmlns:w15="http://schemas.microsoft.com/office/word/2012/wordml" xmlns:w16cex="http://schemas.microsoft.com/office/word/2018/wordml/cex" xmlns:w16cid="http://schemas.microsoft.com/office/word/2016/wordml/cid" xmlns:w16="http://schemas.microsoft.com/office/word/2018/wordml" xmlns:w16du="http://schemas.microsoft.com/office/word/2023/wordml/word16du" xmlns:w16sdtdh="http://schemas.microsoft.com/office/word/2020/wordml/sdtdatahash" xmlns:w16se="http://schemas.microsoft.com/office/word/2015/wordml/symex" xmlns:wpg="http://schemas.microsoft.com/office/word/2010/wordprocessingGroup" xmlns:wpi="http://schemas.microsoft.com/office/word/2010/wordprocessingInk" xmlns:wne="http://schemas.microsoft.com/office/word/2006/wordml" xmlns:wps="http://schemas.microsoft.com/office/word/2010/wordprocessingShape" mc:Ignorable="w14 w15 w16se w16cid w16 w16cex w16sdtdh wp14">
+<w:document xmlns:wpc="http://schemas.microsoft.com/office/word/2010/wordprocessingCanvas" xmlns:cx="http://schemas.microsoft.com/office/drawing/2014/chartex" xmlns:cx1="http://schemas.microsoft.com/office/drawing/2015/9/8/chartex" xmlns:cx2="http://schemas.microsoft.com/office/drawing/2015/10/21/chartex" xmlns:cx3="http://schemas.microsoft.com/office/drawing/2016/5/9/chartex" xmlns:cx4="http://schemas.microsoft.com/office/drawing/2016/5/10/chartex" xmlns:cx5="http://schemas.microsoft.com/office/drawing/2016/5/11/chartex" xmlns:cx6="http://schemas.microsoft.com/office/drawing/2016/5/12/chartex" xmlns:cx7="http://schemas.microsoft.com/office/drawing/2016/5/13/chartex" xmlns:cx8="http://schemas.microsoft.com/office/drawing/2016/5/14/chartex" xmlns:mc="http://schemas.openxmlformats.org/markup-compatibility/2006" xmlns:aink="http://schemas.microsoft.com/office/drawing/2016/ink" xmlns:am3d="http://schemas.microsoft.com/office/drawing/2017/model3d" xmlns:o="urn:schemas-microsoft-com:office:office" xmlns:r="http://schemas.openxmlformats.org/officeDocument/2006/relationships" xmlns:m="http://schemas.openxmlformats.org/officeDocument/2006/math" xmlns:v="urn:schemas-microsoft-com:vml" xmlns:wp14="http://schemas.microsoft.com/office/word/2010/wordprocessingDrawing" xmlns:wp="http://schemas.openxmlformats.org/drawingml/2006/wordprocessingDrawing" xmlns:w10="urn:schemas-microsoft-com:office:word" xmlns:w="http://schemas.openxmlformats.org/wordprocessingml/2006/main" xmlns:w14="http://schemas.microsoft.com/office/word/2010/wordml" xmlns:w15="http://schemas.microsoft.com/office/word/2012/wordml" xmlns:w16cex="http://schemas.microsoft.com/office/word/2018/wordml/cex" xmlns:w16cid="http://schemas.microsoft.com/office/word/2016/wordml/cid" xmlns:w16="http://schemas.microsoft.com/office/word/2018/wordml" xmlns:w16sdtdh="http://schemas.microsoft.com/office/word/2020/wordml/sdtdatahash" xmlns:w16se="http://schemas.microsoft.com/office/word/2015/wordml/symex" xmlns:wpg="http://schemas.microsoft.com/office/word/2010/wordprocessingGroup" xmlns:wpi="http://schemas.microsoft.com/office/word/2010/wordprocessingInk" xmlns:wne="http://schemas.microsoft.com/office/word/2006/wordml" xmlns:wps="http://schemas.microsoft.com/office/word/2010/wordprocessingShape" mc:Ignorable="w14 w15 w16se w16cid w16 w16cex w16sdtdh wp14">
   <w:body>
     <w:p>
       <w:pPr>
@@ -5537,7 +5537,7 @@
           <w:szCs w:val="20"/>
           <w:lang w:eastAsia="es-419"/>
         </w:rPr>
-        <w:t xml:space="preserve"> -u usuario -p </w:t>
+        <w:t xml:space="preserve"> -u </w:t>
       </w:r>
       <w:proofErr w:type="spellStart"/>
       <w:r>
@@ -5547,7 +5547,7 @@
           <w:szCs w:val="20"/>
           <w:lang w:eastAsia="es-419"/>
         </w:rPr>
-        <w:t>nombre_bd</w:t>
+        <w:t>comunidad_usuario</w:t>
       </w:r>
       <w:proofErr w:type="spellEnd"/>
       <w:r>
@@ -5557,7 +5557,7 @@
           <w:szCs w:val="20"/>
           <w:lang w:eastAsia="es-419"/>
         </w:rPr>
-        <w:t xml:space="preserve"> &gt; </w:t>
+        <w:t xml:space="preserve"> -p </w:t>
       </w:r>
       <w:proofErr w:type="spellStart"/>
       <w:r>
@@ -5567,7 +5567,36 @@
           <w:szCs w:val="20"/>
           <w:lang w:eastAsia="es-419"/>
         </w:rPr>
-        <w:t>backup.sql</w:t>
+        <w:t>comunidadinteligente</w:t>
+      </w:r>
+      <w:proofErr w:type="spellEnd"/>
+      <w:r>
+        <w:rPr>
+          <w:rFonts w:ascii="Courier New" w:eastAsia="Times New Roman" w:hAnsi="Courier New" w:cs="Courier New"/>
+          <w:sz w:val="20"/>
+          <w:szCs w:val="20"/>
+          <w:lang w:eastAsia="es-419"/>
+        </w:rPr>
+        <w:t xml:space="preserve"> &gt; </w:t>
+      </w:r>
+      <w:proofErr w:type="spellStart"/>
+      <w:r>
+        <w:rPr>
+          <w:rFonts w:ascii="Courier New" w:eastAsia="Times New Roman" w:hAnsi="Courier New" w:cs="Courier New"/>
+          <w:sz w:val="20"/>
+          <w:szCs w:val="20"/>
+          <w:lang w:eastAsia="es-419"/>
+        </w:rPr>
+        <w:t>comunidadinteligente</w:t>
+      </w:r>
+      <w:r>
+        <w:rPr>
+          <w:rFonts w:ascii="Courier New" w:eastAsia="Times New Roman" w:hAnsi="Courier New" w:cs="Courier New"/>
+          <w:sz w:val="20"/>
+          <w:szCs w:val="20"/>
+          <w:lang w:eastAsia="es-419"/>
+        </w:rPr>
+        <w:t>.sql</w:t>
       </w:r>
       <w:proofErr w:type="spellEnd"/>
     </w:p>
@@ -5751,6 +5780,7 @@
           <w:szCs w:val="24"/>
           <w:lang w:eastAsia="es-419"/>
         </w:rPr>
+        <w:lastRenderedPageBreak/>
         <w:t>Recuperación rápida:</w:t>
       </w:r>
       <w:r>
@@ -5786,7 +5816,6 @@
           <w:szCs w:val="24"/>
           <w:lang w:eastAsia="es-419"/>
         </w:rPr>
-        <w:lastRenderedPageBreak/>
         <w:t>Portabilidad:</w:t>
       </w:r>
       <w:r>
@@ -6804,6 +6833,7 @@
           <w:szCs w:val="24"/>
           <w:lang w:eastAsia="es-419"/>
         </w:rPr>
+        <w:lastRenderedPageBreak/>
         <w:t>Trazabilidad del desarrollo</w:t>
       </w:r>
     </w:p>
@@ -7440,6 +7470,7 @@
           <w:szCs w:val="27"/>
           <w:lang w:eastAsia="es-419"/>
         </w:rPr>
+        <w:lastRenderedPageBreak/>
         <w:t>1. Servidor en la nube (Hostinger)</w:t>
       </w:r>
     </w:p>
@@ -7465,7 +7496,6 @@
           <w:szCs w:val="24"/>
           <w:lang w:eastAsia="es-419"/>
         </w:rPr>
-        <w:lastRenderedPageBreak/>
         <w:t>Backups</w:t>
       </w:r>
       <w:proofErr w:type="spellEnd"/>
@@ -8136,7 +8166,6 @@
           <w:szCs w:val="36"/>
           <w:lang w:eastAsia="es-419"/>
         </w:rPr>
-        <w:lastRenderedPageBreak/>
         <w:t>RPO (</w:t>
       </w:r>
       <w:proofErr w:type="spellStart"/>
@@ -8758,6 +8787,7 @@
           <w:szCs w:val="27"/>
           <w:lang w:eastAsia="es-419"/>
         </w:rPr>
+        <w:lastRenderedPageBreak/>
         <w:t>Verificación:</w:t>
       </w:r>
     </w:p>
@@ -8782,7 +8812,6 @@
           <w:szCs w:val="24"/>
           <w:lang w:eastAsia="es-419"/>
         </w:rPr>
-        <w:lastRenderedPageBreak/>
         <w:t xml:space="preserve">Revisar historial de </w:t>
       </w:r>
       <w:proofErr w:type="spellStart"/>
@@ -9128,6 +9157,7 @@
     </w:p>
     <w:p>
       <w:pPr>
+        <w:pStyle w:val="Prrafodelista"/>
         <w:tabs>
           <w:tab w:val="left" w:pos="916"/>
           <w:tab w:val="left" w:pos="1832"/>
@@ -9172,7 +9202,7 @@
           <w:szCs w:val="20"/>
           <w:lang w:eastAsia="es-419"/>
         </w:rPr>
-        <w:t xml:space="preserve"> -u usuario -p </w:t>
+        <w:t xml:space="preserve"> -u </w:t>
       </w:r>
       <w:proofErr w:type="spellStart"/>
       <w:r>
@@ -9182,7 +9212,7 @@
           <w:szCs w:val="20"/>
           <w:lang w:eastAsia="es-419"/>
         </w:rPr>
-        <w:t>nombre_bd</w:t>
+        <w:t>comunidad_usuario</w:t>
       </w:r>
       <w:proofErr w:type="spellEnd"/>
       <w:r>
@@ -9192,7 +9222,7 @@
           <w:szCs w:val="20"/>
           <w:lang w:eastAsia="es-419"/>
         </w:rPr>
-        <w:t xml:space="preserve"> &gt; </w:t>
+        <w:t xml:space="preserve"> -p </w:t>
       </w:r>
       <w:proofErr w:type="spellStart"/>
       <w:r>
@@ -9202,7 +9232,27 @@
           <w:szCs w:val="20"/>
           <w:lang w:eastAsia="es-419"/>
         </w:rPr>
-        <w:t>backup.sql</w:t>
+        <w:t>comunidadinteligente</w:t>
+      </w:r>
+      <w:proofErr w:type="spellEnd"/>
+      <w:r>
+        <w:rPr>
+          <w:rFonts w:ascii="Courier New" w:eastAsia="Times New Roman" w:hAnsi="Courier New" w:cs="Courier New"/>
+          <w:sz w:val="20"/>
+          <w:szCs w:val="20"/>
+          <w:lang w:eastAsia="es-419"/>
+        </w:rPr>
+        <w:t xml:space="preserve"> &gt; </w:t>
+      </w:r>
+      <w:proofErr w:type="spellStart"/>
+      <w:r>
+        <w:rPr>
+          <w:rFonts w:ascii="Courier New" w:eastAsia="Times New Roman" w:hAnsi="Courier New" w:cs="Courier New"/>
+          <w:sz w:val="20"/>
+          <w:szCs w:val="20"/>
+          <w:lang w:eastAsia="es-419"/>
+        </w:rPr>
+        <w:t>comunidadinteligente.sql</w:t>
       </w:r>
       <w:proofErr w:type="spellEnd"/>
     </w:p>
@@ -9500,6 +9550,7 @@
           <w:szCs w:val="27"/>
           <w:lang w:val="en-US" w:eastAsia="es-419"/>
         </w:rPr>
+        <w:lastRenderedPageBreak/>
         <w:t>Procedimiento</w:t>
       </w:r>
       <w:proofErr w:type="spellEnd"/>
@@ -9550,7 +9601,6 @@
           <w:szCs w:val="20"/>
           <w:lang w:val="en-US" w:eastAsia="es-419"/>
         </w:rPr>
-        <w:lastRenderedPageBreak/>
         <w:t xml:space="preserve">git </w:t>
       </w:r>
       <w:proofErr w:type="gramStart"/>
@@ -10125,6 +10175,7 @@
           <w:szCs w:val="24"/>
           <w:lang w:eastAsia="es-419"/>
         </w:rPr>
+        <w:lastRenderedPageBreak/>
         <w:t>Detener temporalmente el sistema si está en ejecución (para evitar inconsistencias).</w:t>
       </w:r>
     </w:p>
@@ -10355,7 +10406,7 @@
           <w:szCs w:val="20"/>
           <w:lang w:eastAsia="es-419"/>
         </w:rPr>
-        <w:t>nombre_bd</w:t>
+        <w:t>comunidadinteligente</w:t>
       </w:r>
       <w:proofErr w:type="spellEnd"/>
       <w:r>
@@ -10440,7 +10491,7 @@
           <w:szCs w:val="20"/>
           <w:lang w:eastAsia="es-419"/>
         </w:rPr>
-        <w:t>nombre_bd</w:t>
+        <w:t>comunidadinteligente</w:t>
       </w:r>
       <w:proofErr w:type="spellEnd"/>
       <w:r>
@@ -10539,7 +10590,7 @@
           <w:szCs w:val="20"/>
           <w:lang w:eastAsia="es-419"/>
         </w:rPr>
-        <w:t xml:space="preserve"> -u usuario -p </w:t>
+        <w:t xml:space="preserve"> -u </w:t>
       </w:r>
       <w:proofErr w:type="spellStart"/>
       <w:r>
@@ -10549,9 +10600,8 @@
           <w:szCs w:val="20"/>
           <w:lang w:eastAsia="es-419"/>
         </w:rPr>
-        <w:t>nombre_bd</w:t>
-      </w:r>
-      <w:proofErr w:type="spellEnd"/>
+        <w:t>comunidad_</w:t>
+      </w:r>
       <w:r>
         <w:rPr>
           <w:rFonts w:ascii="Courier New" w:eastAsia="Times New Roman" w:hAnsi="Courier New" w:cs="Courier New"/>
@@ -10559,9 +10609,9 @@
           <w:szCs w:val="20"/>
           <w:lang w:eastAsia="es-419"/>
         </w:rPr>
-        <w:t xml:space="preserve"> &lt; </w:t>
-      </w:r>
-      <w:proofErr w:type="spellStart"/>
+        <w:t>usuario</w:t>
+      </w:r>
+      <w:proofErr w:type="spellEnd"/>
       <w:r>
         <w:rPr>
           <w:rFonts w:ascii="Courier New" w:eastAsia="Times New Roman" w:hAnsi="Courier New" w:cs="Courier New"/>
@@ -10569,7 +10619,55 @@
           <w:szCs w:val="20"/>
           <w:lang w:eastAsia="es-419"/>
         </w:rPr>
-        <w:t>backup.sql</w:t>
+        <w:t xml:space="preserve"> -p </w:t>
+      </w:r>
+      <w:proofErr w:type="spellStart"/>
+      <w:r>
+        <w:rPr>
+          <w:rFonts w:ascii="Courier New" w:eastAsia="Times New Roman" w:hAnsi="Courier New" w:cs="Courier New"/>
+          <w:sz w:val="20"/>
+          <w:szCs w:val="20"/>
+          <w:lang w:eastAsia="es-419"/>
+        </w:rPr>
+        <w:t>comunidadinteligente</w:t>
+      </w:r>
+      <w:proofErr w:type="spellEnd"/>
+      <w:r>
+        <w:rPr>
+          <w:rFonts w:ascii="Courier New" w:eastAsia="Times New Roman" w:hAnsi="Courier New" w:cs="Courier New"/>
+          <w:sz w:val="20"/>
+          <w:szCs w:val="20"/>
+          <w:lang w:eastAsia="es-419"/>
+        </w:rPr>
+        <w:t xml:space="preserve"> </w:t>
+      </w:r>
+      <w:r>
+        <w:rPr>
+          <w:rFonts w:ascii="Courier New" w:eastAsia="Times New Roman" w:hAnsi="Courier New" w:cs="Courier New"/>
+          <w:sz w:val="20"/>
+          <w:szCs w:val="20"/>
+          <w:lang w:eastAsia="es-419"/>
+        </w:rPr>
+        <w:t xml:space="preserve">&lt; </w:t>
+      </w:r>
+      <w:proofErr w:type="spellStart"/>
+      <w:r>
+        <w:rPr>
+          <w:rFonts w:ascii="Courier New" w:eastAsia="Times New Roman" w:hAnsi="Courier New" w:cs="Courier New"/>
+          <w:sz w:val="20"/>
+          <w:szCs w:val="20"/>
+          <w:lang w:eastAsia="es-419"/>
+        </w:rPr>
+        <w:t>comunidadinteligente</w:t>
+      </w:r>
+      <w:r>
+        <w:rPr>
+          <w:rFonts w:ascii="Courier New" w:eastAsia="Times New Roman" w:hAnsi="Courier New" w:cs="Courier New"/>
+          <w:sz w:val="20"/>
+          <w:szCs w:val="20"/>
+          <w:lang w:eastAsia="es-419"/>
+        </w:rPr>
+        <w:t>.sql</w:t>
       </w:r>
       <w:proofErr w:type="spellEnd"/>
     </w:p>
@@ -10967,6 +11065,7 @@
           <w:szCs w:val="24"/>
           <w:lang w:eastAsia="es-419"/>
         </w:rPr>
+        <w:lastRenderedPageBreak/>
         <w:t xml:space="preserve">El </w:t>
       </w:r>
       <w:proofErr w:type="spellStart"/>
@@ -11038,7 +11137,6 @@
           <w:szCs w:val="24"/>
           <w:lang w:eastAsia="es-419"/>
         </w:rPr>
-        <w:lastRenderedPageBreak/>
         <w:t>Clonar el repositorio del proyecto</w:t>
       </w:r>
     </w:p>
@@ -11409,7 +11507,7 @@
           <w:szCs w:val="20"/>
           <w:lang w:val="en-US" w:eastAsia="es-419"/>
         </w:rPr>
-        <w:t>usuario</w:t>
+        <w:t>comunidad_usuario</w:t>
       </w:r>
       <w:proofErr w:type="spellEnd"/>
       <w:r>
@@ -11443,15 +11541,24 @@
         <w:br/>
         <w:t>DB_NAME=</w:t>
       </w:r>
-      <w:proofErr w:type="spellStart"/>
       <w:r>
         <w:rPr>
           <w:rFonts w:ascii="Courier New" w:eastAsia="Times New Roman" w:hAnsi="Courier New" w:cs="Courier New"/>
           <w:sz w:val="20"/>
           <w:szCs w:val="20"/>
-          <w:lang w:val="en-US" w:eastAsia="es-419"/>
-        </w:rPr>
-        <w:t>nombre_bd</w:t>
+          <w:lang w:eastAsia="es-419"/>
+        </w:rPr>
+        <w:t xml:space="preserve"> </w:t>
+      </w:r>
+      <w:proofErr w:type="spellStart"/>
+      <w:r>
+        <w:rPr>
+          <w:rFonts w:ascii="Courier New" w:eastAsia="Times New Roman" w:hAnsi="Courier New" w:cs="Courier New"/>
+          <w:sz w:val="20"/>
+          <w:szCs w:val="20"/>
+          <w:lang w:eastAsia="es-419"/>
+        </w:rPr>
+        <w:t>comunidadinteligente</w:t>
       </w:r>
       <w:proofErr w:type="spellEnd"/>
       <w:r>
@@ -12017,6 +12124,7 @@
           <w:szCs w:val="27"/>
           <w:lang w:eastAsia="es-419"/>
         </w:rPr>
+        <w:lastRenderedPageBreak/>
         <w:t>Procedimiento paso a paso:</w:t>
       </w:r>
     </w:p>
@@ -12094,7 +12202,6 @@
           <w:szCs w:val="20"/>
           <w:lang w:eastAsia="es-419"/>
         </w:rPr>
-        <w:lastRenderedPageBreak/>
         <w:t xml:space="preserve">cd </w:t>
       </w:r>
       <w:proofErr w:type="spellStart"/>
@@ -12280,7 +12387,25 @@
           <w:szCs w:val="20"/>
           <w:lang w:eastAsia="es-419"/>
         </w:rPr>
-        <w:t>VITE_API_URL=https://tudominio.com/api</w:t>
+        <w:t>VITE_API_URL=https://</w:t>
+      </w:r>
+      <w:r>
+        <w:rPr>
+          <w:rFonts w:ascii="Courier New" w:eastAsia="Times New Roman" w:hAnsi="Courier New" w:cs="Courier New"/>
+          <w:sz w:val="20"/>
+          <w:szCs w:val="20"/>
+          <w:lang w:eastAsia="es-419"/>
+        </w:rPr>
+        <w:t>micomunidadinteligente</w:t>
+      </w:r>
+      <w:r>
+        <w:rPr>
+          <w:rFonts w:ascii="Courier New" w:eastAsia="Times New Roman" w:hAnsi="Courier New" w:cs="Courier New"/>
+          <w:sz w:val="20"/>
+          <w:szCs w:val="20"/>
+          <w:lang w:eastAsia="es-419"/>
+        </w:rPr>
+        <w:t>.com/api</w:t>
       </w:r>
     </w:p>
     <w:p>
@@ -13082,6 +13207,7 @@
           <w:szCs w:val="24"/>
           <w:lang w:eastAsia="es-419"/>
         </w:rPr>
+        <w:lastRenderedPageBreak/>
         <w:t xml:space="preserve">Validar </w:t>
       </w:r>
       <w:proofErr w:type="spellStart"/>
@@ -13871,7 +13997,6 @@
           <w:szCs w:val="24"/>
           <w:lang w:eastAsia="es-419"/>
         </w:rPr>
-        <w:lastRenderedPageBreak/>
         <w:t>Causa:</w:t>
       </w:r>
       <w:r>
@@ -14591,6 +14716,7 @@
           <w:szCs w:val="48"/>
           <w:lang w:eastAsia="es-419"/>
         </w:rPr>
+        <w:lastRenderedPageBreak/>
         <w:t>13. SEGURIDAD DEL RESPALDO</w:t>
       </w:r>
     </w:p>
@@ -15152,7 +15278,7 @@
 </file>
 
 <file path=word/numbering.xml><?xml version="1.0" encoding="utf-8"?>
-<w:numbering xmlns:wpc="http://schemas.microsoft.com/office/word/2010/wordprocessingCanvas" xmlns:cx="http://schemas.microsoft.com/office/drawing/2014/chartex" xmlns:cx1="http://schemas.microsoft.com/office/drawing/2015/9/8/chartex" xmlns:cx2="http://schemas.microsoft.com/office/drawing/2015/10/21/chartex" xmlns:cx3="http://schemas.microsoft.com/office/drawing/2016/5/9/chartex" xmlns:cx4="http://schemas.microsoft.com/office/drawing/2016/5/10/chartex" xmlns:cx5="http://schemas.microsoft.com/office/drawing/2016/5/11/chartex" xmlns:cx6="http://schemas.microsoft.com/office/drawing/2016/5/12/chartex" xmlns:cx7="http://schemas.microsoft.com/office/drawing/2016/5/13/chartex" xmlns:cx8="http://schemas.microsoft.com/office/drawing/2016/5/14/chartex" xmlns:mc="http://schemas.openxmlformats.org/markup-compatibility/2006" xmlns:aink="http://schemas.microsoft.com/office/drawing/2016/ink" xmlns:am3d="http://schemas.microsoft.com/office/drawing/2017/model3d" xmlns:o="urn:schemas-microsoft-com:office:office" xmlns:oel="http://schemas.microsoft.com/office/2019/extlst" xmlns:r="http://schemas.openxmlformats.org/officeDocument/2006/relationships" xmlns:m="http://schemas.openxmlformats.org/officeDocument/2006/math" xmlns:v="urn:schemas-microsoft-com:vml" xmlns:wp14="http://schemas.microsoft.com/office/word/2010/wordprocessingDrawing" xmlns:wp="http://schemas.openxmlformats.org/drawingml/2006/wordprocessingDrawing" xmlns:w10="urn:schemas-microsoft-com:office:word" xmlns:w="http://schemas.openxmlformats.org/wordprocessingml/2006/main" xmlns:w14="http://schemas.microsoft.com/office/word/2010/wordml" xmlns:w15="http://schemas.microsoft.com/office/word/2012/wordml" xmlns:w16cex="http://schemas.microsoft.com/office/word/2018/wordml/cex" xmlns:w16cid="http://schemas.microsoft.com/office/word/2016/wordml/cid" xmlns:w16="http://schemas.microsoft.com/office/word/2018/wordml" xmlns:w16du="http://schemas.microsoft.com/office/word/2023/wordml/word16du" xmlns:w16sdtdh="http://schemas.microsoft.com/office/word/2020/wordml/sdtdatahash" xmlns:w16se="http://schemas.microsoft.com/office/word/2015/wordml/symex" xmlns:wpg="http://schemas.microsoft.com/office/word/2010/wordprocessingGroup" xmlns:wpi="http://schemas.microsoft.com/office/word/2010/wordprocessingInk" xmlns:wne="http://schemas.microsoft.com/office/word/2006/wordml" xmlns:wps="http://schemas.microsoft.com/office/word/2010/wordprocessingShape" mc:Ignorable="w14 w15 w16se w16cid w16 w16cex w16sdtdh wp14">
+<w:numbering xmlns:wpc="http://schemas.microsoft.com/office/word/2010/wordprocessingCanvas" xmlns:cx="http://schemas.microsoft.com/office/drawing/2014/chartex" xmlns:cx1="http://schemas.microsoft.com/office/drawing/2015/9/8/chartex" xmlns:cx2="http://schemas.microsoft.com/office/drawing/2015/10/21/chartex" xmlns:cx3="http://schemas.microsoft.com/office/drawing/2016/5/9/chartex" xmlns:cx4="http://schemas.microsoft.com/office/drawing/2016/5/10/chartex" xmlns:cx5="http://schemas.microsoft.com/office/drawing/2016/5/11/chartex" xmlns:cx6="http://schemas.microsoft.com/office/drawing/2016/5/12/chartex" xmlns:cx7="http://schemas.microsoft.com/office/drawing/2016/5/13/chartex" xmlns:cx8="http://schemas.microsoft.com/office/drawing/2016/5/14/chartex" xmlns:mc="http://schemas.openxmlformats.org/markup-compatibility/2006" xmlns:aink="http://schemas.microsoft.com/office/drawing/2016/ink" xmlns:am3d="http://schemas.microsoft.com/office/drawing/2017/model3d" xmlns:o="urn:schemas-microsoft-com:office:office" xmlns:r="http://schemas.openxmlformats.org/officeDocument/2006/relationships" xmlns:m="http://schemas.openxmlformats.org/officeDocument/2006/math" xmlns:v="urn:schemas-microsoft-com:vml" xmlns:wp14="http://schemas.microsoft.com/office/word/2010/wordprocessingDrawing" xmlns:wp="http://schemas.openxmlformats.org/drawingml/2006/wordprocessingDrawing" xmlns:w10="urn:schemas-microsoft-com:office:word" xmlns:w="http://schemas.openxmlformats.org/wordprocessingml/2006/main" xmlns:w14="http://schemas.microsoft.com/office/word/2010/wordml" xmlns:w15="http://schemas.microsoft.com/office/word/2012/wordml" xmlns:w16cex="http://schemas.microsoft.com/office/word/2018/wordml/cex" xmlns:w16cid="http://schemas.microsoft.com/office/word/2016/wordml/cid" xmlns:w16="http://schemas.microsoft.com/office/word/2018/wordml" xmlns:w16sdtdh="http://schemas.microsoft.com/office/word/2020/wordml/sdtdatahash" xmlns:w16se="http://schemas.microsoft.com/office/word/2015/wordml/symex" xmlns:wpg="http://schemas.microsoft.com/office/word/2010/wordprocessingGroup" xmlns:wpi="http://schemas.microsoft.com/office/word/2010/wordprocessingInk" xmlns:wne="http://schemas.microsoft.com/office/word/2006/wordml" xmlns:wps="http://schemas.microsoft.com/office/word/2010/wordprocessingShape" mc:Ignorable="w14 w15 w16se w16cid w16 w16cex w16sdtdh wp14">
   <w:abstractNum w:abstractNumId="0" w15:restartNumberingAfterBreak="0">
     <w:nsid w:val="00C36FAD"/>
     <w:multiLevelType w:val="multilevel"/>
@@ -24352,205 +24478,205 @@
       </w:rPr>
     </w:lvl>
   </w:abstractNum>
-  <w:num w:numId="1" w16cid:durableId="1163551435">
+  <w:num w:numId="1">
     <w:abstractNumId w:val="47"/>
   </w:num>
-  <w:num w:numId="2" w16cid:durableId="1116489065">
+  <w:num w:numId="2">
     <w:abstractNumId w:val="42"/>
   </w:num>
-  <w:num w:numId="3" w16cid:durableId="1805543924">
+  <w:num w:numId="3">
     <w:abstractNumId w:val="19"/>
   </w:num>
-  <w:num w:numId="4" w16cid:durableId="192812419">
+  <w:num w:numId="4">
     <w:abstractNumId w:val="26"/>
   </w:num>
-  <w:num w:numId="5" w16cid:durableId="1823737585">
+  <w:num w:numId="5">
     <w:abstractNumId w:val="54"/>
   </w:num>
-  <w:num w:numId="6" w16cid:durableId="402680957">
+  <w:num w:numId="6">
     <w:abstractNumId w:val="66"/>
   </w:num>
-  <w:num w:numId="7" w16cid:durableId="1471096026">
+  <w:num w:numId="7">
     <w:abstractNumId w:val="37"/>
   </w:num>
-  <w:num w:numId="8" w16cid:durableId="1595283280">
+  <w:num w:numId="8">
     <w:abstractNumId w:val="49"/>
   </w:num>
-  <w:num w:numId="9" w16cid:durableId="1529611145">
+  <w:num w:numId="9">
     <w:abstractNumId w:val="29"/>
   </w:num>
-  <w:num w:numId="10" w16cid:durableId="128910078">
+  <w:num w:numId="10">
     <w:abstractNumId w:val="2"/>
   </w:num>
-  <w:num w:numId="11" w16cid:durableId="1533573100">
+  <w:num w:numId="11">
     <w:abstractNumId w:val="38"/>
   </w:num>
-  <w:num w:numId="12" w16cid:durableId="1344088686">
+  <w:num w:numId="12">
     <w:abstractNumId w:val="25"/>
   </w:num>
-  <w:num w:numId="13" w16cid:durableId="168984566">
+  <w:num w:numId="13">
     <w:abstractNumId w:val="48"/>
   </w:num>
-  <w:num w:numId="14" w16cid:durableId="1819689108">
+  <w:num w:numId="14">
     <w:abstractNumId w:val="5"/>
   </w:num>
-  <w:num w:numId="15" w16cid:durableId="1317034581">
+  <w:num w:numId="15">
     <w:abstractNumId w:val="46"/>
   </w:num>
-  <w:num w:numId="16" w16cid:durableId="1514688760">
+  <w:num w:numId="16">
     <w:abstractNumId w:val="34"/>
   </w:num>
-  <w:num w:numId="17" w16cid:durableId="1914196707">
+  <w:num w:numId="17">
     <w:abstractNumId w:val="11"/>
   </w:num>
-  <w:num w:numId="18" w16cid:durableId="1349722622">
+  <w:num w:numId="18">
     <w:abstractNumId w:val="3"/>
   </w:num>
-  <w:num w:numId="19" w16cid:durableId="1674994437">
+  <w:num w:numId="19">
     <w:abstractNumId w:val="7"/>
   </w:num>
-  <w:num w:numId="20" w16cid:durableId="630329812">
+  <w:num w:numId="20">
     <w:abstractNumId w:val="52"/>
   </w:num>
-  <w:num w:numId="21" w16cid:durableId="1435398650">
+  <w:num w:numId="21">
     <w:abstractNumId w:val="53"/>
   </w:num>
-  <w:num w:numId="22" w16cid:durableId="171535195">
+  <w:num w:numId="22">
     <w:abstractNumId w:val="16"/>
   </w:num>
-  <w:num w:numId="23" w16cid:durableId="2136831691">
+  <w:num w:numId="23">
     <w:abstractNumId w:val="45"/>
   </w:num>
-  <w:num w:numId="24" w16cid:durableId="1176724188">
+  <w:num w:numId="24">
     <w:abstractNumId w:val="8"/>
   </w:num>
-  <w:num w:numId="25" w16cid:durableId="1574854707">
+  <w:num w:numId="25">
     <w:abstractNumId w:val="39"/>
   </w:num>
-  <w:num w:numId="26" w16cid:durableId="1019084875">
+  <w:num w:numId="26">
     <w:abstractNumId w:val="22"/>
   </w:num>
-  <w:num w:numId="27" w16cid:durableId="703943898">
+  <w:num w:numId="27">
     <w:abstractNumId w:val="1"/>
   </w:num>
-  <w:num w:numId="28" w16cid:durableId="1615944039">
+  <w:num w:numId="28">
     <w:abstractNumId w:val="50"/>
   </w:num>
-  <w:num w:numId="29" w16cid:durableId="706875377">
+  <w:num w:numId="29">
     <w:abstractNumId w:val="57"/>
   </w:num>
-  <w:num w:numId="30" w16cid:durableId="1119372817">
+  <w:num w:numId="30">
     <w:abstractNumId w:val="6"/>
   </w:num>
-  <w:num w:numId="31" w16cid:durableId="995458706">
+  <w:num w:numId="31">
     <w:abstractNumId w:val="32"/>
   </w:num>
-  <w:num w:numId="32" w16cid:durableId="1354186300">
+  <w:num w:numId="32">
     <w:abstractNumId w:val="20"/>
   </w:num>
-  <w:num w:numId="33" w16cid:durableId="240220619">
+  <w:num w:numId="33">
     <w:abstractNumId w:val="9"/>
   </w:num>
-  <w:num w:numId="34" w16cid:durableId="1589145786">
+  <w:num w:numId="34">
     <w:abstractNumId w:val="4"/>
   </w:num>
-  <w:num w:numId="35" w16cid:durableId="835614395">
+  <w:num w:numId="35">
     <w:abstractNumId w:val="21"/>
   </w:num>
-  <w:num w:numId="36" w16cid:durableId="2821387">
+  <w:num w:numId="36">
     <w:abstractNumId w:val="33"/>
   </w:num>
-  <w:num w:numId="37" w16cid:durableId="595288287">
+  <w:num w:numId="37">
     <w:abstractNumId w:val="43"/>
   </w:num>
-  <w:num w:numId="38" w16cid:durableId="1712873963">
+  <w:num w:numId="38">
     <w:abstractNumId w:val="30"/>
   </w:num>
-  <w:num w:numId="39" w16cid:durableId="1143153463">
+  <w:num w:numId="39">
     <w:abstractNumId w:val="60"/>
   </w:num>
-  <w:num w:numId="40" w16cid:durableId="1047754694">
+  <w:num w:numId="40">
     <w:abstractNumId w:val="55"/>
   </w:num>
-  <w:num w:numId="41" w16cid:durableId="1224221477">
+  <w:num w:numId="41">
     <w:abstractNumId w:val="15"/>
   </w:num>
-  <w:num w:numId="42" w16cid:durableId="434593416">
+  <w:num w:numId="42">
     <w:abstractNumId w:val="31"/>
   </w:num>
-  <w:num w:numId="43" w16cid:durableId="2125075574">
+  <w:num w:numId="43">
     <w:abstractNumId w:val="28"/>
   </w:num>
-  <w:num w:numId="44" w16cid:durableId="7951118">
+  <w:num w:numId="44">
     <w:abstractNumId w:val="17"/>
   </w:num>
-  <w:num w:numId="45" w16cid:durableId="1968388717">
+  <w:num w:numId="45">
     <w:abstractNumId w:val="27"/>
   </w:num>
-  <w:num w:numId="46" w16cid:durableId="1828666872">
+  <w:num w:numId="46">
     <w:abstractNumId w:val="13"/>
   </w:num>
-  <w:num w:numId="47" w16cid:durableId="301664744">
+  <w:num w:numId="47">
     <w:abstractNumId w:val="51"/>
   </w:num>
-  <w:num w:numId="48" w16cid:durableId="923413744">
+  <w:num w:numId="48">
     <w:abstractNumId w:val="35"/>
   </w:num>
-  <w:num w:numId="49" w16cid:durableId="724061639">
+  <w:num w:numId="49">
     <w:abstractNumId w:val="65"/>
   </w:num>
-  <w:num w:numId="50" w16cid:durableId="1939099889">
+  <w:num w:numId="50">
     <w:abstractNumId w:val="18"/>
   </w:num>
-  <w:num w:numId="51" w16cid:durableId="1384326185">
+  <w:num w:numId="51">
     <w:abstractNumId w:val="40"/>
   </w:num>
-  <w:num w:numId="52" w16cid:durableId="1420522601">
+  <w:num w:numId="52">
     <w:abstractNumId w:val="12"/>
   </w:num>
-  <w:num w:numId="53" w16cid:durableId="741294156">
+  <w:num w:numId="53">
     <w:abstractNumId w:val="44"/>
   </w:num>
-  <w:num w:numId="54" w16cid:durableId="1832600370">
+  <w:num w:numId="54">
     <w:abstractNumId w:val="61"/>
   </w:num>
-  <w:num w:numId="55" w16cid:durableId="203948834">
+  <w:num w:numId="55">
     <w:abstractNumId w:val="41"/>
   </w:num>
-  <w:num w:numId="56" w16cid:durableId="283122329">
+  <w:num w:numId="56">
     <w:abstractNumId w:val="62"/>
   </w:num>
-  <w:num w:numId="57" w16cid:durableId="1817912504">
+  <w:num w:numId="57">
     <w:abstractNumId w:val="0"/>
   </w:num>
-  <w:num w:numId="58" w16cid:durableId="1538739746">
+  <w:num w:numId="58">
     <w:abstractNumId w:val="56"/>
   </w:num>
-  <w:num w:numId="59" w16cid:durableId="303774085">
+  <w:num w:numId="59">
     <w:abstractNumId w:val="58"/>
   </w:num>
-  <w:num w:numId="60" w16cid:durableId="285043">
+  <w:num w:numId="60">
     <w:abstractNumId w:val="59"/>
   </w:num>
-  <w:num w:numId="61" w16cid:durableId="1795294365">
+  <w:num w:numId="61">
     <w:abstractNumId w:val="36"/>
   </w:num>
-  <w:num w:numId="62" w16cid:durableId="1057901371">
+  <w:num w:numId="62">
     <w:abstractNumId w:val="14"/>
   </w:num>
-  <w:num w:numId="63" w16cid:durableId="1918856058">
+  <w:num w:numId="63">
     <w:abstractNumId w:val="64"/>
   </w:num>
-  <w:num w:numId="64" w16cid:durableId="686250430">
+  <w:num w:numId="64">
     <w:abstractNumId w:val="10"/>
   </w:num>
-  <w:num w:numId="65" w16cid:durableId="1707439462">
+  <w:num w:numId="65">
     <w:abstractNumId w:val="63"/>
   </w:num>
-  <w:num w:numId="66" w16cid:durableId="371853834">
+  <w:num w:numId="66">
     <w:abstractNumId w:val="24"/>
   </w:num>
-  <w:num w:numId="67" w16cid:durableId="506098427">
+  <w:num w:numId="67">
     <w:abstractNumId w:val="23"/>
   </w:num>
   <w:numIdMacAtCleanup w:val="66"/>
@@ -24955,6 +25081,7 @@
   <w:style w:type="paragraph" w:default="1" w:styleId="Normal">
     <w:name w:val="Normal"/>
     <w:qFormat/>
+    <w:rsid w:val="000B3A99"/>
   </w:style>
   <w:style w:type="paragraph" w:styleId="Ttulo1">
     <w:name w:val="heading 1"/>
@@ -25286,6 +25413,17 @@
     <w:name w:val="ͼb"/>
     <w:basedOn w:val="Fuentedeprrafopredeter"/>
     <w:rsid w:val="00BC5753"/>
+  </w:style>
+  <w:style w:type="paragraph" w:styleId="Prrafodelista">
+    <w:name w:val="List Paragraph"/>
+    <w:basedOn w:val="Normal"/>
+    <w:uiPriority w:val="34"/>
+    <w:qFormat/>
+    <w:rsid w:val="000B3A99"/>
+    <w:pPr>
+      <w:ind w:left="720"/>
+      <w:contextualSpacing/>
+    </w:pPr>
   </w:style>
 </w:styles>
 </file>

</xml_diff>

<commit_message>
docs: se elimina informacion no correspondiente
</commit_message>
<xml_diff>
--- a/7_Trimestre/Documentación/Planes/Plan de Respaldo de datos.docx
+++ b/7_Trimestre/Documentación/Planes/Plan de Respaldo de datos.docx
@@ -1,18 +1,11 @@
 
 <file path=word/document.xml><?xml version="1.0" encoding="utf-8"?>
-<w:document xmlns:wpc="http://schemas.microsoft.com/office/word/2010/wordprocessingCanvas" xmlns:cx="http://schemas.microsoft.com/office/drawing/2014/chartex" xmlns:cx1="http://schemas.microsoft.com/office/drawing/2015/9/8/chartex" xmlns:cx2="http://schemas.microsoft.com/office/drawing/2015/10/21/chartex" xmlns:cx3="http://schemas.microsoft.com/office/drawing/2016/5/9/chartex" xmlns:cx4="http://schemas.microsoft.com/office/drawing/2016/5/10/chartex" xmlns:cx5="http://schemas.microsoft.com/office/drawing/2016/5/11/chartex" xmlns:cx6="http://schemas.microsoft.com/office/drawing/2016/5/12/chartex" xmlns:cx7="http://schemas.microsoft.com/office/drawing/2016/5/13/chartex" xmlns:cx8="http://schemas.microsoft.com/office/drawing/2016/5/14/chartex" xmlns:mc="http://schemas.openxmlformats.org/markup-compatibility/2006" xmlns:aink="http://schemas.microsoft.com/office/drawing/2016/ink" xmlns:am3d="http://schemas.microsoft.com/office/drawing/2017/model3d" xmlns:o="urn:schemas-microsoft-com:office:office" xmlns:r="http://schemas.openxmlformats.org/officeDocument/2006/relationships" xmlns:m="http://schemas.openxmlformats.org/officeDocument/2006/math" xmlns:v="urn:schemas-microsoft-com:vml" xmlns:wp14="http://schemas.microsoft.com/office/word/2010/wordprocessingDrawing" xmlns:wp="http://schemas.openxmlformats.org/drawingml/2006/wordprocessingDrawing" xmlns:w10="urn:schemas-microsoft-com:office:word" xmlns:w="http://schemas.openxmlformats.org/wordprocessingml/2006/main" xmlns:w14="http://schemas.microsoft.com/office/word/2010/wordml" xmlns:w15="http://schemas.microsoft.com/office/word/2012/wordml" xmlns:w16cex="http://schemas.microsoft.com/office/word/2018/wordml/cex" xmlns:w16cid="http://schemas.microsoft.com/office/word/2016/wordml/cid" xmlns:w16="http://schemas.microsoft.com/office/word/2018/wordml" xmlns:w16sdtdh="http://schemas.microsoft.com/office/word/2020/wordml/sdtdatahash" xmlns:w16se="http://schemas.microsoft.com/office/word/2015/wordml/symex" xmlns:wpg="http://schemas.microsoft.com/office/word/2010/wordprocessingGroup" xmlns:wpi="http://schemas.microsoft.com/office/word/2010/wordprocessingInk" xmlns:wne="http://schemas.microsoft.com/office/word/2006/wordml" xmlns:wps="http://schemas.microsoft.com/office/word/2010/wordprocessingShape" mc:Ignorable="w14 w15 w16se w16cid w16 w16cex w16sdtdh wp14">
+<w:document xmlns:wpc="http://schemas.microsoft.com/office/word/2010/wordprocessingCanvas" xmlns:cx="http://schemas.microsoft.com/office/drawing/2014/chartex" xmlns:cx1="http://schemas.microsoft.com/office/drawing/2015/9/8/chartex" xmlns:cx2="http://schemas.microsoft.com/office/drawing/2015/10/21/chartex" xmlns:cx3="http://schemas.microsoft.com/office/drawing/2016/5/9/chartex" xmlns:cx4="http://schemas.microsoft.com/office/drawing/2016/5/10/chartex" xmlns:cx5="http://schemas.microsoft.com/office/drawing/2016/5/11/chartex" xmlns:cx6="http://schemas.microsoft.com/office/drawing/2016/5/12/chartex" xmlns:cx7="http://schemas.microsoft.com/office/drawing/2016/5/13/chartex" xmlns:cx8="http://schemas.microsoft.com/office/drawing/2016/5/14/chartex" xmlns:mc="http://schemas.openxmlformats.org/markup-compatibility/2006" xmlns:aink="http://schemas.microsoft.com/office/drawing/2016/ink" xmlns:am3d="http://schemas.microsoft.com/office/drawing/2017/model3d" xmlns:o="urn:schemas-microsoft-com:office:office" xmlns:oel="http://schemas.microsoft.com/office/2019/extlst" xmlns:r="http://schemas.openxmlformats.org/officeDocument/2006/relationships" xmlns:m="http://schemas.openxmlformats.org/officeDocument/2006/math" xmlns:v="urn:schemas-microsoft-com:vml" xmlns:wp14="http://schemas.microsoft.com/office/word/2010/wordprocessingDrawing" xmlns:wp="http://schemas.openxmlformats.org/drawingml/2006/wordprocessingDrawing" xmlns:w10="urn:schemas-microsoft-com:office:word" xmlns:w="http://schemas.openxmlformats.org/wordprocessingml/2006/main" xmlns:w14="http://schemas.microsoft.com/office/word/2010/wordml" xmlns:w15="http://schemas.microsoft.com/office/word/2012/wordml" xmlns:w16cex="http://schemas.microsoft.com/office/word/2018/wordml/cex" xmlns:w16cid="http://schemas.microsoft.com/office/word/2016/wordml/cid" xmlns:w16="http://schemas.microsoft.com/office/word/2018/wordml" xmlns:w16du="http://schemas.microsoft.com/office/word/2023/wordml/word16du" xmlns:w16sdtdh="http://schemas.microsoft.com/office/word/2020/wordml/sdtdatahash" xmlns:w16se="http://schemas.microsoft.com/office/word/2015/wordml/symex" xmlns:wpg="http://schemas.microsoft.com/office/word/2010/wordprocessingGroup" xmlns:wpi="http://schemas.microsoft.com/office/word/2010/wordprocessingInk" xmlns:wne="http://schemas.microsoft.com/office/word/2006/wordml" xmlns:wps="http://schemas.microsoft.com/office/word/2010/wordprocessingShape" mc:Ignorable="w14 w15 w16se w16cid w16 w16cex w16sdtdh wp14">
   <w:body>
     <w:p>
       <w:pPr>
-        <w:spacing w:before="100" w:beforeAutospacing="1" w:after="100" w:afterAutospacing="1" w:line="240" w:lineRule="auto"/>
-        <w:outlineLvl w:val="0"/>
-        <w:rPr>
-          <w:rFonts w:ascii="Times New Roman" w:eastAsia="Times New Roman" w:hAnsi="Times New Roman" w:cs="Times New Roman"/>
-          <w:b/>
-          <w:bCs/>
-          <w:kern w:val="36"/>
-          <w:sz w:val="48"/>
-          <w:szCs w:val="48"/>
+        <w:pStyle w:val="Ttulo1"/>
+        <w:rPr>
           <w:lang w:eastAsia="es-CO"/>
         </w:rPr>
       </w:pPr>
@@ -1646,9 +1639,8 @@
           <w:szCs w:val="24"/>
           <w:lang w:val="es-CO" w:eastAsia="es-CO"/>
         </w:rPr>
-        <w:t xml:space="preserve">5.1 Frecuencia de </w:t>
-      </w:r>
-      <w:proofErr w:type="spellStart"/>
+        <w:t>5.1 Frecuencia de Backups</w:t>
+      </w:r>
       <w:r>
         <w:rPr>
           <w:rFonts w:ascii="Times New Roman" w:eastAsia="Times New Roman" w:hAnsi="Times New Roman" w:cs="Times New Roman"/>
@@ -1656,9 +1648,8 @@
           <w:szCs w:val="24"/>
           <w:lang w:val="es-CO" w:eastAsia="es-CO"/>
         </w:rPr>
-        <w:t>Backups</w:t>
-      </w:r>
-      <w:proofErr w:type="spellEnd"/>
+        <w:br/>
+      </w:r>
       <w:r>
         <w:rPr>
           <w:rFonts w:ascii="Times New Roman" w:eastAsia="Times New Roman" w:hAnsi="Times New Roman" w:cs="Times New Roman"/>
@@ -1666,6 +1657,24 @@
           <w:szCs w:val="24"/>
           <w:lang w:val="es-CO" w:eastAsia="es-CO"/>
         </w:rPr>
+        <w:t> </w:t>
+      </w:r>
+      <w:r>
+        <w:rPr>
+          <w:rFonts w:ascii="Times New Roman" w:eastAsia="Times New Roman" w:hAnsi="Times New Roman" w:cs="Times New Roman"/>
+          <w:sz w:val="24"/>
+          <w:szCs w:val="24"/>
+          <w:lang w:val="es-CO" w:eastAsia="es-CO"/>
+        </w:rPr>
+        <w:t>5.2 Fecha de Implementación del Plan</w:t>
+      </w:r>
+      <w:r>
+        <w:rPr>
+          <w:rFonts w:ascii="Times New Roman" w:eastAsia="Times New Roman" w:hAnsi="Times New Roman" w:cs="Times New Roman"/>
+          <w:sz w:val="24"/>
+          <w:szCs w:val="24"/>
+          <w:lang w:val="es-CO" w:eastAsia="es-CO"/>
+        </w:rPr>
         <w:br/>
       </w:r>
       <w:r>
@@ -1684,54 +1693,7 @@
           <w:szCs w:val="24"/>
           <w:lang w:val="es-CO" w:eastAsia="es-CO"/>
         </w:rPr>
-        <w:t>5.2 Fecha de Implementación del Plan</w:t>
-      </w:r>
-      <w:r>
-        <w:rPr>
-          <w:rFonts w:ascii="Times New Roman" w:eastAsia="Times New Roman" w:hAnsi="Times New Roman" w:cs="Times New Roman"/>
-          <w:sz w:val="24"/>
-          <w:szCs w:val="24"/>
-          <w:lang w:val="es-CO" w:eastAsia="es-CO"/>
-        </w:rPr>
-        <w:br/>
-      </w:r>
-      <w:r>
-        <w:rPr>
-          <w:rFonts w:ascii="Times New Roman" w:eastAsia="Times New Roman" w:hAnsi="Times New Roman" w:cs="Times New Roman"/>
-          <w:sz w:val="24"/>
-          <w:szCs w:val="24"/>
-          <w:lang w:val="es-CO" w:eastAsia="es-CO"/>
-        </w:rPr>
-        <w:t> </w:t>
-      </w:r>
-      <w:r>
-        <w:rPr>
-          <w:rFonts w:ascii="Times New Roman" w:eastAsia="Times New Roman" w:hAnsi="Times New Roman" w:cs="Times New Roman"/>
-          <w:sz w:val="24"/>
-          <w:szCs w:val="24"/>
-          <w:lang w:val="es-CO" w:eastAsia="es-CO"/>
-        </w:rPr>
-        <w:t xml:space="preserve">5.3 </w:t>
-      </w:r>
-      <w:proofErr w:type="gramStart"/>
-      <w:r>
-        <w:rPr>
-          <w:rFonts w:ascii="Times New Roman" w:eastAsia="Times New Roman" w:hAnsi="Times New Roman" w:cs="Times New Roman"/>
-          <w:sz w:val="24"/>
-          <w:szCs w:val="24"/>
-          <w:lang w:val="es-CO" w:eastAsia="es-CO"/>
-        </w:rPr>
-        <w:t>Responsable</w:t>
-      </w:r>
-      <w:proofErr w:type="gramEnd"/>
-      <w:r>
-        <w:rPr>
-          <w:rFonts w:ascii="Times New Roman" w:eastAsia="Times New Roman" w:hAnsi="Times New Roman" w:cs="Times New Roman"/>
-          <w:sz w:val="24"/>
-          <w:szCs w:val="24"/>
-          <w:lang w:val="es-CO" w:eastAsia="es-CO"/>
-        </w:rPr>
-        <w:t xml:space="preserve"> del Proceso</w:t>
+        <w:t>5.3 Responsable del Proceso</w:t>
       </w:r>
       <w:r>
         <w:rPr>
@@ -1838,39 +1800,8 @@
           <w:szCs w:val="24"/>
           <w:lang w:val="es-CO" w:eastAsia="es-CO"/>
         </w:rPr>
-        <w:t xml:space="preserve">6.2 Respaldo del </w:t>
-      </w:r>
-      <w:proofErr w:type="spellStart"/>
-      <w:r>
-        <w:rPr>
-          <w:rFonts w:ascii="Times New Roman" w:eastAsia="Times New Roman" w:hAnsi="Times New Roman" w:cs="Times New Roman"/>
-          <w:sz w:val="24"/>
-          <w:szCs w:val="24"/>
-          <w:lang w:val="es-CO" w:eastAsia="es-CO"/>
-        </w:rPr>
-        <w:t>Backend</w:t>
-      </w:r>
-      <w:proofErr w:type="spellEnd"/>
-      <w:r>
-        <w:rPr>
-          <w:rFonts w:ascii="Times New Roman" w:eastAsia="Times New Roman" w:hAnsi="Times New Roman" w:cs="Times New Roman"/>
-          <w:sz w:val="24"/>
-          <w:szCs w:val="24"/>
-          <w:lang w:val="es-CO" w:eastAsia="es-CO"/>
-        </w:rPr>
-        <w:t xml:space="preserve"> y </w:t>
-      </w:r>
-      <w:proofErr w:type="spellStart"/>
-      <w:r>
-        <w:rPr>
-          <w:rFonts w:ascii="Times New Roman" w:eastAsia="Times New Roman" w:hAnsi="Times New Roman" w:cs="Times New Roman"/>
-          <w:sz w:val="24"/>
-          <w:szCs w:val="24"/>
-          <w:lang w:val="es-CO" w:eastAsia="es-CO"/>
-        </w:rPr>
-        <w:t>Frontend</w:t>
-      </w:r>
-      <w:proofErr w:type="spellEnd"/>
+        <w:t>6.2 Respaldo del Backend y Frontend</w:t>
+      </w:r>
       <w:r>
         <w:rPr>
           <w:rFonts w:ascii="Times New Roman" w:eastAsia="Times New Roman" w:hAnsi="Times New Roman" w:cs="Times New Roman"/>
@@ -2005,9 +1936,8 @@
           <w:szCs w:val="24"/>
           <w:lang w:val="es-CO" w:eastAsia="es-CO"/>
         </w:rPr>
-        <w:t xml:space="preserve">9.1 </w:t>
-      </w:r>
-      <w:proofErr w:type="spellStart"/>
+        <w:t>9.1 Backup Automático</w:t>
+      </w:r>
       <w:r>
         <w:rPr>
           <w:rFonts w:ascii="Times New Roman" w:eastAsia="Times New Roman" w:hAnsi="Times New Roman" w:cs="Times New Roman"/>
@@ -2015,9 +1945,8 @@
           <w:szCs w:val="24"/>
           <w:lang w:val="es-CO" w:eastAsia="es-CO"/>
         </w:rPr>
-        <w:t>Backup</w:t>
-      </w:r>
-      <w:proofErr w:type="spellEnd"/>
+        <w:br/>
+      </w:r>
       <w:r>
         <w:rPr>
           <w:rFonts w:ascii="Times New Roman" w:eastAsia="Times New Roman" w:hAnsi="Times New Roman" w:cs="Times New Roman"/>
@@ -2025,7 +1954,7 @@
           <w:szCs w:val="24"/>
           <w:lang w:val="es-CO" w:eastAsia="es-CO"/>
         </w:rPr>
-        <w:t xml:space="preserve"> Automático</w:t>
+        <w:t> </w:t>
       </w:r>
       <w:r>
         <w:rPr>
@@ -2034,6 +1963,15 @@
           <w:szCs w:val="24"/>
           <w:lang w:val="es-CO" w:eastAsia="es-CO"/>
         </w:rPr>
+        <w:t>9.2 Backup Manual</w:t>
+      </w:r>
+      <w:r>
+        <w:rPr>
+          <w:rFonts w:ascii="Times New Roman" w:eastAsia="Times New Roman" w:hAnsi="Times New Roman" w:cs="Times New Roman"/>
+          <w:sz w:val="24"/>
+          <w:szCs w:val="24"/>
+          <w:lang w:val="es-CO" w:eastAsia="es-CO"/>
+        </w:rPr>
         <w:br/>
       </w:r>
       <w:r>
@@ -2052,74 +1990,7 @@
           <w:szCs w:val="24"/>
           <w:lang w:val="es-CO" w:eastAsia="es-CO"/>
         </w:rPr>
-        <w:t xml:space="preserve">9.2 </w:t>
-      </w:r>
-      <w:proofErr w:type="spellStart"/>
-      <w:r>
-        <w:rPr>
-          <w:rFonts w:ascii="Times New Roman" w:eastAsia="Times New Roman" w:hAnsi="Times New Roman" w:cs="Times New Roman"/>
-          <w:sz w:val="24"/>
-          <w:szCs w:val="24"/>
-          <w:lang w:val="es-CO" w:eastAsia="es-CO"/>
-        </w:rPr>
-        <w:t>Backup</w:t>
-      </w:r>
-      <w:proofErr w:type="spellEnd"/>
-      <w:r>
-        <w:rPr>
-          <w:rFonts w:ascii="Times New Roman" w:eastAsia="Times New Roman" w:hAnsi="Times New Roman" w:cs="Times New Roman"/>
-          <w:sz w:val="24"/>
-          <w:szCs w:val="24"/>
-          <w:lang w:val="es-CO" w:eastAsia="es-CO"/>
-        </w:rPr>
-        <w:t xml:space="preserve"> Manual</w:t>
-      </w:r>
-      <w:r>
-        <w:rPr>
-          <w:rFonts w:ascii="Times New Roman" w:eastAsia="Times New Roman" w:hAnsi="Times New Roman" w:cs="Times New Roman"/>
-          <w:sz w:val="24"/>
-          <w:szCs w:val="24"/>
-          <w:lang w:val="es-CO" w:eastAsia="es-CO"/>
-        </w:rPr>
-        <w:br/>
-      </w:r>
-      <w:r>
-        <w:rPr>
-          <w:rFonts w:ascii="Times New Roman" w:eastAsia="Times New Roman" w:hAnsi="Times New Roman" w:cs="Times New Roman"/>
-          <w:sz w:val="24"/>
-          <w:szCs w:val="24"/>
-          <w:lang w:val="es-CO" w:eastAsia="es-CO"/>
-        </w:rPr>
-        <w:t> </w:t>
-      </w:r>
-      <w:r>
-        <w:rPr>
-          <w:rFonts w:ascii="Times New Roman" w:eastAsia="Times New Roman" w:hAnsi="Times New Roman" w:cs="Times New Roman"/>
-          <w:sz w:val="24"/>
-          <w:szCs w:val="24"/>
-          <w:lang w:val="es-CO" w:eastAsia="es-CO"/>
-        </w:rPr>
-        <w:t xml:space="preserve">9.3 </w:t>
-      </w:r>
-      <w:proofErr w:type="spellStart"/>
-      <w:r>
-        <w:rPr>
-          <w:rFonts w:ascii="Times New Roman" w:eastAsia="Times New Roman" w:hAnsi="Times New Roman" w:cs="Times New Roman"/>
-          <w:sz w:val="24"/>
-          <w:szCs w:val="24"/>
-          <w:lang w:val="es-CO" w:eastAsia="es-CO"/>
-        </w:rPr>
-        <w:t>Backup</w:t>
-      </w:r>
-      <w:proofErr w:type="spellEnd"/>
-      <w:r>
-        <w:rPr>
-          <w:rFonts w:ascii="Times New Roman" w:eastAsia="Times New Roman" w:hAnsi="Times New Roman" w:cs="Times New Roman"/>
-          <w:sz w:val="24"/>
-          <w:szCs w:val="24"/>
-          <w:lang w:val="es-CO" w:eastAsia="es-CO"/>
-        </w:rPr>
-        <w:t xml:space="preserve"> del Sistema (Código Fuente) </w:t>
+        <w:t xml:space="preserve">9.3 Backup del Sistema (Código Fuente) </w:t>
       </w:r>
     </w:p>
     <w:p>
@@ -2199,9 +2070,8 @@
           <w:szCs w:val="24"/>
           <w:lang w:val="es-CO" w:eastAsia="es-CO"/>
         </w:rPr>
-        <w:t xml:space="preserve">10.2 Restauración del </w:t>
-      </w:r>
-      <w:proofErr w:type="spellStart"/>
+        <w:t>10.2 Restauración del Backend (Node.js)</w:t>
+      </w:r>
       <w:r>
         <w:rPr>
           <w:rFonts w:ascii="Times New Roman" w:eastAsia="Times New Roman" w:hAnsi="Times New Roman" w:cs="Times New Roman"/>
@@ -2209,9 +2079,8 @@
           <w:szCs w:val="24"/>
           <w:lang w:val="es-CO" w:eastAsia="es-CO"/>
         </w:rPr>
-        <w:t>Backend</w:t>
-      </w:r>
-      <w:proofErr w:type="spellEnd"/>
+        <w:br/>
+      </w:r>
       <w:r>
         <w:rPr>
           <w:rFonts w:ascii="Times New Roman" w:eastAsia="Times New Roman" w:hAnsi="Times New Roman" w:cs="Times New Roman"/>
@@ -2219,7 +2088,7 @@
           <w:szCs w:val="24"/>
           <w:lang w:val="es-CO" w:eastAsia="es-CO"/>
         </w:rPr>
-        <w:t xml:space="preserve"> (Node.js)</w:t>
+        <w:t> </w:t>
       </w:r>
       <w:r>
         <w:rPr>
@@ -2228,65 +2097,7 @@
           <w:szCs w:val="24"/>
           <w:lang w:val="es-CO" w:eastAsia="es-CO"/>
         </w:rPr>
-        <w:br/>
-      </w:r>
-      <w:r>
-        <w:rPr>
-          <w:rFonts w:ascii="Times New Roman" w:eastAsia="Times New Roman" w:hAnsi="Times New Roman" w:cs="Times New Roman"/>
-          <w:sz w:val="24"/>
-          <w:szCs w:val="24"/>
-          <w:lang w:val="es-CO" w:eastAsia="es-CO"/>
-        </w:rPr>
-        <w:t> </w:t>
-      </w:r>
-      <w:r>
-        <w:rPr>
-          <w:rFonts w:ascii="Times New Roman" w:eastAsia="Times New Roman" w:hAnsi="Times New Roman" w:cs="Times New Roman"/>
-          <w:sz w:val="24"/>
-          <w:szCs w:val="24"/>
-          <w:lang w:val="es-CO" w:eastAsia="es-CO"/>
-        </w:rPr>
-        <w:t xml:space="preserve">10.3 Restauración del </w:t>
-      </w:r>
-      <w:proofErr w:type="spellStart"/>
-      <w:r>
-        <w:rPr>
-          <w:rFonts w:ascii="Times New Roman" w:eastAsia="Times New Roman" w:hAnsi="Times New Roman" w:cs="Times New Roman"/>
-          <w:sz w:val="24"/>
-          <w:szCs w:val="24"/>
-          <w:lang w:val="es-CO" w:eastAsia="es-CO"/>
-        </w:rPr>
-        <w:t>Frontend</w:t>
-      </w:r>
-      <w:proofErr w:type="spellEnd"/>
-      <w:r>
-        <w:rPr>
-          <w:rFonts w:ascii="Times New Roman" w:eastAsia="Times New Roman" w:hAnsi="Times New Roman" w:cs="Times New Roman"/>
-          <w:sz w:val="24"/>
-          <w:szCs w:val="24"/>
-          <w:lang w:val="es-CO" w:eastAsia="es-CO"/>
-        </w:rPr>
-        <w:t xml:space="preserve"> (</w:t>
-      </w:r>
-      <w:proofErr w:type="spellStart"/>
-      <w:r>
-        <w:rPr>
-          <w:rFonts w:ascii="Times New Roman" w:eastAsia="Times New Roman" w:hAnsi="Times New Roman" w:cs="Times New Roman"/>
-          <w:sz w:val="24"/>
-          <w:szCs w:val="24"/>
-          <w:lang w:val="es-CO" w:eastAsia="es-CO"/>
-        </w:rPr>
-        <w:t>React</w:t>
-      </w:r>
-      <w:proofErr w:type="spellEnd"/>
-      <w:r>
-        <w:rPr>
-          <w:rFonts w:ascii="Times New Roman" w:eastAsia="Times New Roman" w:hAnsi="Times New Roman" w:cs="Times New Roman"/>
-          <w:sz w:val="24"/>
-          <w:szCs w:val="24"/>
-          <w:lang w:val="es-CO" w:eastAsia="es-CO"/>
-        </w:rPr>
-        <w:t>)</w:t>
+        <w:t>10.3 Restauración del Frontend (React)</w:t>
       </w:r>
       <w:r>
         <w:rPr>
@@ -2424,33 +2235,6 @@
         </w:rPr>
         <w:t>11.3 Errores humanos</w:t>
       </w:r>
-      <w:r>
-        <w:rPr>
-          <w:rFonts w:ascii="Times New Roman" w:eastAsia="Times New Roman" w:hAnsi="Times New Roman" w:cs="Times New Roman"/>
-          <w:sz w:val="24"/>
-          <w:szCs w:val="24"/>
-          <w:lang w:val="es-CO" w:eastAsia="es-CO"/>
-        </w:rPr>
-        <w:br/>
-      </w:r>
-      <w:r>
-        <w:rPr>
-          <w:rFonts w:ascii="Times New Roman" w:eastAsia="Times New Roman" w:hAnsi="Times New Roman" w:cs="Times New Roman"/>
-          <w:sz w:val="24"/>
-          <w:szCs w:val="24"/>
-          <w:lang w:val="es-CO" w:eastAsia="es-CO"/>
-        </w:rPr>
-        <w:t> </w:t>
-      </w:r>
-      <w:r>
-        <w:rPr>
-          <w:rFonts w:ascii="Times New Roman" w:eastAsia="Times New Roman" w:hAnsi="Times New Roman" w:cs="Times New Roman"/>
-          <w:sz w:val="24"/>
-          <w:szCs w:val="24"/>
-          <w:lang w:val="es-CO" w:eastAsia="es-CO"/>
-        </w:rPr>
-        <w:t xml:space="preserve">11.4 Problemas de despliegue </w:t>
-      </w:r>
     </w:p>
     <w:p>
       <w:pPr>
@@ -2740,31 +2524,7 @@
           <w:szCs w:val="24"/>
           <w:lang w:eastAsia="es-419"/>
         </w:rPr>
-        <w:t xml:space="preserve">SaaS (Software as a </w:t>
-      </w:r>
-      <w:proofErr w:type="spellStart"/>
-      <w:r>
-        <w:rPr>
-          <w:rFonts w:ascii="Times New Roman" w:eastAsia="Times New Roman" w:hAnsi="Times New Roman" w:cs="Times New Roman"/>
-          <w:b/>
-          <w:bCs/>
-          <w:sz w:val="24"/>
-          <w:szCs w:val="24"/>
-          <w:lang w:eastAsia="es-419"/>
-        </w:rPr>
-        <w:t>Service</w:t>
-      </w:r>
-      <w:proofErr w:type="spellEnd"/>
-      <w:r>
-        <w:rPr>
-          <w:rFonts w:ascii="Times New Roman" w:eastAsia="Times New Roman" w:hAnsi="Times New Roman" w:cs="Times New Roman"/>
-          <w:b/>
-          <w:bCs/>
-          <w:sz w:val="24"/>
-          <w:szCs w:val="24"/>
-          <w:lang w:eastAsia="es-419"/>
-        </w:rPr>
-        <w:t>)</w:t>
+        <w:t>SaaS (Software as a Service)</w:t>
       </w:r>
       <w:r>
         <w:rPr>
@@ -2943,7 +2703,6 @@
         </w:rPr>
         <w:t xml:space="preserve">Proteger la base de datos </w:t>
       </w:r>
-      <w:proofErr w:type="spellStart"/>
       <w:r>
         <w:rPr>
           <w:rFonts w:ascii="Times New Roman" w:eastAsia="Times New Roman" w:hAnsi="Times New Roman" w:cs="Times New Roman"/>
@@ -2953,7 +2712,6 @@
         </w:rPr>
         <w:t>MariaDB</w:t>
       </w:r>
-      <w:proofErr w:type="spellEnd"/>
       <w:r>
         <w:rPr>
           <w:rFonts w:ascii="Times New Roman" w:eastAsia="Times New Roman" w:hAnsi="Times New Roman" w:cs="Times New Roman"/>
@@ -3210,7 +2968,6 @@
         <w:lastRenderedPageBreak/>
         <w:t xml:space="preserve">Base de datos </w:t>
       </w:r>
-      <w:proofErr w:type="spellStart"/>
       <w:r>
         <w:rPr>
           <w:rFonts w:ascii="Times New Roman" w:eastAsia="Times New Roman" w:hAnsi="Times New Roman" w:cs="Times New Roman"/>
@@ -3222,7 +2979,6 @@
         </w:rPr>
         <w:t>MariaDB</w:t>
       </w:r>
-      <w:proofErr w:type="spellEnd"/>
       <w:r>
         <w:rPr>
           <w:rFonts w:ascii="Times New Roman" w:eastAsia="Times New Roman" w:hAnsi="Times New Roman" w:cs="Times New Roman"/>
@@ -3258,29 +3014,16 @@
           <w:lang w:eastAsia="es-419"/>
         </w:rPr>
       </w:pPr>
-      <w:proofErr w:type="spellStart"/>
-      <w:r>
-        <w:rPr>
-          <w:rFonts w:ascii="Times New Roman" w:eastAsia="Times New Roman" w:hAnsi="Times New Roman" w:cs="Times New Roman"/>
-          <w:b/>
-          <w:bCs/>
-          <w:sz w:val="24"/>
-          <w:szCs w:val="24"/>
-          <w:lang w:eastAsia="es-419"/>
-        </w:rPr>
-        <w:t>Backend</w:t>
-      </w:r>
-      <w:proofErr w:type="spellEnd"/>
-      <w:r>
-        <w:rPr>
-          <w:rFonts w:ascii="Times New Roman" w:eastAsia="Times New Roman" w:hAnsi="Times New Roman" w:cs="Times New Roman"/>
-          <w:b/>
-          <w:bCs/>
-          <w:sz w:val="24"/>
-          <w:szCs w:val="24"/>
-          <w:lang w:eastAsia="es-419"/>
-        </w:rPr>
-        <w:t xml:space="preserve"> (Node.js):</w:t>
+      <w:r>
+        <w:rPr>
+          <w:rFonts w:ascii="Times New Roman" w:eastAsia="Times New Roman" w:hAnsi="Times New Roman" w:cs="Times New Roman"/>
+          <w:b/>
+          <w:bCs/>
+          <w:sz w:val="24"/>
+          <w:szCs w:val="24"/>
+          <w:lang w:eastAsia="es-419"/>
+        </w:rPr>
+        <w:t>Backend (Node.js):</w:t>
       </w:r>
       <w:r>
         <w:rPr>
@@ -3306,53 +3049,16 @@
           <w:lang w:eastAsia="es-419"/>
         </w:rPr>
       </w:pPr>
-      <w:proofErr w:type="spellStart"/>
-      <w:r>
-        <w:rPr>
-          <w:rFonts w:ascii="Times New Roman" w:eastAsia="Times New Roman" w:hAnsi="Times New Roman" w:cs="Times New Roman"/>
-          <w:b/>
-          <w:bCs/>
-          <w:sz w:val="24"/>
-          <w:szCs w:val="24"/>
-          <w:lang w:eastAsia="es-419"/>
-        </w:rPr>
-        <w:t>Frontend</w:t>
-      </w:r>
-      <w:proofErr w:type="spellEnd"/>
-      <w:r>
-        <w:rPr>
-          <w:rFonts w:ascii="Times New Roman" w:eastAsia="Times New Roman" w:hAnsi="Times New Roman" w:cs="Times New Roman"/>
-          <w:b/>
-          <w:bCs/>
-          <w:sz w:val="24"/>
-          <w:szCs w:val="24"/>
-          <w:lang w:eastAsia="es-419"/>
-        </w:rPr>
-        <w:t xml:space="preserve"> (</w:t>
-      </w:r>
-      <w:proofErr w:type="spellStart"/>
-      <w:r>
-        <w:rPr>
-          <w:rFonts w:ascii="Times New Roman" w:eastAsia="Times New Roman" w:hAnsi="Times New Roman" w:cs="Times New Roman"/>
-          <w:b/>
-          <w:bCs/>
-          <w:sz w:val="24"/>
-          <w:szCs w:val="24"/>
-          <w:lang w:eastAsia="es-419"/>
-        </w:rPr>
-        <w:t>React</w:t>
-      </w:r>
-      <w:proofErr w:type="spellEnd"/>
-      <w:r>
-        <w:rPr>
-          <w:rFonts w:ascii="Times New Roman" w:eastAsia="Times New Roman" w:hAnsi="Times New Roman" w:cs="Times New Roman"/>
-          <w:b/>
-          <w:bCs/>
-          <w:sz w:val="24"/>
-          <w:szCs w:val="24"/>
-          <w:lang w:eastAsia="es-419"/>
-        </w:rPr>
-        <w:t>):</w:t>
+      <w:r>
+        <w:rPr>
+          <w:rFonts w:ascii="Times New Roman" w:eastAsia="Times New Roman" w:hAnsi="Times New Roman" w:cs="Times New Roman"/>
+          <w:b/>
+          <w:bCs/>
+          <w:sz w:val="24"/>
+          <w:szCs w:val="24"/>
+          <w:lang w:eastAsia="es-419"/>
+        </w:rPr>
+        <w:t>Frontend (React):</w:t>
       </w:r>
       <w:r>
         <w:rPr>
@@ -3396,27 +3102,7 @@
           <w:szCs w:val="24"/>
           <w:lang w:eastAsia="es-419"/>
         </w:rPr>
-        <w:t xml:space="preserve"> Variables de entorno (.</w:t>
-      </w:r>
-      <w:proofErr w:type="spellStart"/>
-      <w:r>
-        <w:rPr>
-          <w:rFonts w:ascii="Times New Roman" w:eastAsia="Times New Roman" w:hAnsi="Times New Roman" w:cs="Times New Roman"/>
-          <w:sz w:val="24"/>
-          <w:szCs w:val="24"/>
-          <w:lang w:eastAsia="es-419"/>
-        </w:rPr>
-        <w:t>env</w:t>
-      </w:r>
-      <w:proofErr w:type="spellEnd"/>
-      <w:r>
-        <w:rPr>
-          <w:rFonts w:ascii="Times New Roman" w:eastAsia="Times New Roman" w:hAnsi="Times New Roman" w:cs="Times New Roman"/>
-          <w:sz w:val="24"/>
-          <w:szCs w:val="24"/>
-          <w:lang w:eastAsia="es-419"/>
-        </w:rPr>
-        <w:t>), configuraciones del servidor.</w:t>
+        <w:t xml:space="preserve"> Variables de entorno (.env), configuraciones del servidor.</w:t>
       </w:r>
     </w:p>
     <w:p>
@@ -3579,29 +3265,16 @@
           <w:lang w:eastAsia="es-419"/>
         </w:rPr>
       </w:pPr>
-      <w:proofErr w:type="spellStart"/>
-      <w:r>
-        <w:rPr>
-          <w:rFonts w:ascii="Times New Roman" w:eastAsia="Times New Roman" w:hAnsi="Times New Roman" w:cs="Times New Roman"/>
-          <w:b/>
-          <w:bCs/>
-          <w:sz w:val="24"/>
-          <w:szCs w:val="24"/>
-          <w:lang w:eastAsia="es-419"/>
-        </w:rPr>
-        <w:t>Backup</w:t>
-      </w:r>
-      <w:proofErr w:type="spellEnd"/>
-      <w:r>
-        <w:rPr>
-          <w:rFonts w:ascii="Times New Roman" w:eastAsia="Times New Roman" w:hAnsi="Times New Roman" w:cs="Times New Roman"/>
-          <w:b/>
-          <w:bCs/>
-          <w:sz w:val="24"/>
-          <w:szCs w:val="24"/>
-          <w:lang w:eastAsia="es-419"/>
-        </w:rPr>
-        <w:t xml:space="preserve"> (Respaldo):</w:t>
+      <w:r>
+        <w:rPr>
+          <w:rFonts w:ascii="Times New Roman" w:eastAsia="Times New Roman" w:hAnsi="Times New Roman" w:cs="Times New Roman"/>
+          <w:b/>
+          <w:bCs/>
+          <w:sz w:val="24"/>
+          <w:szCs w:val="24"/>
+          <w:lang w:eastAsia="es-419"/>
+        </w:rPr>
+        <w:t>Backup (Respaldo):</w:t>
       </w:r>
       <w:r>
         <w:rPr>
@@ -3671,55 +3344,7 @@
           <w:szCs w:val="24"/>
           <w:lang w:eastAsia="es-419"/>
         </w:rPr>
-        <w:t>RTO (</w:t>
-      </w:r>
-      <w:proofErr w:type="spellStart"/>
-      <w:r>
-        <w:rPr>
-          <w:rFonts w:ascii="Times New Roman" w:eastAsia="Times New Roman" w:hAnsi="Times New Roman" w:cs="Times New Roman"/>
-          <w:b/>
-          <w:bCs/>
-          <w:sz w:val="24"/>
-          <w:szCs w:val="24"/>
-          <w:lang w:eastAsia="es-419"/>
-        </w:rPr>
-        <w:t>Recovery</w:t>
-      </w:r>
-      <w:proofErr w:type="spellEnd"/>
-      <w:r>
-        <w:rPr>
-          <w:rFonts w:ascii="Times New Roman" w:eastAsia="Times New Roman" w:hAnsi="Times New Roman" w:cs="Times New Roman"/>
-          <w:b/>
-          <w:bCs/>
-          <w:sz w:val="24"/>
-          <w:szCs w:val="24"/>
-          <w:lang w:eastAsia="es-419"/>
-        </w:rPr>
-        <w:t xml:space="preserve"> Time </w:t>
-      </w:r>
-      <w:proofErr w:type="spellStart"/>
-      <w:r>
-        <w:rPr>
-          <w:rFonts w:ascii="Times New Roman" w:eastAsia="Times New Roman" w:hAnsi="Times New Roman" w:cs="Times New Roman"/>
-          <w:b/>
-          <w:bCs/>
-          <w:sz w:val="24"/>
-          <w:szCs w:val="24"/>
-          <w:lang w:eastAsia="es-419"/>
-        </w:rPr>
-        <w:t>Objective</w:t>
-      </w:r>
-      <w:proofErr w:type="spellEnd"/>
-      <w:r>
-        <w:rPr>
-          <w:rFonts w:ascii="Times New Roman" w:eastAsia="Times New Roman" w:hAnsi="Times New Roman" w:cs="Times New Roman"/>
-          <w:b/>
-          <w:bCs/>
-          <w:sz w:val="24"/>
-          <w:szCs w:val="24"/>
-          <w:lang w:eastAsia="es-419"/>
-        </w:rPr>
-        <w:t>):</w:t>
+        <w:t>RTO (Recovery Time Objective):</w:t>
       </w:r>
       <w:r>
         <w:rPr>
@@ -3754,55 +3379,7 @@
           <w:szCs w:val="24"/>
           <w:lang w:eastAsia="es-419"/>
         </w:rPr>
-        <w:t>RPO (</w:t>
-      </w:r>
-      <w:proofErr w:type="spellStart"/>
-      <w:r>
-        <w:rPr>
-          <w:rFonts w:ascii="Times New Roman" w:eastAsia="Times New Roman" w:hAnsi="Times New Roman" w:cs="Times New Roman"/>
-          <w:b/>
-          <w:bCs/>
-          <w:sz w:val="24"/>
-          <w:szCs w:val="24"/>
-          <w:lang w:eastAsia="es-419"/>
-        </w:rPr>
-        <w:t>Recovery</w:t>
-      </w:r>
-      <w:proofErr w:type="spellEnd"/>
-      <w:r>
-        <w:rPr>
-          <w:rFonts w:ascii="Times New Roman" w:eastAsia="Times New Roman" w:hAnsi="Times New Roman" w:cs="Times New Roman"/>
-          <w:b/>
-          <w:bCs/>
-          <w:sz w:val="24"/>
-          <w:szCs w:val="24"/>
-          <w:lang w:eastAsia="es-419"/>
-        </w:rPr>
-        <w:t xml:space="preserve"> Point </w:t>
-      </w:r>
-      <w:proofErr w:type="spellStart"/>
-      <w:r>
-        <w:rPr>
-          <w:rFonts w:ascii="Times New Roman" w:eastAsia="Times New Roman" w:hAnsi="Times New Roman" w:cs="Times New Roman"/>
-          <w:b/>
-          <w:bCs/>
-          <w:sz w:val="24"/>
-          <w:szCs w:val="24"/>
-          <w:lang w:eastAsia="es-419"/>
-        </w:rPr>
-        <w:t>Objective</w:t>
-      </w:r>
-      <w:proofErr w:type="spellEnd"/>
-      <w:r>
-        <w:rPr>
-          <w:rFonts w:ascii="Times New Roman" w:eastAsia="Times New Roman" w:hAnsi="Times New Roman" w:cs="Times New Roman"/>
-          <w:b/>
-          <w:bCs/>
-          <w:sz w:val="24"/>
-          <w:szCs w:val="24"/>
-          <w:lang w:eastAsia="es-419"/>
-        </w:rPr>
-        <w:t>):</w:t>
+        <w:t>RPO (Recovery Point Objective):</w:t>
       </w:r>
       <w:r>
         <w:rPr>
@@ -3828,29 +3405,16 @@
           <w:lang w:eastAsia="es-419"/>
         </w:rPr>
       </w:pPr>
-      <w:proofErr w:type="spellStart"/>
-      <w:r>
-        <w:rPr>
-          <w:rFonts w:ascii="Times New Roman" w:eastAsia="Times New Roman" w:hAnsi="Times New Roman" w:cs="Times New Roman"/>
-          <w:b/>
-          <w:bCs/>
-          <w:sz w:val="24"/>
-          <w:szCs w:val="24"/>
-          <w:lang w:eastAsia="es-419"/>
-        </w:rPr>
-        <w:t>Backup</w:t>
-      </w:r>
-      <w:proofErr w:type="spellEnd"/>
-      <w:r>
-        <w:rPr>
-          <w:rFonts w:ascii="Times New Roman" w:eastAsia="Times New Roman" w:hAnsi="Times New Roman" w:cs="Times New Roman"/>
-          <w:b/>
-          <w:bCs/>
-          <w:sz w:val="24"/>
-          <w:szCs w:val="24"/>
-          <w:lang w:eastAsia="es-419"/>
-        </w:rPr>
-        <w:t xml:space="preserve"> Incremental:</w:t>
+      <w:r>
+        <w:rPr>
+          <w:rFonts w:ascii="Times New Roman" w:eastAsia="Times New Roman" w:hAnsi="Times New Roman" w:cs="Times New Roman"/>
+          <w:b/>
+          <w:bCs/>
+          <w:sz w:val="24"/>
+          <w:szCs w:val="24"/>
+          <w:lang w:eastAsia="es-419"/>
+        </w:rPr>
+        <w:t>Backup Incremental:</w:t>
       </w:r>
       <w:r>
         <w:rPr>
@@ -3876,29 +3440,16 @@
           <w:lang w:eastAsia="es-419"/>
         </w:rPr>
       </w:pPr>
-      <w:proofErr w:type="spellStart"/>
-      <w:r>
-        <w:rPr>
-          <w:rFonts w:ascii="Times New Roman" w:eastAsia="Times New Roman" w:hAnsi="Times New Roman" w:cs="Times New Roman"/>
-          <w:b/>
-          <w:bCs/>
-          <w:sz w:val="24"/>
-          <w:szCs w:val="24"/>
-          <w:lang w:eastAsia="es-419"/>
-        </w:rPr>
-        <w:t>Backup</w:t>
-      </w:r>
-      <w:proofErr w:type="spellEnd"/>
-      <w:r>
-        <w:rPr>
-          <w:rFonts w:ascii="Times New Roman" w:eastAsia="Times New Roman" w:hAnsi="Times New Roman" w:cs="Times New Roman"/>
-          <w:b/>
-          <w:bCs/>
-          <w:sz w:val="24"/>
-          <w:szCs w:val="24"/>
-          <w:lang w:eastAsia="es-419"/>
-        </w:rPr>
-        <w:t xml:space="preserve"> Completo:</w:t>
+      <w:r>
+        <w:rPr>
+          <w:rFonts w:ascii="Times New Roman" w:eastAsia="Times New Roman" w:hAnsi="Times New Roman" w:cs="Times New Roman"/>
+          <w:b/>
+          <w:bCs/>
+          <w:sz w:val="24"/>
+          <w:szCs w:val="24"/>
+          <w:lang w:eastAsia="es-419"/>
+        </w:rPr>
+        <w:t>Backup Completo:</w:t>
       </w:r>
       <w:r>
         <w:rPr>
@@ -4019,21 +3570,8 @@
           <w:szCs w:val="27"/>
           <w:lang w:eastAsia="es-419"/>
         </w:rPr>
-        <w:t xml:space="preserve">5.1 Frecuencia de </w:t>
-      </w:r>
-      <w:proofErr w:type="spellStart"/>
-      <w:r>
-        <w:rPr>
-          <w:rFonts w:ascii="Times New Roman" w:eastAsia="Times New Roman" w:hAnsi="Times New Roman" w:cs="Times New Roman"/>
-          <w:b/>
-          <w:bCs/>
-          <w:sz w:val="27"/>
-          <w:szCs w:val="27"/>
-          <w:lang w:eastAsia="es-419"/>
-        </w:rPr>
-        <w:t>Backups</w:t>
-      </w:r>
-      <w:proofErr w:type="spellEnd"/>
+        <w:t>5.1 Frecuencia de Backups</w:t>
+      </w:r>
     </w:p>
     <w:p>
       <w:pPr>
@@ -4069,29 +3607,16 @@
           <w:lang w:eastAsia="es-419"/>
         </w:rPr>
       </w:pPr>
-      <w:proofErr w:type="spellStart"/>
-      <w:r>
-        <w:rPr>
-          <w:rFonts w:ascii="Times New Roman" w:eastAsia="Times New Roman" w:hAnsi="Times New Roman" w:cs="Times New Roman"/>
-          <w:b/>
-          <w:bCs/>
-          <w:sz w:val="24"/>
-          <w:szCs w:val="24"/>
-          <w:lang w:eastAsia="es-419"/>
-        </w:rPr>
-        <w:t>Backup</w:t>
-      </w:r>
-      <w:proofErr w:type="spellEnd"/>
-      <w:r>
-        <w:rPr>
-          <w:rFonts w:ascii="Times New Roman" w:eastAsia="Times New Roman" w:hAnsi="Times New Roman" w:cs="Times New Roman"/>
-          <w:b/>
-          <w:bCs/>
-          <w:sz w:val="24"/>
-          <w:szCs w:val="24"/>
-          <w:lang w:eastAsia="es-419"/>
-        </w:rPr>
-        <w:t xml:space="preserve"> completo diario:</w:t>
+      <w:r>
+        <w:rPr>
+          <w:rFonts w:ascii="Times New Roman" w:eastAsia="Times New Roman" w:hAnsi="Times New Roman" w:cs="Times New Roman"/>
+          <w:b/>
+          <w:bCs/>
+          <w:sz w:val="24"/>
+          <w:szCs w:val="24"/>
+          <w:lang w:eastAsia="es-419"/>
+        </w:rPr>
+        <w:t>Backup completo diario:</w:t>
       </w:r>
       <w:r>
         <w:rPr>
@@ -4117,29 +3642,16 @@
           <w:lang w:eastAsia="es-419"/>
         </w:rPr>
       </w:pPr>
-      <w:proofErr w:type="spellStart"/>
-      <w:r>
-        <w:rPr>
-          <w:rFonts w:ascii="Times New Roman" w:eastAsia="Times New Roman" w:hAnsi="Times New Roman" w:cs="Times New Roman"/>
-          <w:b/>
-          <w:bCs/>
-          <w:sz w:val="24"/>
-          <w:szCs w:val="24"/>
-          <w:lang w:eastAsia="es-419"/>
-        </w:rPr>
-        <w:t>Backup</w:t>
-      </w:r>
-      <w:proofErr w:type="spellEnd"/>
-      <w:r>
-        <w:rPr>
-          <w:rFonts w:ascii="Times New Roman" w:eastAsia="Times New Roman" w:hAnsi="Times New Roman" w:cs="Times New Roman"/>
-          <w:b/>
-          <w:bCs/>
-          <w:sz w:val="24"/>
-          <w:szCs w:val="24"/>
-          <w:lang w:eastAsia="es-419"/>
-        </w:rPr>
-        <w:t xml:space="preserve"> incremental cada 6 horas:</w:t>
+      <w:r>
+        <w:rPr>
+          <w:rFonts w:ascii="Times New Roman" w:eastAsia="Times New Roman" w:hAnsi="Times New Roman" w:cs="Times New Roman"/>
+          <w:b/>
+          <w:bCs/>
+          <w:sz w:val="24"/>
+          <w:szCs w:val="24"/>
+          <w:lang w:eastAsia="es-419"/>
+        </w:rPr>
+        <w:t>Backup incremental cada 6 horas:</w:t>
       </w:r>
       <w:r>
         <w:rPr>
@@ -4165,7 +3677,6 @@
           <w:lang w:eastAsia="es-419"/>
         </w:rPr>
       </w:pPr>
-      <w:proofErr w:type="spellStart"/>
       <w:r>
         <w:rPr>
           <w:rFonts w:ascii="Times New Roman" w:eastAsia="Times New Roman" w:hAnsi="Times New Roman" w:cs="Times New Roman"/>
@@ -4176,19 +3687,7 @@
           <w:lang w:eastAsia="es-419"/>
         </w:rPr>
         <w:lastRenderedPageBreak/>
-        <w:t>Backup</w:t>
-      </w:r>
-      <w:proofErr w:type="spellEnd"/>
-      <w:r>
-        <w:rPr>
-          <w:rFonts w:ascii="Times New Roman" w:eastAsia="Times New Roman" w:hAnsi="Times New Roman" w:cs="Times New Roman"/>
-          <w:b/>
-          <w:bCs/>
-          <w:sz w:val="24"/>
-          <w:szCs w:val="24"/>
-          <w:lang w:eastAsia="es-419"/>
-        </w:rPr>
-        <w:t xml:space="preserve"> manual:</w:t>
+        <w:t>Backup manual:</w:t>
       </w:r>
       <w:r>
         <w:rPr>
@@ -4311,27 +3810,7 @@
           <w:szCs w:val="24"/>
           <w:lang w:eastAsia="es-419"/>
         </w:rPr>
-        <w:t xml:space="preserve"> de </w:t>
-      </w:r>
-      <w:proofErr w:type="gramStart"/>
-      <w:r>
-        <w:rPr>
-          <w:rFonts w:ascii="Times New Roman" w:eastAsia="Times New Roman" w:hAnsi="Times New Roman" w:cs="Times New Roman"/>
-          <w:sz w:val="24"/>
-          <w:szCs w:val="24"/>
-          <w:lang w:eastAsia="es-419"/>
-        </w:rPr>
-        <w:t>Abril</w:t>
-      </w:r>
-      <w:proofErr w:type="gramEnd"/>
-      <w:r>
-        <w:rPr>
-          <w:rFonts w:ascii="Times New Roman" w:eastAsia="Times New Roman" w:hAnsi="Times New Roman" w:cs="Times New Roman"/>
-          <w:sz w:val="24"/>
-          <w:szCs w:val="24"/>
-          <w:lang w:eastAsia="es-419"/>
-        </w:rPr>
-        <w:t xml:space="preserve"> de 2026</w:t>
+        <w:t xml:space="preserve"> de Abril de 2026</w:t>
       </w:r>
       <w:r>
         <w:rPr>
@@ -4452,31 +3931,7 @@
           <w:szCs w:val="27"/>
           <w:lang w:eastAsia="es-419"/>
         </w:rPr>
-        <w:t xml:space="preserve">5.3 </w:t>
-      </w:r>
-      <w:proofErr w:type="gramStart"/>
-      <w:r>
-        <w:rPr>
-          <w:rFonts w:ascii="Times New Roman" w:eastAsia="Times New Roman" w:hAnsi="Times New Roman" w:cs="Times New Roman"/>
-          <w:b/>
-          <w:bCs/>
-          <w:sz w:val="27"/>
-          <w:szCs w:val="27"/>
-          <w:lang w:eastAsia="es-419"/>
-        </w:rPr>
-        <w:t>Responsable</w:t>
-      </w:r>
-      <w:proofErr w:type="gramEnd"/>
-      <w:r>
-        <w:rPr>
-          <w:rFonts w:ascii="Times New Roman" w:eastAsia="Times New Roman" w:hAnsi="Times New Roman" w:cs="Times New Roman"/>
-          <w:b/>
-          <w:bCs/>
-          <w:sz w:val="27"/>
-          <w:szCs w:val="27"/>
-          <w:lang w:eastAsia="es-419"/>
-        </w:rPr>
-        <w:t xml:space="preserve"> del Proceso</w:t>
+        <w:t>5.3 Responsable del Proceso</w:t>
       </w:r>
     </w:p>
     <w:p>
@@ -4612,19 +4067,8 @@
           <w:szCs w:val="24"/>
           <w:lang w:eastAsia="es-419"/>
         </w:rPr>
-        <w:t xml:space="preserve">Validar integridad de los </w:t>
-      </w:r>
-      <w:proofErr w:type="spellStart"/>
-      <w:r>
-        <w:rPr>
-          <w:rFonts w:ascii="Times New Roman" w:eastAsia="Times New Roman" w:hAnsi="Times New Roman" w:cs="Times New Roman"/>
-          <w:sz w:val="24"/>
-          <w:szCs w:val="24"/>
-          <w:lang w:eastAsia="es-419"/>
-        </w:rPr>
-        <w:t>backups</w:t>
-      </w:r>
-      <w:proofErr w:type="spellEnd"/>
+        <w:t>Validar integridad de los backups</w:t>
+      </w:r>
     </w:p>
     <w:p>
       <w:pPr>
@@ -4762,27 +4206,7 @@
           <w:szCs w:val="24"/>
           <w:lang w:eastAsia="es-419"/>
         </w:rPr>
-        <w:t xml:space="preserve"> </w:t>
-      </w:r>
-      <w:proofErr w:type="spellStart"/>
-      <w:r>
-        <w:rPr>
-          <w:rFonts w:ascii="Times New Roman" w:eastAsia="Times New Roman" w:hAnsi="Times New Roman" w:cs="Times New Roman"/>
-          <w:sz w:val="24"/>
-          <w:szCs w:val="24"/>
-          <w:lang w:eastAsia="es-419"/>
-        </w:rPr>
-        <w:t>Backups</w:t>
-      </w:r>
-      <w:proofErr w:type="spellEnd"/>
-      <w:r>
-        <w:rPr>
-          <w:rFonts w:ascii="Times New Roman" w:eastAsia="Times New Roman" w:hAnsi="Times New Roman" w:cs="Times New Roman"/>
-          <w:sz w:val="24"/>
-          <w:szCs w:val="24"/>
-          <w:lang w:eastAsia="es-419"/>
-        </w:rPr>
-        <w:t xml:space="preserve"> automáticos del servidor y base de datos.</w:t>
+        <w:t xml:space="preserve"> Backups automáticos del servidor y base de datos.</w:t>
       </w:r>
     </w:p>
     <w:p>
@@ -4799,29 +4223,16 @@
           <w:lang w:eastAsia="es-419"/>
         </w:rPr>
       </w:pPr>
-      <w:proofErr w:type="spellStart"/>
-      <w:r>
-        <w:rPr>
-          <w:rFonts w:ascii="Times New Roman" w:eastAsia="Times New Roman" w:hAnsi="Times New Roman" w:cs="Times New Roman"/>
-          <w:b/>
-          <w:bCs/>
-          <w:sz w:val="24"/>
-          <w:szCs w:val="24"/>
-          <w:lang w:eastAsia="es-419"/>
-        </w:rPr>
-        <w:t>Dump</w:t>
-      </w:r>
-      <w:proofErr w:type="spellEnd"/>
-      <w:r>
-        <w:rPr>
-          <w:rFonts w:ascii="Times New Roman" w:eastAsia="Times New Roman" w:hAnsi="Times New Roman" w:cs="Times New Roman"/>
-          <w:b/>
-          <w:bCs/>
-          <w:sz w:val="24"/>
-          <w:szCs w:val="24"/>
-          <w:lang w:eastAsia="es-419"/>
-        </w:rPr>
-        <w:t>:</w:t>
+      <w:r>
+        <w:rPr>
+          <w:rFonts w:ascii="Times New Roman" w:eastAsia="Times New Roman" w:hAnsi="Times New Roman" w:cs="Times New Roman"/>
+          <w:b/>
+          <w:bCs/>
+          <w:sz w:val="24"/>
+          <w:szCs w:val="24"/>
+          <w:lang w:eastAsia="es-419"/>
+        </w:rPr>
+        <w:t>Dump:</w:t>
       </w:r>
       <w:r>
         <w:rPr>
@@ -4900,27 +4311,7 @@
           <w:szCs w:val="24"/>
           <w:lang w:eastAsia="es-419"/>
         </w:rPr>
-        <w:t xml:space="preserve"> Gestión de procesos del </w:t>
-      </w:r>
-      <w:proofErr w:type="spellStart"/>
-      <w:r>
-        <w:rPr>
-          <w:rFonts w:ascii="Times New Roman" w:eastAsia="Times New Roman" w:hAnsi="Times New Roman" w:cs="Times New Roman"/>
-          <w:sz w:val="24"/>
-          <w:szCs w:val="24"/>
-          <w:lang w:eastAsia="es-419"/>
-        </w:rPr>
-        <w:t>backend</w:t>
-      </w:r>
-      <w:proofErr w:type="spellEnd"/>
-      <w:r>
-        <w:rPr>
-          <w:rFonts w:ascii="Times New Roman" w:eastAsia="Times New Roman" w:hAnsi="Times New Roman" w:cs="Times New Roman"/>
-          <w:sz w:val="24"/>
-          <w:szCs w:val="24"/>
-          <w:lang w:eastAsia="es-419"/>
-        </w:rPr>
-        <w:t>.</w:t>
+        <w:t xml:space="preserve"> Gestión de procesos del backend.</w:t>
       </w:r>
     </w:p>
     <w:p>
@@ -5056,25 +4447,14 @@
           <w:lang w:eastAsia="es-419"/>
         </w:rPr>
       </w:pPr>
-      <w:proofErr w:type="spellStart"/>
-      <w:r>
-        <w:rPr>
-          <w:rFonts w:ascii="Times New Roman" w:eastAsia="Times New Roman" w:hAnsi="Times New Roman" w:cs="Times New Roman"/>
-          <w:sz w:val="24"/>
-          <w:szCs w:val="24"/>
-          <w:lang w:eastAsia="es-419"/>
-        </w:rPr>
-        <w:t>Backups</w:t>
-      </w:r>
-      <w:proofErr w:type="spellEnd"/>
-      <w:r>
-        <w:rPr>
-          <w:rFonts w:ascii="Times New Roman" w:eastAsia="Times New Roman" w:hAnsi="Times New Roman" w:cs="Times New Roman"/>
-          <w:sz w:val="24"/>
-          <w:szCs w:val="24"/>
-          <w:lang w:eastAsia="es-419"/>
-        </w:rPr>
-        <w:t xml:space="preserve"> automáticos en la nube</w:t>
+      <w:r>
+        <w:rPr>
+          <w:rFonts w:ascii="Times New Roman" w:eastAsia="Times New Roman" w:hAnsi="Times New Roman" w:cs="Times New Roman"/>
+          <w:sz w:val="24"/>
+          <w:szCs w:val="24"/>
+          <w:lang w:eastAsia="es-419"/>
+        </w:rPr>
+        <w:t>Backups automáticos en la nube</w:t>
       </w:r>
     </w:p>
     <w:p>
@@ -5115,25 +4495,14 @@
           <w:lang w:eastAsia="es-419"/>
         </w:rPr>
       </w:pPr>
-      <w:proofErr w:type="spellStart"/>
-      <w:r>
-        <w:rPr>
-          <w:rFonts w:ascii="Times New Roman" w:eastAsia="Times New Roman" w:hAnsi="Times New Roman" w:cs="Times New Roman"/>
-          <w:sz w:val="24"/>
-          <w:szCs w:val="24"/>
-          <w:lang w:eastAsia="es-419"/>
-        </w:rPr>
-        <w:t>Versionamiento</w:t>
-      </w:r>
-      <w:proofErr w:type="spellEnd"/>
-      <w:r>
-        <w:rPr>
-          <w:rFonts w:ascii="Times New Roman" w:eastAsia="Times New Roman" w:hAnsi="Times New Roman" w:cs="Times New Roman"/>
-          <w:sz w:val="24"/>
-          <w:szCs w:val="24"/>
-          <w:lang w:eastAsia="es-419"/>
-        </w:rPr>
-        <w:t xml:space="preserve"> del código fuente</w:t>
+      <w:r>
+        <w:rPr>
+          <w:rFonts w:ascii="Times New Roman" w:eastAsia="Times New Roman" w:hAnsi="Times New Roman" w:cs="Times New Roman"/>
+          <w:sz w:val="24"/>
+          <w:szCs w:val="24"/>
+          <w:lang w:eastAsia="es-419"/>
+        </w:rPr>
+        <w:t>Versionamiento del código fuente</w:t>
       </w:r>
     </w:p>
     <w:p>
@@ -5279,31 +4648,7 @@
           <w:szCs w:val="27"/>
           <w:lang w:eastAsia="es-419"/>
         </w:rPr>
-        <w:t xml:space="preserve">1. </w:t>
-      </w:r>
-      <w:proofErr w:type="spellStart"/>
-      <w:r>
-        <w:rPr>
-          <w:rFonts w:ascii="Times New Roman" w:eastAsia="Times New Roman" w:hAnsi="Times New Roman" w:cs="Times New Roman"/>
-          <w:b/>
-          <w:bCs/>
-          <w:sz w:val="27"/>
-          <w:szCs w:val="27"/>
-          <w:lang w:eastAsia="es-419"/>
-        </w:rPr>
-        <w:t>Backups</w:t>
-      </w:r>
-      <w:proofErr w:type="spellEnd"/>
-      <w:r>
-        <w:rPr>
-          <w:rFonts w:ascii="Times New Roman" w:eastAsia="Times New Roman" w:hAnsi="Times New Roman" w:cs="Times New Roman"/>
-          <w:b/>
-          <w:bCs/>
-          <w:sz w:val="27"/>
-          <w:szCs w:val="27"/>
-          <w:lang w:eastAsia="es-419"/>
-        </w:rPr>
-        <w:t xml:space="preserve"> automáticos (Hostinger)</w:t>
+        <w:t>1. Backups automáticos (Hostinger)</w:t>
       </w:r>
     </w:p>
     <w:p>
@@ -5424,31 +4769,7 @@
           <w:szCs w:val="27"/>
           <w:lang w:eastAsia="es-419"/>
         </w:rPr>
-        <w:t xml:space="preserve">2. </w:t>
-      </w:r>
-      <w:proofErr w:type="spellStart"/>
-      <w:r>
-        <w:rPr>
-          <w:rFonts w:ascii="Times New Roman" w:eastAsia="Times New Roman" w:hAnsi="Times New Roman" w:cs="Times New Roman"/>
-          <w:b/>
-          <w:bCs/>
-          <w:sz w:val="27"/>
-          <w:szCs w:val="27"/>
-          <w:lang w:eastAsia="es-419"/>
-        </w:rPr>
-        <w:t>Backups</w:t>
-      </w:r>
-      <w:proofErr w:type="spellEnd"/>
-      <w:r>
-        <w:rPr>
-          <w:rFonts w:ascii="Times New Roman" w:eastAsia="Times New Roman" w:hAnsi="Times New Roman" w:cs="Times New Roman"/>
-          <w:b/>
-          <w:bCs/>
-          <w:sz w:val="27"/>
-          <w:szCs w:val="27"/>
-          <w:lang w:eastAsia="es-419"/>
-        </w:rPr>
-        <w:t xml:space="preserve"> manuales (Exportación SQL)</w:t>
+        <w:t>2. Backups manuales (Exportación SQL)</w:t>
       </w:r>
     </w:p>
     <w:p>
@@ -5470,7 +4791,6 @@
         </w:rPr>
         <w:t xml:space="preserve">Se realizan mediante la herramienta </w:t>
       </w:r>
-      <w:proofErr w:type="spellStart"/>
       <w:r>
         <w:rPr>
           <w:rFonts w:ascii="Courier New" w:eastAsia="Times New Roman" w:hAnsi="Courier New" w:cs="Courier New"/>
@@ -5480,7 +4800,6 @@
         </w:rPr>
         <w:t>mysqldump</w:t>
       </w:r>
-      <w:proofErr w:type="spellEnd"/>
       <w:r>
         <w:rPr>
           <w:rFonts w:ascii="Times New Roman" w:eastAsia="Times New Roman" w:hAnsi="Times New Roman" w:cs="Times New Roman"/>
@@ -5519,7 +4838,6 @@
           <w:lang w:eastAsia="es-419"/>
         </w:rPr>
       </w:pPr>
-      <w:proofErr w:type="spellStart"/>
       <w:r>
         <w:rPr>
           <w:rFonts w:ascii="Courier New" w:eastAsia="Times New Roman" w:hAnsi="Courier New" w:cs="Courier New"/>
@@ -5527,9 +4845,8 @@
           <w:szCs w:val="20"/>
           <w:lang w:eastAsia="es-419"/>
         </w:rPr>
-        <w:t>mysqldump</w:t>
-      </w:r>
-      <w:proofErr w:type="spellEnd"/>
+        <w:t xml:space="preserve">mysqldump -u </w:t>
+      </w:r>
       <w:r>
         <w:rPr>
           <w:rFonts w:ascii="Courier New" w:eastAsia="Times New Roman" w:hAnsi="Courier New" w:cs="Courier New"/>
@@ -5537,9 +4854,8 @@
           <w:szCs w:val="20"/>
           <w:lang w:eastAsia="es-419"/>
         </w:rPr>
-        <w:t xml:space="preserve"> -u </w:t>
-      </w:r>
-      <w:proofErr w:type="spellStart"/>
+        <w:t>comunidad_usuario</w:t>
+      </w:r>
       <w:r>
         <w:rPr>
           <w:rFonts w:ascii="Courier New" w:eastAsia="Times New Roman" w:hAnsi="Courier New" w:cs="Courier New"/>
@@ -5547,9 +4863,8 @@
           <w:szCs w:val="20"/>
           <w:lang w:eastAsia="es-419"/>
         </w:rPr>
-        <w:t>comunidad_usuario</w:t>
-      </w:r>
-      <w:proofErr w:type="spellEnd"/>
+        <w:t xml:space="preserve"> -p </w:t>
+      </w:r>
       <w:r>
         <w:rPr>
           <w:rFonts w:ascii="Courier New" w:eastAsia="Times New Roman" w:hAnsi="Courier New" w:cs="Courier New"/>
@@ -5557,9 +4872,8 @@
           <w:szCs w:val="20"/>
           <w:lang w:eastAsia="es-419"/>
         </w:rPr>
-        <w:t xml:space="preserve"> -p </w:t>
-      </w:r>
-      <w:proofErr w:type="spellStart"/>
+        <w:t>comunidadinteligente</w:t>
+      </w:r>
       <w:r>
         <w:rPr>
           <w:rFonts w:ascii="Courier New" w:eastAsia="Times New Roman" w:hAnsi="Courier New" w:cs="Courier New"/>
@@ -5567,9 +4881,8 @@
           <w:szCs w:val="20"/>
           <w:lang w:eastAsia="es-419"/>
         </w:rPr>
-        <w:t>comunidadinteligente</w:t>
-      </w:r>
-      <w:proofErr w:type="spellEnd"/>
+        <w:t xml:space="preserve"> &gt; </w:t>
+      </w:r>
       <w:r>
         <w:rPr>
           <w:rFonts w:ascii="Courier New" w:eastAsia="Times New Roman" w:hAnsi="Courier New" w:cs="Courier New"/>
@@ -5577,9 +4890,8 @@
           <w:szCs w:val="20"/>
           <w:lang w:eastAsia="es-419"/>
         </w:rPr>
-        <w:t xml:space="preserve"> &gt; </w:t>
-      </w:r>
-      <w:proofErr w:type="spellStart"/>
+        <w:t>comunidadinteligente</w:t>
+      </w:r>
       <w:r>
         <w:rPr>
           <w:rFonts w:ascii="Courier New" w:eastAsia="Times New Roman" w:hAnsi="Courier New" w:cs="Courier New"/>
@@ -5587,18 +4899,8 @@
           <w:szCs w:val="20"/>
           <w:lang w:eastAsia="es-419"/>
         </w:rPr>
-        <w:t>comunidadinteligente</w:t>
-      </w:r>
-      <w:r>
-        <w:rPr>
-          <w:rFonts w:ascii="Courier New" w:eastAsia="Times New Roman" w:hAnsi="Courier New" w:cs="Courier New"/>
-          <w:sz w:val="20"/>
-          <w:szCs w:val="20"/>
-          <w:lang w:eastAsia="es-419"/>
-        </w:rPr>
         <w:t>.sql</w:t>
       </w:r>
-      <w:proofErr w:type="spellEnd"/>
     </w:p>
     <w:p>
       <w:pPr>
@@ -5834,19 +5136,8 @@
           <w:szCs w:val="20"/>
           <w:lang w:eastAsia="es-419"/>
         </w:rPr>
-        <w:t>.</w:t>
-      </w:r>
-      <w:proofErr w:type="spellStart"/>
-      <w:r>
-        <w:rPr>
-          <w:rFonts w:ascii="Courier New" w:eastAsia="Times New Roman" w:hAnsi="Courier New" w:cs="Courier New"/>
-          <w:sz w:val="20"/>
-          <w:szCs w:val="20"/>
-          <w:lang w:eastAsia="es-419"/>
-        </w:rPr>
-        <w:t>sql</w:t>
-      </w:r>
-      <w:proofErr w:type="spellEnd"/>
+        <w:t>.sql</w:t>
+      </w:r>
       <w:r>
         <w:rPr>
           <w:rFonts w:ascii="Times New Roman" w:eastAsia="Times New Roman" w:hAnsi="Times New Roman" w:cs="Times New Roman"/>
@@ -5960,45 +5251,8 @@
           <w:szCs w:val="36"/>
           <w:lang w:eastAsia="es-419"/>
         </w:rPr>
-        <w:t xml:space="preserve">6.2 Respaldo del </w:t>
-      </w:r>
-      <w:proofErr w:type="spellStart"/>
-      <w:r>
-        <w:rPr>
-          <w:rFonts w:ascii="Times New Roman" w:eastAsia="Times New Roman" w:hAnsi="Times New Roman" w:cs="Times New Roman"/>
-          <w:b/>
-          <w:bCs/>
-          <w:sz w:val="36"/>
-          <w:szCs w:val="36"/>
-          <w:lang w:eastAsia="es-419"/>
-        </w:rPr>
-        <w:t>Backend</w:t>
-      </w:r>
-      <w:proofErr w:type="spellEnd"/>
-      <w:r>
-        <w:rPr>
-          <w:rFonts w:ascii="Times New Roman" w:eastAsia="Times New Roman" w:hAnsi="Times New Roman" w:cs="Times New Roman"/>
-          <w:b/>
-          <w:bCs/>
-          <w:sz w:val="36"/>
-          <w:szCs w:val="36"/>
-          <w:lang w:eastAsia="es-419"/>
-        </w:rPr>
-        <w:t xml:space="preserve"> y </w:t>
-      </w:r>
-      <w:proofErr w:type="spellStart"/>
-      <w:r>
-        <w:rPr>
-          <w:rFonts w:ascii="Times New Roman" w:eastAsia="Times New Roman" w:hAnsi="Times New Roman" w:cs="Times New Roman"/>
-          <w:b/>
-          <w:bCs/>
-          <w:sz w:val="36"/>
-          <w:szCs w:val="36"/>
-          <w:lang w:eastAsia="es-419"/>
-        </w:rPr>
-        <w:t>Frontend</w:t>
-      </w:r>
-      <w:proofErr w:type="spellEnd"/>
+        <w:t>6.2 Respaldo del Backend y Frontend</w:t>
+      </w:r>
     </w:p>
     <w:p>
       <w:pPr>
@@ -6090,27 +5344,7 @@
           <w:szCs w:val="24"/>
           <w:lang w:eastAsia="es-419"/>
         </w:rPr>
-        <w:t xml:space="preserve">Código </w:t>
-      </w:r>
-      <w:proofErr w:type="spellStart"/>
-      <w:r>
-        <w:rPr>
-          <w:rFonts w:ascii="Times New Roman" w:eastAsia="Times New Roman" w:hAnsi="Times New Roman" w:cs="Times New Roman"/>
-          <w:sz w:val="24"/>
-          <w:szCs w:val="24"/>
-          <w:lang w:eastAsia="es-419"/>
-        </w:rPr>
-        <w:t>backend</w:t>
-      </w:r>
-      <w:proofErr w:type="spellEnd"/>
-      <w:r>
-        <w:rPr>
-          <w:rFonts w:ascii="Times New Roman" w:eastAsia="Times New Roman" w:hAnsi="Times New Roman" w:cs="Times New Roman"/>
-          <w:sz w:val="24"/>
-          <w:szCs w:val="24"/>
-          <w:lang w:eastAsia="es-419"/>
-        </w:rPr>
-        <w:t xml:space="preserve"> (Node.js)</w:t>
+        <w:t>Código backend (Node.js)</w:t>
       </w:r>
     </w:p>
     <w:p>
@@ -6134,47 +5368,7 @@
           <w:szCs w:val="24"/>
           <w:lang w:eastAsia="es-419"/>
         </w:rPr>
-        <w:t xml:space="preserve">Código </w:t>
-      </w:r>
-      <w:proofErr w:type="spellStart"/>
-      <w:r>
-        <w:rPr>
-          <w:rFonts w:ascii="Times New Roman" w:eastAsia="Times New Roman" w:hAnsi="Times New Roman" w:cs="Times New Roman"/>
-          <w:sz w:val="24"/>
-          <w:szCs w:val="24"/>
-          <w:lang w:eastAsia="es-419"/>
-        </w:rPr>
-        <w:t>frontend</w:t>
-      </w:r>
-      <w:proofErr w:type="spellEnd"/>
-      <w:r>
-        <w:rPr>
-          <w:rFonts w:ascii="Times New Roman" w:eastAsia="Times New Roman" w:hAnsi="Times New Roman" w:cs="Times New Roman"/>
-          <w:sz w:val="24"/>
-          <w:szCs w:val="24"/>
-          <w:lang w:eastAsia="es-419"/>
-        </w:rPr>
-        <w:t xml:space="preserve"> (</w:t>
-      </w:r>
-      <w:proofErr w:type="spellStart"/>
-      <w:r>
-        <w:rPr>
-          <w:rFonts w:ascii="Times New Roman" w:eastAsia="Times New Roman" w:hAnsi="Times New Roman" w:cs="Times New Roman"/>
-          <w:sz w:val="24"/>
-          <w:szCs w:val="24"/>
-          <w:lang w:eastAsia="es-419"/>
-        </w:rPr>
-        <w:t>React</w:t>
-      </w:r>
-      <w:proofErr w:type="spellEnd"/>
-      <w:r>
-        <w:rPr>
-          <w:rFonts w:ascii="Times New Roman" w:eastAsia="Times New Roman" w:hAnsi="Times New Roman" w:cs="Times New Roman"/>
-          <w:sz w:val="24"/>
-          <w:szCs w:val="24"/>
-          <w:lang w:eastAsia="es-419"/>
-        </w:rPr>
-        <w:t>)</w:t>
+        <w:t>Código frontend (React)</w:t>
       </w:r>
     </w:p>
     <w:p>
@@ -6191,45 +5385,14 @@
           <w:lang w:eastAsia="es-419"/>
         </w:rPr>
       </w:pPr>
-      <w:proofErr w:type="spellStart"/>
-      <w:r>
-        <w:rPr>
-          <w:rFonts w:ascii="Times New Roman" w:eastAsia="Times New Roman" w:hAnsi="Times New Roman" w:cs="Times New Roman"/>
-          <w:sz w:val="24"/>
-          <w:szCs w:val="24"/>
-          <w:lang w:eastAsia="es-419"/>
-        </w:rPr>
-        <w:t>Versionamiento</w:t>
-      </w:r>
-      <w:proofErr w:type="spellEnd"/>
-      <w:r>
-        <w:rPr>
-          <w:rFonts w:ascii="Times New Roman" w:eastAsia="Times New Roman" w:hAnsi="Times New Roman" w:cs="Times New Roman"/>
-          <w:sz w:val="24"/>
-          <w:szCs w:val="24"/>
-          <w:lang w:eastAsia="es-419"/>
-        </w:rPr>
-        <w:t xml:space="preserve"> continuo mediante </w:t>
-      </w:r>
-      <w:proofErr w:type="spellStart"/>
-      <w:r>
-        <w:rPr>
-          <w:rFonts w:ascii="Times New Roman" w:eastAsia="Times New Roman" w:hAnsi="Times New Roman" w:cs="Times New Roman"/>
-          <w:sz w:val="24"/>
-          <w:szCs w:val="24"/>
-          <w:lang w:eastAsia="es-419"/>
-        </w:rPr>
-        <w:t>commits</w:t>
-      </w:r>
-      <w:proofErr w:type="spellEnd"/>
-      <w:r>
-        <w:rPr>
-          <w:rFonts w:ascii="Times New Roman" w:eastAsia="Times New Roman" w:hAnsi="Times New Roman" w:cs="Times New Roman"/>
-          <w:sz w:val="24"/>
-          <w:szCs w:val="24"/>
-          <w:lang w:eastAsia="es-419"/>
-        </w:rPr>
-        <w:t>.</w:t>
+      <w:r>
+        <w:rPr>
+          <w:rFonts w:ascii="Times New Roman" w:eastAsia="Times New Roman" w:hAnsi="Times New Roman" w:cs="Times New Roman"/>
+          <w:sz w:val="24"/>
+          <w:szCs w:val="24"/>
+          <w:lang w:eastAsia="es-419"/>
+        </w:rPr>
+        <w:t>Versionamiento continuo mediante commits.</w:t>
       </w:r>
     </w:p>
     <w:p>
@@ -6320,7 +5483,6 @@
           <w:lang w:eastAsia="es-419"/>
         </w:rPr>
       </w:pPr>
-      <w:proofErr w:type="spellStart"/>
       <w:r>
         <w:rPr>
           <w:rFonts w:ascii="Courier New" w:eastAsia="Times New Roman" w:hAnsi="Courier New" w:cs="Courier New"/>
@@ -6328,40 +5490,8 @@
           <w:szCs w:val="20"/>
           <w:lang w:eastAsia="es-419"/>
         </w:rPr>
-        <w:t>git</w:t>
-      </w:r>
-      <w:proofErr w:type="spellEnd"/>
-      <w:r>
-        <w:rPr>
-          <w:rFonts w:ascii="Courier New" w:eastAsia="Times New Roman" w:hAnsi="Courier New" w:cs="Courier New"/>
-          <w:sz w:val="20"/>
-          <w:szCs w:val="20"/>
-          <w:lang w:eastAsia="es-419"/>
-        </w:rPr>
-        <w:t xml:space="preserve"> </w:t>
-      </w:r>
-      <w:proofErr w:type="spellStart"/>
-      <w:proofErr w:type="gramStart"/>
-      <w:r>
-        <w:rPr>
-          <w:rFonts w:ascii="Courier New" w:eastAsia="Times New Roman" w:hAnsi="Courier New" w:cs="Courier New"/>
-          <w:sz w:val="20"/>
-          <w:szCs w:val="20"/>
-          <w:lang w:eastAsia="es-419"/>
-        </w:rPr>
-        <w:t>add</w:t>
-      </w:r>
-      <w:proofErr w:type="spellEnd"/>
-      <w:r>
-        <w:rPr>
-          <w:rFonts w:ascii="Courier New" w:eastAsia="Times New Roman" w:hAnsi="Courier New" w:cs="Courier New"/>
-          <w:sz w:val="20"/>
-          <w:szCs w:val="20"/>
-          <w:lang w:eastAsia="es-419"/>
-        </w:rPr>
-        <w:t xml:space="preserve"> .</w:t>
-      </w:r>
-      <w:proofErr w:type="gramEnd"/>
+        <w:t>git add .</w:t>
+      </w:r>
     </w:p>
     <w:p>
       <w:pPr>
@@ -6415,7 +5545,6 @@
           <w:lang w:eastAsia="es-419"/>
         </w:rPr>
       </w:pPr>
-      <w:proofErr w:type="spellStart"/>
       <w:r>
         <w:rPr>
           <w:rFonts w:ascii="Courier New" w:eastAsia="Times New Roman" w:hAnsi="Courier New" w:cs="Courier New"/>
@@ -6423,37 +5552,7 @@
           <w:szCs w:val="20"/>
           <w:lang w:eastAsia="es-419"/>
         </w:rPr>
-        <w:t>git</w:t>
-      </w:r>
-      <w:proofErr w:type="spellEnd"/>
-      <w:r>
-        <w:rPr>
-          <w:rFonts w:ascii="Courier New" w:eastAsia="Times New Roman" w:hAnsi="Courier New" w:cs="Courier New"/>
-          <w:sz w:val="20"/>
-          <w:szCs w:val="20"/>
-          <w:lang w:eastAsia="es-419"/>
-        </w:rPr>
-        <w:t xml:space="preserve"> </w:t>
-      </w:r>
-      <w:proofErr w:type="spellStart"/>
-      <w:r>
-        <w:rPr>
-          <w:rFonts w:ascii="Courier New" w:eastAsia="Times New Roman" w:hAnsi="Courier New" w:cs="Courier New"/>
-          <w:sz w:val="20"/>
-          <w:szCs w:val="20"/>
-          <w:lang w:eastAsia="es-419"/>
-        </w:rPr>
-        <w:t>commit</w:t>
-      </w:r>
-      <w:proofErr w:type="spellEnd"/>
-      <w:r>
-        <w:rPr>
-          <w:rFonts w:ascii="Courier New" w:eastAsia="Times New Roman" w:hAnsi="Courier New" w:cs="Courier New"/>
-          <w:sz w:val="20"/>
-          <w:szCs w:val="20"/>
-          <w:lang w:eastAsia="es-419"/>
-        </w:rPr>
-        <w:t xml:space="preserve"> -m "Actualización del sistema"</w:t>
+        <w:t>git commit -m "Actualización del sistema"</w:t>
       </w:r>
     </w:p>
     <w:p>
@@ -6508,7 +5607,6 @@
           <w:lang w:eastAsia="es-419"/>
         </w:rPr>
       </w:pPr>
-      <w:proofErr w:type="spellStart"/>
       <w:r>
         <w:rPr>
           <w:rFonts w:ascii="Courier New" w:eastAsia="Times New Roman" w:hAnsi="Courier New" w:cs="Courier New"/>
@@ -6516,69 +5614,8 @@
           <w:szCs w:val="20"/>
           <w:lang w:eastAsia="es-419"/>
         </w:rPr>
-        <w:t>git</w:t>
-      </w:r>
-      <w:proofErr w:type="spellEnd"/>
-      <w:r>
-        <w:rPr>
-          <w:rFonts w:ascii="Courier New" w:eastAsia="Times New Roman" w:hAnsi="Courier New" w:cs="Courier New"/>
-          <w:sz w:val="20"/>
-          <w:szCs w:val="20"/>
-          <w:lang w:eastAsia="es-419"/>
-        </w:rPr>
-        <w:t xml:space="preserve"> </w:t>
-      </w:r>
-      <w:proofErr w:type="spellStart"/>
-      <w:r>
-        <w:rPr>
-          <w:rFonts w:ascii="Courier New" w:eastAsia="Times New Roman" w:hAnsi="Courier New" w:cs="Courier New"/>
-          <w:sz w:val="20"/>
-          <w:szCs w:val="20"/>
-          <w:lang w:eastAsia="es-419"/>
-        </w:rPr>
-        <w:t>push</w:t>
-      </w:r>
-      <w:proofErr w:type="spellEnd"/>
-      <w:r>
-        <w:rPr>
-          <w:rFonts w:ascii="Courier New" w:eastAsia="Times New Roman" w:hAnsi="Courier New" w:cs="Courier New"/>
-          <w:sz w:val="20"/>
-          <w:szCs w:val="20"/>
-          <w:lang w:eastAsia="es-419"/>
-        </w:rPr>
-        <w:t xml:space="preserve"> </w:t>
-      </w:r>
-      <w:proofErr w:type="spellStart"/>
-      <w:r>
-        <w:rPr>
-          <w:rFonts w:ascii="Courier New" w:eastAsia="Times New Roman" w:hAnsi="Courier New" w:cs="Courier New"/>
-          <w:sz w:val="20"/>
-          <w:szCs w:val="20"/>
-          <w:lang w:eastAsia="es-419"/>
-        </w:rPr>
-        <w:t>origin</w:t>
-      </w:r>
-      <w:proofErr w:type="spellEnd"/>
-      <w:r>
-        <w:rPr>
-          <w:rFonts w:ascii="Courier New" w:eastAsia="Times New Roman" w:hAnsi="Courier New" w:cs="Courier New"/>
-          <w:sz w:val="20"/>
-          <w:szCs w:val="20"/>
-          <w:lang w:eastAsia="es-419"/>
-        </w:rPr>
-        <w:t xml:space="preserve"> </w:t>
-      </w:r>
-      <w:proofErr w:type="spellStart"/>
-      <w:r>
-        <w:rPr>
-          <w:rFonts w:ascii="Courier New" w:eastAsia="Times New Roman" w:hAnsi="Courier New" w:cs="Courier New"/>
-          <w:sz w:val="20"/>
-          <w:szCs w:val="20"/>
-          <w:lang w:eastAsia="es-419"/>
-        </w:rPr>
-        <w:t>main</w:t>
-      </w:r>
-      <w:proofErr w:type="spellEnd"/>
+        <w:t>git push origin main</w:t>
+      </w:r>
     </w:p>
     <w:p>
       <w:pPr>
@@ -6681,27 +5718,7 @@
           <w:lang w:val="en-US" w:eastAsia="es-419"/>
         </w:rPr>
         <w:br/>
-        <w:t>git checkout &lt;</w:t>
-      </w:r>
-      <w:proofErr w:type="spellStart"/>
-      <w:r>
-        <w:rPr>
-          <w:rFonts w:ascii="Courier New" w:eastAsia="Times New Roman" w:hAnsi="Courier New" w:cs="Courier New"/>
-          <w:sz w:val="20"/>
-          <w:szCs w:val="20"/>
-          <w:lang w:val="en-US" w:eastAsia="es-419"/>
-        </w:rPr>
-        <w:t>id_version</w:t>
-      </w:r>
-      <w:proofErr w:type="spellEnd"/>
-      <w:r>
-        <w:rPr>
-          <w:rFonts w:ascii="Courier New" w:eastAsia="Times New Roman" w:hAnsi="Courier New" w:cs="Courier New"/>
-          <w:sz w:val="20"/>
-          <w:szCs w:val="20"/>
-          <w:lang w:val="en-US" w:eastAsia="es-419"/>
-        </w:rPr>
-        <w:t>&gt;</w:t>
+        <w:t>git checkout &lt;id_version&gt;</w:t>
       </w:r>
     </w:p>
     <w:p>
@@ -6939,27 +5956,7 @@
           <w:szCs w:val="24"/>
           <w:lang w:eastAsia="es-419"/>
         </w:rPr>
-        <w:t>Variables de entorno (.</w:t>
-      </w:r>
-      <w:proofErr w:type="spellStart"/>
-      <w:r>
-        <w:rPr>
-          <w:rFonts w:ascii="Times New Roman" w:eastAsia="Times New Roman" w:hAnsi="Times New Roman" w:cs="Times New Roman"/>
-          <w:sz w:val="24"/>
-          <w:szCs w:val="24"/>
-          <w:lang w:eastAsia="es-419"/>
-        </w:rPr>
-        <w:t>env</w:t>
-      </w:r>
-      <w:proofErr w:type="spellEnd"/>
-      <w:r>
-        <w:rPr>
-          <w:rFonts w:ascii="Times New Roman" w:eastAsia="Times New Roman" w:hAnsi="Times New Roman" w:cs="Times New Roman"/>
-          <w:sz w:val="24"/>
-          <w:szCs w:val="24"/>
-          <w:lang w:eastAsia="es-419"/>
-        </w:rPr>
-        <w:t>)</w:t>
+        <w:t>Variables de entorno (.env)</w:t>
       </w:r>
     </w:p>
     <w:p>
@@ -6983,27 +5980,7 @@
           <w:szCs w:val="24"/>
           <w:lang w:eastAsia="es-419"/>
         </w:rPr>
-        <w:t>Configuración del servidor (</w:t>
-      </w:r>
-      <w:proofErr w:type="spellStart"/>
-      <w:r>
-        <w:rPr>
-          <w:rFonts w:ascii="Times New Roman" w:eastAsia="Times New Roman" w:hAnsi="Times New Roman" w:cs="Times New Roman"/>
-          <w:sz w:val="24"/>
-          <w:szCs w:val="24"/>
-          <w:lang w:eastAsia="es-419"/>
-        </w:rPr>
-        <w:t>Nginx</w:t>
-      </w:r>
-      <w:proofErr w:type="spellEnd"/>
-      <w:r>
-        <w:rPr>
-          <w:rFonts w:ascii="Times New Roman" w:eastAsia="Times New Roman" w:hAnsi="Times New Roman" w:cs="Times New Roman"/>
-          <w:sz w:val="24"/>
-          <w:szCs w:val="24"/>
-          <w:lang w:eastAsia="es-419"/>
-        </w:rPr>
-        <w:t>)</w:t>
+        <w:t>Configuración del servidor (Nginx)</w:t>
       </w:r>
     </w:p>
     <w:p>
@@ -7488,25 +6465,14 @@
           <w:lang w:eastAsia="es-419"/>
         </w:rPr>
       </w:pPr>
-      <w:proofErr w:type="spellStart"/>
-      <w:r>
-        <w:rPr>
-          <w:rFonts w:ascii="Times New Roman" w:eastAsia="Times New Roman" w:hAnsi="Times New Roman" w:cs="Times New Roman"/>
-          <w:sz w:val="24"/>
-          <w:szCs w:val="24"/>
-          <w:lang w:eastAsia="es-419"/>
-        </w:rPr>
-        <w:t>Backups</w:t>
-      </w:r>
-      <w:proofErr w:type="spellEnd"/>
-      <w:r>
-        <w:rPr>
-          <w:rFonts w:ascii="Times New Roman" w:eastAsia="Times New Roman" w:hAnsi="Times New Roman" w:cs="Times New Roman"/>
-          <w:sz w:val="24"/>
-          <w:szCs w:val="24"/>
-          <w:lang w:eastAsia="es-419"/>
-        </w:rPr>
-        <w:t xml:space="preserve"> automáticos gestionados por el proveedor.</w:t>
+      <w:r>
+        <w:rPr>
+          <w:rFonts w:ascii="Times New Roman" w:eastAsia="Times New Roman" w:hAnsi="Times New Roman" w:cs="Times New Roman"/>
+          <w:sz w:val="24"/>
+          <w:szCs w:val="24"/>
+          <w:lang w:eastAsia="es-419"/>
+        </w:rPr>
+        <w:t>Backups automáticos gestionados por el proveedor.</w:t>
       </w:r>
     </w:p>
     <w:p>
@@ -7948,55 +6914,7 @@
           <w:szCs w:val="36"/>
           <w:lang w:eastAsia="es-419"/>
         </w:rPr>
-        <w:t>RTO (</w:t>
-      </w:r>
-      <w:proofErr w:type="spellStart"/>
-      <w:r>
-        <w:rPr>
-          <w:rFonts w:ascii="Times New Roman" w:eastAsia="Times New Roman" w:hAnsi="Times New Roman" w:cs="Times New Roman"/>
-          <w:b/>
-          <w:bCs/>
-          <w:sz w:val="36"/>
-          <w:szCs w:val="36"/>
-          <w:lang w:eastAsia="es-419"/>
-        </w:rPr>
-        <w:t>Recovery</w:t>
-      </w:r>
-      <w:proofErr w:type="spellEnd"/>
-      <w:r>
-        <w:rPr>
-          <w:rFonts w:ascii="Times New Roman" w:eastAsia="Times New Roman" w:hAnsi="Times New Roman" w:cs="Times New Roman"/>
-          <w:b/>
-          <w:bCs/>
-          <w:sz w:val="36"/>
-          <w:szCs w:val="36"/>
-          <w:lang w:eastAsia="es-419"/>
-        </w:rPr>
-        <w:t xml:space="preserve"> Time </w:t>
-      </w:r>
-      <w:proofErr w:type="spellStart"/>
-      <w:r>
-        <w:rPr>
-          <w:rFonts w:ascii="Times New Roman" w:eastAsia="Times New Roman" w:hAnsi="Times New Roman" w:cs="Times New Roman"/>
-          <w:b/>
-          <w:bCs/>
-          <w:sz w:val="36"/>
-          <w:szCs w:val="36"/>
-          <w:lang w:eastAsia="es-419"/>
-        </w:rPr>
-        <w:t>Objective</w:t>
-      </w:r>
-      <w:proofErr w:type="spellEnd"/>
-      <w:r>
-        <w:rPr>
-          <w:rFonts w:ascii="Times New Roman" w:eastAsia="Times New Roman" w:hAnsi="Times New Roman" w:cs="Times New Roman"/>
-          <w:b/>
-          <w:bCs/>
-          <w:sz w:val="36"/>
-          <w:szCs w:val="36"/>
-          <w:lang w:eastAsia="es-419"/>
-        </w:rPr>
-        <w:t>): 4 horas</w:t>
+        <w:t>RTO (Recovery Time Objective): 4 horas</w:t>
       </w:r>
     </w:p>
     <w:p>
@@ -8084,19 +7002,8 @@
           <w:szCs w:val="24"/>
           <w:lang w:eastAsia="es-419"/>
         </w:rPr>
-        <w:t xml:space="preserve">Configuración del </w:t>
-      </w:r>
-      <w:proofErr w:type="spellStart"/>
-      <w:r>
-        <w:rPr>
-          <w:rFonts w:ascii="Times New Roman" w:eastAsia="Times New Roman" w:hAnsi="Times New Roman" w:cs="Times New Roman"/>
-          <w:sz w:val="24"/>
-          <w:szCs w:val="24"/>
-          <w:lang w:eastAsia="es-419"/>
-        </w:rPr>
-        <w:t>backend</w:t>
-      </w:r>
-      <w:proofErr w:type="spellEnd"/>
+        <w:t>Configuración del backend</w:t>
+      </w:r>
     </w:p>
     <w:p>
       <w:pPr>
@@ -8119,19 +7026,8 @@
           <w:szCs w:val="24"/>
           <w:lang w:eastAsia="es-419"/>
         </w:rPr>
-        <w:t xml:space="preserve">Despliegue del </w:t>
-      </w:r>
-      <w:proofErr w:type="spellStart"/>
-      <w:r>
-        <w:rPr>
-          <w:rFonts w:ascii="Times New Roman" w:eastAsia="Times New Roman" w:hAnsi="Times New Roman" w:cs="Times New Roman"/>
-          <w:sz w:val="24"/>
-          <w:szCs w:val="24"/>
-          <w:lang w:eastAsia="es-419"/>
-        </w:rPr>
-        <w:t>frontend</w:t>
-      </w:r>
-      <w:proofErr w:type="spellEnd"/>
+        <w:t>Despliegue del frontend</w:t>
+      </w:r>
     </w:p>
     <w:p>
       <w:pPr>
@@ -8166,55 +7062,7 @@
           <w:szCs w:val="36"/>
           <w:lang w:eastAsia="es-419"/>
         </w:rPr>
-        <w:t>RPO (</w:t>
-      </w:r>
-      <w:proofErr w:type="spellStart"/>
-      <w:r>
-        <w:rPr>
-          <w:rFonts w:ascii="Times New Roman" w:eastAsia="Times New Roman" w:hAnsi="Times New Roman" w:cs="Times New Roman"/>
-          <w:b/>
-          <w:bCs/>
-          <w:sz w:val="36"/>
-          <w:szCs w:val="36"/>
-          <w:lang w:eastAsia="es-419"/>
-        </w:rPr>
-        <w:t>Recovery</w:t>
-      </w:r>
-      <w:proofErr w:type="spellEnd"/>
-      <w:r>
-        <w:rPr>
-          <w:rFonts w:ascii="Times New Roman" w:eastAsia="Times New Roman" w:hAnsi="Times New Roman" w:cs="Times New Roman"/>
-          <w:b/>
-          <w:bCs/>
-          <w:sz w:val="36"/>
-          <w:szCs w:val="36"/>
-          <w:lang w:eastAsia="es-419"/>
-        </w:rPr>
-        <w:t xml:space="preserve"> Point </w:t>
-      </w:r>
-      <w:proofErr w:type="spellStart"/>
-      <w:r>
-        <w:rPr>
-          <w:rFonts w:ascii="Times New Roman" w:eastAsia="Times New Roman" w:hAnsi="Times New Roman" w:cs="Times New Roman"/>
-          <w:b/>
-          <w:bCs/>
-          <w:sz w:val="36"/>
-          <w:szCs w:val="36"/>
-          <w:lang w:eastAsia="es-419"/>
-        </w:rPr>
-        <w:t>Objective</w:t>
-      </w:r>
-      <w:proofErr w:type="spellEnd"/>
-      <w:r>
-        <w:rPr>
-          <w:rFonts w:ascii="Times New Roman" w:eastAsia="Times New Roman" w:hAnsi="Times New Roman" w:cs="Times New Roman"/>
-          <w:b/>
-          <w:bCs/>
-          <w:sz w:val="36"/>
-          <w:szCs w:val="36"/>
-          <w:lang w:eastAsia="es-419"/>
-        </w:rPr>
-        <w:t>): 6 horas</w:t>
+        <w:t>RPO (Recovery Point Objective): 6 horas</w:t>
       </w:r>
     </w:p>
     <w:p>
@@ -8546,71 +7394,27 @@
           <w:szCs w:val="36"/>
           <w:lang w:eastAsia="es-419"/>
         </w:rPr>
-        <w:t xml:space="preserve">9.1 </w:t>
-      </w:r>
-      <w:proofErr w:type="spellStart"/>
-      <w:r>
-        <w:rPr>
-          <w:rFonts w:ascii="Times New Roman" w:eastAsia="Times New Roman" w:hAnsi="Times New Roman" w:cs="Times New Roman"/>
-          <w:b/>
-          <w:bCs/>
-          <w:sz w:val="36"/>
-          <w:szCs w:val="36"/>
-          <w:lang w:eastAsia="es-419"/>
-        </w:rPr>
-        <w:t>Backup</w:t>
-      </w:r>
-      <w:proofErr w:type="spellEnd"/>
-      <w:r>
-        <w:rPr>
-          <w:rFonts w:ascii="Times New Roman" w:eastAsia="Times New Roman" w:hAnsi="Times New Roman" w:cs="Times New Roman"/>
-          <w:b/>
-          <w:bCs/>
-          <w:sz w:val="36"/>
-          <w:szCs w:val="36"/>
-          <w:lang w:eastAsia="es-419"/>
-        </w:rPr>
-        <w:t xml:space="preserve"> Automático</w:t>
-      </w:r>
-    </w:p>
-    <w:p>
-      <w:pPr>
-        <w:spacing w:before="100" w:beforeAutospacing="1" w:after="100" w:afterAutospacing="1" w:line="240" w:lineRule="auto"/>
-        <w:rPr>
-          <w:rFonts w:ascii="Times New Roman" w:eastAsia="Times New Roman" w:hAnsi="Times New Roman" w:cs="Times New Roman"/>
-          <w:sz w:val="24"/>
-          <w:szCs w:val="24"/>
-          <w:lang w:eastAsia="es-419"/>
-        </w:rPr>
-      </w:pPr>
-      <w:r>
-        <w:rPr>
-          <w:rFonts w:ascii="Times New Roman" w:eastAsia="Times New Roman" w:hAnsi="Times New Roman" w:cs="Times New Roman"/>
-          <w:sz w:val="24"/>
-          <w:szCs w:val="24"/>
-          <w:lang w:eastAsia="es-419"/>
-        </w:rPr>
-        <w:t xml:space="preserve">El sistema utiliza </w:t>
-      </w:r>
-      <w:proofErr w:type="spellStart"/>
-      <w:r>
-        <w:rPr>
-          <w:rFonts w:ascii="Times New Roman" w:eastAsia="Times New Roman" w:hAnsi="Times New Roman" w:cs="Times New Roman"/>
-          <w:sz w:val="24"/>
-          <w:szCs w:val="24"/>
-          <w:lang w:eastAsia="es-419"/>
-        </w:rPr>
-        <w:t>backups</w:t>
-      </w:r>
-      <w:proofErr w:type="spellEnd"/>
-      <w:r>
-        <w:rPr>
-          <w:rFonts w:ascii="Times New Roman" w:eastAsia="Times New Roman" w:hAnsi="Times New Roman" w:cs="Times New Roman"/>
-          <w:sz w:val="24"/>
-          <w:szCs w:val="24"/>
-          <w:lang w:eastAsia="es-419"/>
-        </w:rPr>
-        <w:t xml:space="preserve"> automáticos proporcionados por Hostinger.</w:t>
+        <w:t>9.1 Backup Automático</w:t>
+      </w:r>
+    </w:p>
+    <w:p>
+      <w:pPr>
+        <w:spacing w:before="100" w:beforeAutospacing="1" w:after="100" w:afterAutospacing="1" w:line="240" w:lineRule="auto"/>
+        <w:rPr>
+          <w:rFonts w:ascii="Times New Roman" w:eastAsia="Times New Roman" w:hAnsi="Times New Roman" w:cs="Times New Roman"/>
+          <w:sz w:val="24"/>
+          <w:szCs w:val="24"/>
+          <w:lang w:eastAsia="es-419"/>
+        </w:rPr>
+      </w:pPr>
+      <w:r>
+        <w:rPr>
+          <w:rFonts w:ascii="Times New Roman" w:eastAsia="Times New Roman" w:hAnsi="Times New Roman" w:cs="Times New Roman"/>
+          <w:sz w:val="24"/>
+          <w:szCs w:val="24"/>
+          <w:lang w:eastAsia="es-419"/>
+        </w:rPr>
+        <w:t>El sistema utiliza backups automáticos proporcionados por Hostinger.</w:t>
       </w:r>
     </w:p>
     <w:p>
@@ -8683,27 +7487,7 @@
           <w:szCs w:val="24"/>
           <w:lang w:eastAsia="es-419"/>
         </w:rPr>
-        <w:t xml:space="preserve">Activar opción de </w:t>
-      </w:r>
-      <w:proofErr w:type="spellStart"/>
-      <w:r>
-        <w:rPr>
-          <w:rFonts w:ascii="Times New Roman" w:eastAsia="Times New Roman" w:hAnsi="Times New Roman" w:cs="Times New Roman"/>
-          <w:sz w:val="24"/>
-          <w:szCs w:val="24"/>
-          <w:lang w:eastAsia="es-419"/>
-        </w:rPr>
-        <w:t>backups</w:t>
-      </w:r>
-      <w:proofErr w:type="spellEnd"/>
-      <w:r>
-        <w:rPr>
-          <w:rFonts w:ascii="Times New Roman" w:eastAsia="Times New Roman" w:hAnsi="Times New Roman" w:cs="Times New Roman"/>
-          <w:sz w:val="24"/>
-          <w:szCs w:val="24"/>
-          <w:lang w:eastAsia="es-419"/>
-        </w:rPr>
-        <w:t xml:space="preserve"> automáticos.</w:t>
+        <w:t>Activar opción de backups automáticos.</w:t>
       </w:r>
     </w:p>
     <w:p>
@@ -8812,27 +7596,7 @@
           <w:szCs w:val="24"/>
           <w:lang w:eastAsia="es-419"/>
         </w:rPr>
-        <w:t xml:space="preserve">Revisar historial de </w:t>
-      </w:r>
-      <w:proofErr w:type="spellStart"/>
-      <w:r>
-        <w:rPr>
-          <w:rFonts w:ascii="Times New Roman" w:eastAsia="Times New Roman" w:hAnsi="Times New Roman" w:cs="Times New Roman"/>
-          <w:sz w:val="24"/>
-          <w:szCs w:val="24"/>
-          <w:lang w:eastAsia="es-419"/>
-        </w:rPr>
-        <w:t>backups</w:t>
-      </w:r>
-      <w:proofErr w:type="spellEnd"/>
-      <w:r>
-        <w:rPr>
-          <w:rFonts w:ascii="Times New Roman" w:eastAsia="Times New Roman" w:hAnsi="Times New Roman" w:cs="Times New Roman"/>
-          <w:sz w:val="24"/>
-          <w:szCs w:val="24"/>
-          <w:lang w:eastAsia="es-419"/>
-        </w:rPr>
-        <w:t>.</w:t>
+        <w:t>Revisar historial de backups.</w:t>
       </w:r>
     </w:p>
     <w:p>
@@ -9024,31 +7788,7 @@
           <w:szCs w:val="36"/>
           <w:lang w:eastAsia="es-419"/>
         </w:rPr>
-        <w:t xml:space="preserve">9.2 </w:t>
-      </w:r>
-      <w:proofErr w:type="spellStart"/>
-      <w:r>
-        <w:rPr>
-          <w:rFonts w:ascii="Times New Roman" w:eastAsia="Times New Roman" w:hAnsi="Times New Roman" w:cs="Times New Roman"/>
-          <w:b/>
-          <w:bCs/>
-          <w:sz w:val="36"/>
-          <w:szCs w:val="36"/>
-          <w:lang w:eastAsia="es-419"/>
-        </w:rPr>
-        <w:t>Backup</w:t>
-      </w:r>
-      <w:proofErr w:type="spellEnd"/>
-      <w:r>
-        <w:rPr>
-          <w:rFonts w:ascii="Times New Roman" w:eastAsia="Times New Roman" w:hAnsi="Times New Roman" w:cs="Times New Roman"/>
-          <w:b/>
-          <w:bCs/>
-          <w:sz w:val="36"/>
-          <w:szCs w:val="36"/>
-          <w:lang w:eastAsia="es-419"/>
-        </w:rPr>
-        <w:t xml:space="preserve"> Manual</w:t>
+        <w:t>9.2 Backup Manual</w:t>
       </w:r>
     </w:p>
     <w:p>
@@ -9184,7 +7924,6 @@
           <w:lang w:eastAsia="es-419"/>
         </w:rPr>
       </w:pPr>
-      <w:proofErr w:type="spellStart"/>
       <w:r>
         <w:rPr>
           <w:rFonts w:ascii="Courier New" w:eastAsia="Times New Roman" w:hAnsi="Courier New" w:cs="Courier New"/>
@@ -9192,69 +7931,8 @@
           <w:szCs w:val="20"/>
           <w:lang w:eastAsia="es-419"/>
         </w:rPr>
-        <w:t>mysqldump</w:t>
-      </w:r>
-      <w:proofErr w:type="spellEnd"/>
-      <w:r>
-        <w:rPr>
-          <w:rFonts w:ascii="Courier New" w:eastAsia="Times New Roman" w:hAnsi="Courier New" w:cs="Courier New"/>
-          <w:sz w:val="20"/>
-          <w:szCs w:val="20"/>
-          <w:lang w:eastAsia="es-419"/>
-        </w:rPr>
-        <w:t xml:space="preserve"> -u </w:t>
-      </w:r>
-      <w:proofErr w:type="spellStart"/>
-      <w:r>
-        <w:rPr>
-          <w:rFonts w:ascii="Courier New" w:eastAsia="Times New Roman" w:hAnsi="Courier New" w:cs="Courier New"/>
-          <w:sz w:val="20"/>
-          <w:szCs w:val="20"/>
-          <w:lang w:eastAsia="es-419"/>
-        </w:rPr>
-        <w:t>comunidad_usuario</w:t>
-      </w:r>
-      <w:proofErr w:type="spellEnd"/>
-      <w:r>
-        <w:rPr>
-          <w:rFonts w:ascii="Courier New" w:eastAsia="Times New Roman" w:hAnsi="Courier New" w:cs="Courier New"/>
-          <w:sz w:val="20"/>
-          <w:szCs w:val="20"/>
-          <w:lang w:eastAsia="es-419"/>
-        </w:rPr>
-        <w:t xml:space="preserve"> -p </w:t>
-      </w:r>
-      <w:proofErr w:type="spellStart"/>
-      <w:r>
-        <w:rPr>
-          <w:rFonts w:ascii="Courier New" w:eastAsia="Times New Roman" w:hAnsi="Courier New" w:cs="Courier New"/>
-          <w:sz w:val="20"/>
-          <w:szCs w:val="20"/>
-          <w:lang w:eastAsia="es-419"/>
-        </w:rPr>
-        <w:t>comunidadinteligente</w:t>
-      </w:r>
-      <w:proofErr w:type="spellEnd"/>
-      <w:r>
-        <w:rPr>
-          <w:rFonts w:ascii="Courier New" w:eastAsia="Times New Roman" w:hAnsi="Courier New" w:cs="Courier New"/>
-          <w:sz w:val="20"/>
-          <w:szCs w:val="20"/>
-          <w:lang w:eastAsia="es-419"/>
-        </w:rPr>
-        <w:t xml:space="preserve"> &gt; </w:t>
-      </w:r>
-      <w:proofErr w:type="spellStart"/>
-      <w:r>
-        <w:rPr>
-          <w:rFonts w:ascii="Courier New" w:eastAsia="Times New Roman" w:hAnsi="Courier New" w:cs="Courier New"/>
-          <w:sz w:val="20"/>
-          <w:szCs w:val="20"/>
-          <w:lang w:eastAsia="es-419"/>
-        </w:rPr>
-        <w:t>comunidadinteligente.sql</w:t>
-      </w:r>
-      <w:proofErr w:type="spellEnd"/>
+        <w:t>mysqldump -u comunidad_usuario -p comunidadinteligente &gt; comunidadinteligente.sql</w:t>
+      </w:r>
     </w:p>
     <w:p>
       <w:pPr>
@@ -9469,31 +8147,7 @@
           <w:szCs w:val="36"/>
           <w:lang w:eastAsia="es-419"/>
         </w:rPr>
-        <w:t xml:space="preserve">9.3 </w:t>
-      </w:r>
-      <w:proofErr w:type="spellStart"/>
-      <w:r>
-        <w:rPr>
-          <w:rFonts w:ascii="Times New Roman" w:eastAsia="Times New Roman" w:hAnsi="Times New Roman" w:cs="Times New Roman"/>
-          <w:b/>
-          <w:bCs/>
-          <w:sz w:val="36"/>
-          <w:szCs w:val="36"/>
-          <w:lang w:eastAsia="es-419"/>
-        </w:rPr>
-        <w:t>Backup</w:t>
-      </w:r>
-      <w:proofErr w:type="spellEnd"/>
-      <w:r>
-        <w:rPr>
-          <w:rFonts w:ascii="Times New Roman" w:eastAsia="Times New Roman" w:hAnsi="Times New Roman" w:cs="Times New Roman"/>
-          <w:b/>
-          <w:bCs/>
-          <w:sz w:val="36"/>
-          <w:szCs w:val="36"/>
-          <w:lang w:eastAsia="es-419"/>
-        </w:rPr>
-        <w:t xml:space="preserve"> del Sistema (Código Fuente)</w:t>
+        <w:t>9.3 Backup del Sistema (Código Fuente)</w:t>
       </w:r>
     </w:p>
     <w:p>
@@ -9540,7 +8194,6 @@
           <w:lang w:val="en-US" w:eastAsia="es-419"/>
         </w:rPr>
       </w:pPr>
-      <w:proofErr w:type="spellStart"/>
       <w:r>
         <w:rPr>
           <w:rFonts w:ascii="Times New Roman" w:eastAsia="Times New Roman" w:hAnsi="Times New Roman" w:cs="Times New Roman"/>
@@ -9551,19 +8204,7 @@
           <w:lang w:val="en-US" w:eastAsia="es-419"/>
         </w:rPr>
         <w:lastRenderedPageBreak/>
-        <w:t>Procedimiento</w:t>
-      </w:r>
-      <w:proofErr w:type="spellEnd"/>
-      <w:r>
-        <w:rPr>
-          <w:rFonts w:ascii="Times New Roman" w:eastAsia="Times New Roman" w:hAnsi="Times New Roman" w:cs="Times New Roman"/>
-          <w:b/>
-          <w:bCs/>
-          <w:sz w:val="27"/>
-          <w:szCs w:val="27"/>
-          <w:lang w:val="en-US" w:eastAsia="es-419"/>
-        </w:rPr>
-        <w:t>:</w:t>
+        <w:t>Procedimiento:</w:t>
       </w:r>
     </w:p>
     <w:p>
@@ -9601,9 +8242,8 @@
           <w:szCs w:val="20"/>
           <w:lang w:val="en-US" w:eastAsia="es-419"/>
         </w:rPr>
-        <w:t xml:space="preserve">git </w:t>
-      </w:r>
-      <w:proofErr w:type="gramStart"/>
+        <w:t>git add .</w:t>
+      </w:r>
       <w:r>
         <w:rPr>
           <w:rFonts w:ascii="Courier New" w:eastAsia="Times New Roman" w:hAnsi="Courier New" w:cs="Courier New"/>
@@ -9611,9 +8251,9 @@
           <w:szCs w:val="20"/>
           <w:lang w:val="en-US" w:eastAsia="es-419"/>
         </w:rPr>
-        <w:t>add .</w:t>
-      </w:r>
-      <w:proofErr w:type="gramEnd"/>
+        <w:br/>
+        <w:t>git commit -m "Backup del sistema"</w:t>
+      </w:r>
       <w:r>
         <w:rPr>
           <w:rFonts w:ascii="Courier New" w:eastAsia="Times New Roman" w:hAnsi="Courier New" w:cs="Courier New"/>
@@ -9622,36 +8262,6 @@
           <w:lang w:val="en-US" w:eastAsia="es-419"/>
         </w:rPr>
         <w:br/>
-        <w:t xml:space="preserve">git commit -m "Backup del </w:t>
-      </w:r>
-      <w:proofErr w:type="spellStart"/>
-      <w:r>
-        <w:rPr>
-          <w:rFonts w:ascii="Courier New" w:eastAsia="Times New Roman" w:hAnsi="Courier New" w:cs="Courier New"/>
-          <w:sz w:val="20"/>
-          <w:szCs w:val="20"/>
-          <w:lang w:val="en-US" w:eastAsia="es-419"/>
-        </w:rPr>
-        <w:t>sistema</w:t>
-      </w:r>
-      <w:proofErr w:type="spellEnd"/>
-      <w:r>
-        <w:rPr>
-          <w:rFonts w:ascii="Courier New" w:eastAsia="Times New Roman" w:hAnsi="Courier New" w:cs="Courier New"/>
-          <w:sz w:val="20"/>
-          <w:szCs w:val="20"/>
-          <w:lang w:val="en-US" w:eastAsia="es-419"/>
-        </w:rPr>
-        <w:t>"</w:t>
-      </w:r>
-      <w:r>
-        <w:rPr>
-          <w:rFonts w:ascii="Courier New" w:eastAsia="Times New Roman" w:hAnsi="Courier New" w:cs="Courier New"/>
-          <w:sz w:val="20"/>
-          <w:szCs w:val="20"/>
-          <w:lang w:val="en-US" w:eastAsia="es-419"/>
-        </w:rPr>
-        <w:br/>
         <w:t>git push origin main</w:t>
       </w:r>
     </w:p>
@@ -9736,27 +8346,7 @@
           <w:szCs w:val="24"/>
           <w:lang w:eastAsia="es-419"/>
         </w:rPr>
-        <w:t xml:space="preserve">Revisar historial de </w:t>
-      </w:r>
-      <w:proofErr w:type="spellStart"/>
-      <w:r>
-        <w:rPr>
-          <w:rFonts w:ascii="Times New Roman" w:eastAsia="Times New Roman" w:hAnsi="Times New Roman" w:cs="Times New Roman"/>
-          <w:sz w:val="24"/>
-          <w:szCs w:val="24"/>
-          <w:lang w:eastAsia="es-419"/>
-        </w:rPr>
-        <w:t>commits</w:t>
-      </w:r>
-      <w:proofErr w:type="spellEnd"/>
-      <w:r>
-        <w:rPr>
-          <w:rFonts w:ascii="Times New Roman" w:eastAsia="Times New Roman" w:hAnsi="Times New Roman" w:cs="Times New Roman"/>
-          <w:sz w:val="24"/>
-          <w:szCs w:val="24"/>
-          <w:lang w:eastAsia="es-419"/>
-        </w:rPr>
-        <w:t>.</w:t>
+        <w:t>Revisar historial de commits.</w:t>
       </w:r>
     </w:p>
     <w:p>
@@ -10063,47 +8653,7 @@
           <w:szCs w:val="24"/>
           <w:lang w:eastAsia="es-419"/>
         </w:rPr>
-        <w:t>Verificar disponibilidad del archivo de respaldo (.</w:t>
-      </w:r>
-      <w:proofErr w:type="spellStart"/>
-      <w:r>
-        <w:rPr>
-          <w:rFonts w:ascii="Times New Roman" w:eastAsia="Times New Roman" w:hAnsi="Times New Roman" w:cs="Times New Roman"/>
-          <w:sz w:val="24"/>
-          <w:szCs w:val="24"/>
-          <w:lang w:eastAsia="es-419"/>
-        </w:rPr>
-        <w:t>sql</w:t>
-      </w:r>
-      <w:proofErr w:type="spellEnd"/>
-      <w:r>
-        <w:rPr>
-          <w:rFonts w:ascii="Times New Roman" w:eastAsia="Times New Roman" w:hAnsi="Times New Roman" w:cs="Times New Roman"/>
-          <w:sz w:val="24"/>
-          <w:szCs w:val="24"/>
-          <w:lang w:eastAsia="es-419"/>
-        </w:rPr>
-        <w:t xml:space="preserve"> o </w:t>
-      </w:r>
-      <w:proofErr w:type="spellStart"/>
-      <w:r>
-        <w:rPr>
-          <w:rFonts w:ascii="Times New Roman" w:eastAsia="Times New Roman" w:hAnsi="Times New Roman" w:cs="Times New Roman"/>
-          <w:sz w:val="24"/>
-          <w:szCs w:val="24"/>
-          <w:lang w:eastAsia="es-419"/>
-        </w:rPr>
-        <w:t>backup</w:t>
-      </w:r>
-      <w:proofErr w:type="spellEnd"/>
-      <w:r>
-        <w:rPr>
-          <w:rFonts w:ascii="Times New Roman" w:eastAsia="Times New Roman" w:hAnsi="Times New Roman" w:cs="Times New Roman"/>
-          <w:sz w:val="24"/>
-          <w:szCs w:val="24"/>
-          <w:lang w:eastAsia="es-419"/>
-        </w:rPr>
-        <w:t xml:space="preserve"> automático).</w:t>
+        <w:t>Verificar disponibilidad del archivo de respaldo (.sql o backup automático).</w:t>
       </w:r>
     </w:p>
     <w:p>
@@ -10398,7 +8948,6 @@
         </w:rPr>
         <w:t xml:space="preserve">CREATE DATABASE </w:t>
       </w:r>
-      <w:proofErr w:type="spellStart"/>
       <w:r>
         <w:rPr>
           <w:rFonts w:ascii="Courier New" w:eastAsia="Times New Roman" w:hAnsi="Courier New" w:cs="Courier New"/>
@@ -10408,7 +8957,6 @@
         </w:rPr>
         <w:t>comunidadinteligente</w:t>
       </w:r>
-      <w:proofErr w:type="spellEnd"/>
       <w:r>
         <w:rPr>
           <w:rFonts w:ascii="Courier New" w:eastAsia="Times New Roman" w:hAnsi="Courier New" w:cs="Courier New"/>
@@ -10483,7 +9031,6 @@
         </w:rPr>
         <w:t xml:space="preserve">USE </w:t>
       </w:r>
-      <w:proofErr w:type="spellStart"/>
       <w:r>
         <w:rPr>
           <w:rFonts w:ascii="Courier New" w:eastAsia="Times New Roman" w:hAnsi="Courier New" w:cs="Courier New"/>
@@ -10493,7 +9040,6 @@
         </w:rPr>
         <w:t>comunidadinteligente</w:t>
       </w:r>
-      <w:proofErr w:type="spellEnd"/>
       <w:r>
         <w:rPr>
           <w:rFonts w:ascii="Courier New" w:eastAsia="Times New Roman" w:hAnsi="Courier New" w:cs="Courier New"/>
@@ -10527,21 +9073,8 @@
           <w:szCs w:val="24"/>
           <w:lang w:eastAsia="es-419"/>
         </w:rPr>
-        <w:t xml:space="preserve">Ejecutar la restauración desde el archivo </w:t>
-      </w:r>
-      <w:proofErr w:type="spellStart"/>
-      <w:r>
-        <w:rPr>
-          <w:rFonts w:ascii="Times New Roman" w:eastAsia="Times New Roman" w:hAnsi="Times New Roman" w:cs="Times New Roman"/>
-          <w:b/>
-          <w:bCs/>
-          <w:sz w:val="24"/>
-          <w:szCs w:val="24"/>
-          <w:lang w:eastAsia="es-419"/>
-        </w:rPr>
-        <w:t>backup</w:t>
-      </w:r>
-      <w:proofErr w:type="spellEnd"/>
+        <w:t>Ejecutar la restauración desde el archivo backup</w:t>
+      </w:r>
     </w:p>
     <w:p>
       <w:pPr>
@@ -10572,7 +9105,6 @@
           <w:lang w:eastAsia="es-419"/>
         </w:rPr>
       </w:pPr>
-      <w:proofErr w:type="spellStart"/>
       <w:r>
         <w:rPr>
           <w:rFonts w:ascii="Courier New" w:eastAsia="Times New Roman" w:hAnsi="Courier New" w:cs="Courier New"/>
@@ -10580,9 +9112,8 @@
           <w:szCs w:val="20"/>
           <w:lang w:eastAsia="es-419"/>
         </w:rPr>
-        <w:t>mysql</w:t>
-      </w:r>
-      <w:proofErr w:type="spellEnd"/>
+        <w:t xml:space="preserve">mysql -u </w:t>
+      </w:r>
       <w:r>
         <w:rPr>
           <w:rFonts w:ascii="Courier New" w:eastAsia="Times New Roman" w:hAnsi="Courier New" w:cs="Courier New"/>
@@ -10590,9 +9121,8 @@
           <w:szCs w:val="20"/>
           <w:lang w:eastAsia="es-419"/>
         </w:rPr>
-        <w:t xml:space="preserve"> -u </w:t>
-      </w:r>
-      <w:proofErr w:type="spellStart"/>
+        <w:t>comunidad_</w:t>
+      </w:r>
       <w:r>
         <w:rPr>
           <w:rFonts w:ascii="Courier New" w:eastAsia="Times New Roman" w:hAnsi="Courier New" w:cs="Courier New"/>
@@ -10600,7 +9130,7 @@
           <w:szCs w:val="20"/>
           <w:lang w:eastAsia="es-419"/>
         </w:rPr>
-        <w:t>comunidad_</w:t>
+        <w:t xml:space="preserve">usuario -p </w:t>
       </w:r>
       <w:r>
         <w:rPr>
@@ -10609,9 +9139,8 @@
           <w:szCs w:val="20"/>
           <w:lang w:eastAsia="es-419"/>
         </w:rPr>
-        <w:t>usuario</w:t>
-      </w:r>
-      <w:proofErr w:type="spellEnd"/>
+        <w:t>comunidadinteligente</w:t>
+      </w:r>
       <w:r>
         <w:rPr>
           <w:rFonts w:ascii="Courier New" w:eastAsia="Times New Roman" w:hAnsi="Courier New" w:cs="Courier New"/>
@@ -10619,9 +9148,8 @@
           <w:szCs w:val="20"/>
           <w:lang w:eastAsia="es-419"/>
         </w:rPr>
-        <w:t xml:space="preserve"> -p </w:t>
-      </w:r>
-      <w:proofErr w:type="spellStart"/>
+        <w:t xml:space="preserve"> </w:t>
+      </w:r>
       <w:r>
         <w:rPr>
           <w:rFonts w:ascii="Courier New" w:eastAsia="Times New Roman" w:hAnsi="Courier New" w:cs="Courier New"/>
@@ -10629,9 +9157,8 @@
           <w:szCs w:val="20"/>
           <w:lang w:eastAsia="es-419"/>
         </w:rPr>
-        <w:t>comunidadinteligente</w:t>
-      </w:r>
-      <w:proofErr w:type="spellEnd"/>
+        <w:t xml:space="preserve">&lt; </w:t>
+      </w:r>
       <w:r>
         <w:rPr>
           <w:rFonts w:ascii="Courier New" w:eastAsia="Times New Roman" w:hAnsi="Courier New" w:cs="Courier New"/>
@@ -10639,7 +9166,7 @@
           <w:szCs w:val="20"/>
           <w:lang w:eastAsia="es-419"/>
         </w:rPr>
-        <w:t xml:space="preserve"> </w:t>
+        <w:t>comunidadinteligente</w:t>
       </w:r>
       <w:r>
         <w:rPr>
@@ -10648,28 +9175,8 @@
           <w:szCs w:val="20"/>
           <w:lang w:eastAsia="es-419"/>
         </w:rPr>
-        <w:t xml:space="preserve">&lt; </w:t>
-      </w:r>
-      <w:proofErr w:type="spellStart"/>
-      <w:r>
-        <w:rPr>
-          <w:rFonts w:ascii="Courier New" w:eastAsia="Times New Roman" w:hAnsi="Courier New" w:cs="Courier New"/>
-          <w:sz w:val="20"/>
-          <w:szCs w:val="20"/>
-          <w:lang w:eastAsia="es-419"/>
-        </w:rPr>
-        <w:t>comunidadinteligente</w:t>
-      </w:r>
-      <w:r>
-        <w:rPr>
-          <w:rFonts w:ascii="Courier New" w:eastAsia="Times New Roman" w:hAnsi="Courier New" w:cs="Courier New"/>
-          <w:sz w:val="20"/>
-          <w:szCs w:val="20"/>
-          <w:lang w:eastAsia="es-419"/>
-        </w:rPr>
         <w:t>.sql</w:t>
       </w:r>
-      <w:proofErr w:type="spellEnd"/>
     </w:p>
     <w:p>
       <w:pPr>
@@ -10897,7 +9404,6 @@
         </w:rPr>
         <w:t xml:space="preserve">Asegurarse de que las tablas usen motor </w:t>
       </w:r>
-      <w:proofErr w:type="spellStart"/>
       <w:r>
         <w:rPr>
           <w:rFonts w:ascii="Times New Roman" w:eastAsia="Times New Roman" w:hAnsi="Times New Roman" w:cs="Times New Roman"/>
@@ -10909,7 +9415,6 @@
         </w:rPr>
         <w:t>InnoDB</w:t>
       </w:r>
-      <w:proofErr w:type="spellEnd"/>
       <w:r>
         <w:rPr>
           <w:rFonts w:ascii="Times New Roman" w:eastAsia="Times New Roman" w:hAnsi="Times New Roman" w:cs="Times New Roman"/>
@@ -10965,27 +9470,7 @@
           <w:szCs w:val="24"/>
           <w:lang w:eastAsia="es-419"/>
         </w:rPr>
-        <w:t xml:space="preserve">Confirmar que los datos coincidan con el último </w:t>
-      </w:r>
-      <w:proofErr w:type="spellStart"/>
-      <w:r>
-        <w:rPr>
-          <w:rFonts w:ascii="Times New Roman" w:eastAsia="Times New Roman" w:hAnsi="Times New Roman" w:cs="Times New Roman"/>
-          <w:sz w:val="24"/>
-          <w:szCs w:val="24"/>
-          <w:lang w:eastAsia="es-419"/>
-        </w:rPr>
-        <w:t>backup</w:t>
-      </w:r>
-      <w:proofErr w:type="spellEnd"/>
-      <w:r>
-        <w:rPr>
-          <w:rFonts w:ascii="Times New Roman" w:eastAsia="Times New Roman" w:hAnsi="Times New Roman" w:cs="Times New Roman"/>
-          <w:sz w:val="24"/>
-          <w:szCs w:val="24"/>
-          <w:lang w:eastAsia="es-419"/>
-        </w:rPr>
-        <w:t>.</w:t>
+        <w:t>Confirmar que los datos coincidan con el último backup.</w:t>
       </w:r>
     </w:p>
     <w:p>
@@ -11021,31 +9506,7 @@
           <w:szCs w:val="36"/>
           <w:lang w:eastAsia="es-419"/>
         </w:rPr>
-        <w:t xml:space="preserve">10.2 Restauración del </w:t>
-      </w:r>
-      <w:proofErr w:type="spellStart"/>
-      <w:r>
-        <w:rPr>
-          <w:rFonts w:ascii="Times New Roman" w:eastAsia="Times New Roman" w:hAnsi="Times New Roman" w:cs="Times New Roman"/>
-          <w:b/>
-          <w:bCs/>
-          <w:sz w:val="36"/>
-          <w:szCs w:val="36"/>
-          <w:lang w:eastAsia="es-419"/>
-        </w:rPr>
-        <w:t>Backend</w:t>
-      </w:r>
-      <w:proofErr w:type="spellEnd"/>
-      <w:r>
-        <w:rPr>
-          <w:rFonts w:ascii="Times New Roman" w:eastAsia="Times New Roman" w:hAnsi="Times New Roman" w:cs="Times New Roman"/>
-          <w:b/>
-          <w:bCs/>
-          <w:sz w:val="36"/>
-          <w:szCs w:val="36"/>
-          <w:lang w:eastAsia="es-419"/>
-        </w:rPr>
-        <w:t xml:space="preserve"> (Node.js)</w:t>
+        <w:t>10.2 Restauración del Backend (Node.js)</w:t>
       </w:r>
     </w:p>
     <w:p>
@@ -11066,27 +9527,7 @@
           <w:lang w:eastAsia="es-419"/>
         </w:rPr>
         <w:lastRenderedPageBreak/>
-        <w:t xml:space="preserve">El </w:t>
-      </w:r>
-      <w:proofErr w:type="spellStart"/>
-      <w:r>
-        <w:rPr>
-          <w:rFonts w:ascii="Times New Roman" w:eastAsia="Times New Roman" w:hAnsi="Times New Roman" w:cs="Times New Roman"/>
-          <w:sz w:val="24"/>
-          <w:szCs w:val="24"/>
-          <w:lang w:eastAsia="es-419"/>
-        </w:rPr>
-        <w:t>backend</w:t>
-      </w:r>
-      <w:proofErr w:type="spellEnd"/>
-      <w:r>
-        <w:rPr>
-          <w:rFonts w:ascii="Times New Roman" w:eastAsia="Times New Roman" w:hAnsi="Times New Roman" w:cs="Times New Roman"/>
-          <w:sz w:val="24"/>
-          <w:szCs w:val="24"/>
-          <w:lang w:eastAsia="es-419"/>
-        </w:rPr>
-        <w:t xml:space="preserve"> contiene la lógica de negocio del sistema y permite la comunicación con la base de datos.</w:t>
+        <w:t>El backend contiene la lógica de negocio del sistema y permite la comunicación con la base de datos.</w:t>
       </w:r>
     </w:p>
     <w:p>
@@ -11201,21 +9642,8 @@
           <w:szCs w:val="24"/>
           <w:lang w:eastAsia="es-419"/>
         </w:rPr>
-        <w:t xml:space="preserve">Ingresar a la carpeta del </w:t>
-      </w:r>
-      <w:proofErr w:type="spellStart"/>
-      <w:r>
-        <w:rPr>
-          <w:rFonts w:ascii="Times New Roman" w:eastAsia="Times New Roman" w:hAnsi="Times New Roman" w:cs="Times New Roman"/>
-          <w:b/>
-          <w:bCs/>
-          <w:sz w:val="24"/>
-          <w:szCs w:val="24"/>
-          <w:lang w:eastAsia="es-419"/>
-        </w:rPr>
-        <w:t>backend</w:t>
-      </w:r>
-      <w:proofErr w:type="spellEnd"/>
+        <w:t>Ingresar a la carpeta del backend</w:t>
+      </w:r>
     </w:p>
     <w:p>
       <w:pPr>
@@ -11252,19 +9680,8 @@
           <w:szCs w:val="20"/>
           <w:lang w:eastAsia="es-419"/>
         </w:rPr>
-        <w:t xml:space="preserve">cd </w:t>
-      </w:r>
-      <w:proofErr w:type="spellStart"/>
-      <w:r>
-        <w:rPr>
-          <w:rFonts w:ascii="Courier New" w:eastAsia="Times New Roman" w:hAnsi="Courier New" w:cs="Courier New"/>
-          <w:sz w:val="20"/>
-          <w:szCs w:val="20"/>
-          <w:lang w:eastAsia="es-419"/>
-        </w:rPr>
-        <w:t>backend</w:t>
-      </w:r>
-      <w:proofErr w:type="spellEnd"/>
+        <w:t>cd backend</w:t>
+      </w:r>
     </w:p>
     <w:p>
       <w:pPr>
@@ -11320,7 +9737,6 @@
           <w:lang w:eastAsia="es-419"/>
         </w:rPr>
       </w:pPr>
-      <w:proofErr w:type="spellStart"/>
       <w:r>
         <w:rPr>
           <w:rFonts w:ascii="Courier New" w:eastAsia="Times New Roman" w:hAnsi="Courier New" w:cs="Courier New"/>
@@ -11328,29 +9744,8 @@
           <w:szCs w:val="20"/>
           <w:lang w:eastAsia="es-419"/>
         </w:rPr>
-        <w:t>npm</w:t>
-      </w:r>
-      <w:proofErr w:type="spellEnd"/>
-      <w:r>
-        <w:rPr>
-          <w:rFonts w:ascii="Courier New" w:eastAsia="Times New Roman" w:hAnsi="Courier New" w:cs="Courier New"/>
-          <w:sz w:val="20"/>
-          <w:szCs w:val="20"/>
-          <w:lang w:eastAsia="es-419"/>
-        </w:rPr>
-        <w:t xml:space="preserve"> </w:t>
-      </w:r>
-      <w:proofErr w:type="spellStart"/>
-      <w:r>
-        <w:rPr>
-          <w:rFonts w:ascii="Courier New" w:eastAsia="Times New Roman" w:hAnsi="Courier New" w:cs="Courier New"/>
-          <w:sz w:val="20"/>
-          <w:szCs w:val="20"/>
-          <w:lang w:eastAsia="es-419"/>
-        </w:rPr>
-        <w:t>install</w:t>
-      </w:r>
-      <w:proofErr w:type="spellEnd"/>
+        <w:t>npm install</w:t>
+      </w:r>
     </w:p>
     <w:p>
       <w:pPr>
@@ -11375,31 +9770,7 @@
           <w:szCs w:val="24"/>
           <w:lang w:eastAsia="es-419"/>
         </w:rPr>
-        <w:t>Configurar variables de entorno (.</w:t>
-      </w:r>
-      <w:proofErr w:type="spellStart"/>
-      <w:r>
-        <w:rPr>
-          <w:rFonts w:ascii="Times New Roman" w:eastAsia="Times New Roman" w:hAnsi="Times New Roman" w:cs="Times New Roman"/>
-          <w:b/>
-          <w:bCs/>
-          <w:sz w:val="24"/>
-          <w:szCs w:val="24"/>
-          <w:lang w:eastAsia="es-419"/>
-        </w:rPr>
-        <w:t>env</w:t>
-      </w:r>
-      <w:proofErr w:type="spellEnd"/>
-      <w:r>
-        <w:rPr>
-          <w:rFonts w:ascii="Times New Roman" w:eastAsia="Times New Roman" w:hAnsi="Times New Roman" w:cs="Times New Roman"/>
-          <w:b/>
-          <w:bCs/>
-          <w:sz w:val="24"/>
-          <w:szCs w:val="24"/>
-          <w:lang w:eastAsia="es-419"/>
-        </w:rPr>
-        <w:t>)</w:t>
+        <w:t>Configurar variables de entorno (.env)</w:t>
       </w:r>
       <w:r>
         <w:rPr>
@@ -11409,17 +9780,7 @@
           <w:lang w:eastAsia="es-419"/>
         </w:rPr>
         <w:br/>
-        <w:t xml:space="preserve">Crear o editar el </w:t>
-      </w:r>
-      <w:proofErr w:type="gramStart"/>
-      <w:r>
-        <w:rPr>
-          <w:rFonts w:ascii="Times New Roman" w:eastAsia="Times New Roman" w:hAnsi="Times New Roman" w:cs="Times New Roman"/>
-          <w:sz w:val="24"/>
-          <w:szCs w:val="24"/>
-          <w:lang w:eastAsia="es-419"/>
-        </w:rPr>
-        <w:t xml:space="preserve">archivo </w:t>
+        <w:t xml:space="preserve">Crear o editar el archivo </w:t>
       </w:r>
       <w:r>
         <w:rPr>
@@ -11428,20 +9789,8 @@
           <w:szCs w:val="20"/>
           <w:lang w:eastAsia="es-419"/>
         </w:rPr>
-        <w:t>.</w:t>
-      </w:r>
-      <w:proofErr w:type="spellStart"/>
-      <w:r>
-        <w:rPr>
-          <w:rFonts w:ascii="Courier New" w:eastAsia="Times New Roman" w:hAnsi="Courier New" w:cs="Courier New"/>
-          <w:sz w:val="20"/>
-          <w:szCs w:val="20"/>
-          <w:lang w:eastAsia="es-419"/>
-        </w:rPr>
-        <w:t>env</w:t>
-      </w:r>
-      <w:proofErr w:type="spellEnd"/>
-      <w:proofErr w:type="gramEnd"/>
+        <w:t>.env</w:t>
+      </w:r>
       <w:r>
         <w:rPr>
           <w:rFonts w:ascii="Times New Roman" w:eastAsia="Times New Roman" w:hAnsi="Times New Roman" w:cs="Times New Roman"/>
@@ -11477,7 +9826,7 @@
           <w:rFonts w:ascii="Courier New" w:eastAsia="Times New Roman" w:hAnsi="Courier New" w:cs="Courier New"/>
           <w:sz w:val="20"/>
           <w:szCs w:val="20"/>
-          <w:lang w:val="en-US" w:eastAsia="es-419"/>
+          <w:lang w:val="es-CO" w:eastAsia="es-419"/>
         </w:rPr>
       </w:pPr>
       <w:r>
@@ -11485,7 +9834,7 @@
           <w:rFonts w:ascii="Courier New" w:eastAsia="Times New Roman" w:hAnsi="Courier New" w:cs="Courier New"/>
           <w:sz w:val="20"/>
           <w:szCs w:val="20"/>
-          <w:lang w:val="en-US" w:eastAsia="es-419"/>
+          <w:lang w:val="es-CO" w:eastAsia="es-419"/>
         </w:rPr>
         <w:t>DB_HOST=localhost</w:t>
       </w:r>
@@ -11494,52 +9843,48 @@
           <w:rFonts w:ascii="Courier New" w:eastAsia="Times New Roman" w:hAnsi="Courier New" w:cs="Courier New"/>
           <w:sz w:val="20"/>
           <w:szCs w:val="20"/>
-          <w:lang w:val="en-US" w:eastAsia="es-419"/>
+          <w:lang w:val="es-CO" w:eastAsia="es-419"/>
         </w:rPr>
         <w:br/>
         <w:t>DB_USER=</w:t>
       </w:r>
-      <w:proofErr w:type="spellStart"/>
       <w:r>
         <w:rPr>
           <w:rFonts w:ascii="Courier New" w:eastAsia="Times New Roman" w:hAnsi="Courier New" w:cs="Courier New"/>
           <w:sz w:val="20"/>
           <w:szCs w:val="20"/>
-          <w:lang w:val="en-US" w:eastAsia="es-419"/>
+          <w:lang w:val="es-CO" w:eastAsia="es-419"/>
         </w:rPr>
         <w:t>comunidad_usuario</w:t>
       </w:r>
-      <w:proofErr w:type="spellEnd"/>
       <w:r>
         <w:rPr>
           <w:rFonts w:ascii="Courier New" w:eastAsia="Times New Roman" w:hAnsi="Courier New" w:cs="Courier New"/>
           <w:sz w:val="20"/>
           <w:szCs w:val="20"/>
-          <w:lang w:val="en-US" w:eastAsia="es-419"/>
+          <w:lang w:val="es-CO" w:eastAsia="es-419"/>
         </w:rPr>
         <w:br/>
-        <w:t>DB_PASSWORD=</w:t>
-      </w:r>
-      <w:proofErr w:type="spellStart"/>
+        <w:t>DB_PASSWORD=contraseña</w:t>
+      </w:r>
       <w:r>
         <w:rPr>
           <w:rFonts w:ascii="Courier New" w:eastAsia="Times New Roman" w:hAnsi="Courier New" w:cs="Courier New"/>
           <w:sz w:val="20"/>
           <w:szCs w:val="20"/>
-          <w:lang w:val="en-US" w:eastAsia="es-419"/>
-        </w:rPr>
-        <w:t>contraseña</w:t>
-      </w:r>
-      <w:proofErr w:type="spellEnd"/>
+          <w:lang w:val="es-CO" w:eastAsia="es-419"/>
+        </w:rPr>
+        <w:br/>
+        <w:t>DB_NAME=</w:t>
+      </w:r>
       <w:r>
         <w:rPr>
           <w:rFonts w:ascii="Courier New" w:eastAsia="Times New Roman" w:hAnsi="Courier New" w:cs="Courier New"/>
           <w:sz w:val="20"/>
           <w:szCs w:val="20"/>
-          <w:lang w:val="en-US" w:eastAsia="es-419"/>
-        </w:rPr>
-        <w:br/>
-        <w:t>DB_NAME=</w:t>
+          <w:lang w:eastAsia="es-419"/>
+        </w:rPr>
+        <w:t xml:space="preserve"> </w:t>
       </w:r>
       <w:r>
         <w:rPr>
@@ -11548,40 +9893,18 @@
           <w:szCs w:val="20"/>
           <w:lang w:eastAsia="es-419"/>
         </w:rPr>
-        <w:t xml:space="preserve"> </w:t>
-      </w:r>
-      <w:proofErr w:type="spellStart"/>
+        <w:t>comunidadinteligente</w:t>
+      </w:r>
       <w:r>
         <w:rPr>
           <w:rFonts w:ascii="Courier New" w:eastAsia="Times New Roman" w:hAnsi="Courier New" w:cs="Courier New"/>
           <w:sz w:val="20"/>
           <w:szCs w:val="20"/>
-          <w:lang w:eastAsia="es-419"/>
-        </w:rPr>
-        <w:t>comunidadinteligente</w:t>
-      </w:r>
-      <w:proofErr w:type="spellEnd"/>
-      <w:r>
-        <w:rPr>
-          <w:rFonts w:ascii="Courier New" w:eastAsia="Times New Roman" w:hAnsi="Courier New" w:cs="Courier New"/>
-          <w:sz w:val="20"/>
-          <w:szCs w:val="20"/>
-          <w:lang w:val="en-US" w:eastAsia="es-419"/>
+          <w:lang w:val="es-CO" w:eastAsia="es-419"/>
         </w:rPr>
         <w:br/>
-        <w:t>JWT_SECRET=</w:t>
-      </w:r>
-      <w:proofErr w:type="spellStart"/>
-      <w:r>
-        <w:rPr>
-          <w:rFonts w:ascii="Courier New" w:eastAsia="Times New Roman" w:hAnsi="Courier New" w:cs="Courier New"/>
-          <w:sz w:val="20"/>
-          <w:szCs w:val="20"/>
-          <w:lang w:val="en-US" w:eastAsia="es-419"/>
-        </w:rPr>
-        <w:t>clave_secreta</w:t>
-      </w:r>
-      <w:proofErr w:type="spellEnd"/>
+        <w:t>JWT_SECRET=clave_secreta</w:t>
+      </w:r>
     </w:p>
     <w:p>
       <w:pPr>
@@ -11661,7 +9984,6 @@
           <w:lang w:eastAsia="es-419"/>
         </w:rPr>
       </w:pPr>
-      <w:proofErr w:type="spellStart"/>
       <w:r>
         <w:rPr>
           <w:rFonts w:ascii="Courier New" w:eastAsia="Times New Roman" w:hAnsi="Courier New" w:cs="Courier New"/>
@@ -11669,29 +9991,8 @@
           <w:szCs w:val="20"/>
           <w:lang w:eastAsia="es-419"/>
         </w:rPr>
-        <w:t>npm</w:t>
-      </w:r>
-      <w:proofErr w:type="spellEnd"/>
-      <w:r>
-        <w:rPr>
-          <w:rFonts w:ascii="Courier New" w:eastAsia="Times New Roman" w:hAnsi="Courier New" w:cs="Courier New"/>
-          <w:sz w:val="20"/>
-          <w:szCs w:val="20"/>
-          <w:lang w:eastAsia="es-419"/>
-        </w:rPr>
-        <w:t xml:space="preserve"> run </w:t>
-      </w:r>
-      <w:proofErr w:type="spellStart"/>
-      <w:r>
-        <w:rPr>
-          <w:rFonts w:ascii="Courier New" w:eastAsia="Times New Roman" w:hAnsi="Courier New" w:cs="Courier New"/>
-          <w:sz w:val="20"/>
-          <w:szCs w:val="20"/>
-          <w:lang w:eastAsia="es-419"/>
-        </w:rPr>
-        <w:t>dev</w:t>
-      </w:r>
-      <w:proofErr w:type="spellEnd"/>
+        <w:t>npm run dev</w:t>
+      </w:r>
     </w:p>
     <w:p>
       <w:pPr>
@@ -11754,27 +10055,7 @@
           <w:szCs w:val="20"/>
           <w:lang w:eastAsia="es-419"/>
         </w:rPr>
-        <w:t xml:space="preserve">pm2 </w:t>
-      </w:r>
-      <w:proofErr w:type="spellStart"/>
-      <w:r>
-        <w:rPr>
-          <w:rFonts w:ascii="Courier New" w:eastAsia="Times New Roman" w:hAnsi="Courier New" w:cs="Courier New"/>
-          <w:sz w:val="20"/>
-          <w:szCs w:val="20"/>
-          <w:lang w:eastAsia="es-419"/>
-        </w:rPr>
-        <w:t>start</w:t>
-      </w:r>
-      <w:proofErr w:type="spellEnd"/>
-      <w:r>
-        <w:rPr>
-          <w:rFonts w:ascii="Courier New" w:eastAsia="Times New Roman" w:hAnsi="Courier New" w:cs="Courier New"/>
-          <w:sz w:val="20"/>
-          <w:szCs w:val="20"/>
-          <w:lang w:eastAsia="es-419"/>
-        </w:rPr>
-        <w:t xml:space="preserve"> app.js</w:t>
+        <w:t>pm2 start app.js</w:t>
       </w:r>
     </w:p>
     <w:p>
@@ -11887,47 +10168,7 @@
           <w:szCs w:val="24"/>
           <w:lang w:eastAsia="es-419"/>
         </w:rPr>
-        <w:t xml:space="preserve">Probar </w:t>
-      </w:r>
-      <w:proofErr w:type="spellStart"/>
-      <w:r>
-        <w:rPr>
-          <w:rFonts w:ascii="Times New Roman" w:eastAsia="Times New Roman" w:hAnsi="Times New Roman" w:cs="Times New Roman"/>
-          <w:sz w:val="24"/>
-          <w:szCs w:val="24"/>
-          <w:lang w:eastAsia="es-419"/>
-        </w:rPr>
-        <w:t>endpoints</w:t>
-      </w:r>
-      <w:proofErr w:type="spellEnd"/>
-      <w:r>
-        <w:rPr>
-          <w:rFonts w:ascii="Times New Roman" w:eastAsia="Times New Roman" w:hAnsi="Times New Roman" w:cs="Times New Roman"/>
-          <w:sz w:val="24"/>
-          <w:szCs w:val="24"/>
-          <w:lang w:eastAsia="es-419"/>
-        </w:rPr>
-        <w:t xml:space="preserve"> con </w:t>
-      </w:r>
-      <w:proofErr w:type="spellStart"/>
-      <w:r>
-        <w:rPr>
-          <w:rFonts w:ascii="Times New Roman" w:eastAsia="Times New Roman" w:hAnsi="Times New Roman" w:cs="Times New Roman"/>
-          <w:sz w:val="24"/>
-          <w:szCs w:val="24"/>
-          <w:lang w:eastAsia="es-419"/>
-        </w:rPr>
-        <w:t>Postman</w:t>
-      </w:r>
-      <w:proofErr w:type="spellEnd"/>
-      <w:r>
-        <w:rPr>
-          <w:rFonts w:ascii="Times New Roman" w:eastAsia="Times New Roman" w:hAnsi="Times New Roman" w:cs="Times New Roman"/>
-          <w:sz w:val="24"/>
-          <w:szCs w:val="24"/>
-          <w:lang w:eastAsia="es-419"/>
-        </w:rPr>
-        <w:t xml:space="preserve"> o navegador.</w:t>
+        <w:t>Probar endpoints con Postman o navegador.</w:t>
       </w:r>
     </w:p>
     <w:p>
@@ -12011,95 +10252,27 @@
           <w:szCs w:val="36"/>
           <w:lang w:eastAsia="es-419"/>
         </w:rPr>
-        <w:t xml:space="preserve">10.3 Restauración del </w:t>
-      </w:r>
-      <w:proofErr w:type="spellStart"/>
-      <w:r>
-        <w:rPr>
-          <w:rFonts w:ascii="Times New Roman" w:eastAsia="Times New Roman" w:hAnsi="Times New Roman" w:cs="Times New Roman"/>
-          <w:b/>
-          <w:bCs/>
-          <w:sz w:val="36"/>
-          <w:szCs w:val="36"/>
-          <w:lang w:eastAsia="es-419"/>
-        </w:rPr>
-        <w:t>Frontend</w:t>
-      </w:r>
-      <w:proofErr w:type="spellEnd"/>
-      <w:r>
-        <w:rPr>
-          <w:rFonts w:ascii="Times New Roman" w:eastAsia="Times New Roman" w:hAnsi="Times New Roman" w:cs="Times New Roman"/>
-          <w:b/>
-          <w:bCs/>
-          <w:sz w:val="36"/>
-          <w:szCs w:val="36"/>
-          <w:lang w:eastAsia="es-419"/>
-        </w:rPr>
-        <w:t xml:space="preserve"> (</w:t>
-      </w:r>
-      <w:proofErr w:type="spellStart"/>
-      <w:r>
-        <w:rPr>
-          <w:rFonts w:ascii="Times New Roman" w:eastAsia="Times New Roman" w:hAnsi="Times New Roman" w:cs="Times New Roman"/>
-          <w:b/>
-          <w:bCs/>
-          <w:sz w:val="36"/>
-          <w:szCs w:val="36"/>
-          <w:lang w:eastAsia="es-419"/>
-        </w:rPr>
-        <w:t>React</w:t>
-      </w:r>
-      <w:proofErr w:type="spellEnd"/>
-      <w:r>
-        <w:rPr>
-          <w:rFonts w:ascii="Times New Roman" w:eastAsia="Times New Roman" w:hAnsi="Times New Roman" w:cs="Times New Roman"/>
-          <w:b/>
-          <w:bCs/>
-          <w:sz w:val="36"/>
-          <w:szCs w:val="36"/>
-          <w:lang w:eastAsia="es-419"/>
-        </w:rPr>
-        <w:t>)</w:t>
-      </w:r>
-    </w:p>
-    <w:p>
-      <w:pPr>
-        <w:spacing w:before="100" w:beforeAutospacing="1" w:after="100" w:afterAutospacing="1" w:line="240" w:lineRule="auto"/>
-        <w:rPr>
-          <w:rFonts w:ascii="Times New Roman" w:eastAsia="Times New Roman" w:hAnsi="Times New Roman" w:cs="Times New Roman"/>
-          <w:sz w:val="24"/>
-          <w:szCs w:val="24"/>
-          <w:lang w:eastAsia="es-419"/>
-        </w:rPr>
-      </w:pPr>
-      <w:r>
-        <w:rPr>
-          <w:rFonts w:ascii="Times New Roman" w:eastAsia="Times New Roman" w:hAnsi="Times New Roman" w:cs="Times New Roman"/>
-          <w:sz w:val="24"/>
-          <w:szCs w:val="24"/>
-          <w:lang w:eastAsia="es-419"/>
-        </w:rPr>
-        <w:t xml:space="preserve">El </w:t>
-      </w:r>
-      <w:proofErr w:type="spellStart"/>
-      <w:r>
-        <w:rPr>
-          <w:rFonts w:ascii="Times New Roman" w:eastAsia="Times New Roman" w:hAnsi="Times New Roman" w:cs="Times New Roman"/>
-          <w:sz w:val="24"/>
-          <w:szCs w:val="24"/>
-          <w:lang w:eastAsia="es-419"/>
-        </w:rPr>
-        <w:t>frontend</w:t>
-      </w:r>
-      <w:proofErr w:type="spellEnd"/>
-      <w:r>
-        <w:rPr>
-          <w:rFonts w:ascii="Times New Roman" w:eastAsia="Times New Roman" w:hAnsi="Times New Roman" w:cs="Times New Roman"/>
-          <w:sz w:val="24"/>
-          <w:szCs w:val="24"/>
-          <w:lang w:eastAsia="es-419"/>
-        </w:rPr>
-        <w:t xml:space="preserve"> permite la interacción del usuario con el sistema.</w:t>
+        <w:t>10.3 Restauración del Frontend (React)</w:t>
+      </w:r>
+    </w:p>
+    <w:p>
+      <w:pPr>
+        <w:spacing w:before="100" w:beforeAutospacing="1" w:after="100" w:afterAutospacing="1" w:line="240" w:lineRule="auto"/>
+        <w:rPr>
+          <w:rFonts w:ascii="Times New Roman" w:eastAsia="Times New Roman" w:hAnsi="Times New Roman" w:cs="Times New Roman"/>
+          <w:sz w:val="24"/>
+          <w:szCs w:val="24"/>
+          <w:lang w:eastAsia="es-419"/>
+        </w:rPr>
+      </w:pPr>
+      <w:r>
+        <w:rPr>
+          <w:rFonts w:ascii="Times New Roman" w:eastAsia="Times New Roman" w:hAnsi="Times New Roman" w:cs="Times New Roman"/>
+          <w:sz w:val="24"/>
+          <w:szCs w:val="24"/>
+          <w:lang w:eastAsia="es-419"/>
+        </w:rPr>
+        <w:t>El frontend permite la interacción del usuario con el sistema.</w:t>
       </w:r>
     </w:p>
     <w:p>
@@ -12151,21 +10324,8 @@
           <w:szCs w:val="24"/>
           <w:lang w:eastAsia="es-419"/>
         </w:rPr>
-        <w:t xml:space="preserve">Acceder a la carpeta del </w:t>
-      </w:r>
-      <w:proofErr w:type="spellStart"/>
-      <w:r>
-        <w:rPr>
-          <w:rFonts w:ascii="Times New Roman" w:eastAsia="Times New Roman" w:hAnsi="Times New Roman" w:cs="Times New Roman"/>
-          <w:b/>
-          <w:bCs/>
-          <w:sz w:val="24"/>
-          <w:szCs w:val="24"/>
-          <w:lang w:eastAsia="es-419"/>
-        </w:rPr>
-        <w:t>frontend</w:t>
-      </w:r>
-      <w:proofErr w:type="spellEnd"/>
+        <w:t>Acceder a la carpeta del frontend</w:t>
+      </w:r>
     </w:p>
     <w:p>
       <w:pPr>
@@ -12202,19 +10362,8 @@
           <w:szCs w:val="20"/>
           <w:lang w:eastAsia="es-419"/>
         </w:rPr>
-        <w:t xml:space="preserve">cd </w:t>
-      </w:r>
-      <w:proofErr w:type="spellStart"/>
-      <w:r>
-        <w:rPr>
-          <w:rFonts w:ascii="Courier New" w:eastAsia="Times New Roman" w:hAnsi="Courier New" w:cs="Courier New"/>
-          <w:sz w:val="20"/>
-          <w:szCs w:val="20"/>
-          <w:lang w:eastAsia="es-419"/>
-        </w:rPr>
-        <w:t>frontend</w:t>
-      </w:r>
-      <w:proofErr w:type="spellEnd"/>
+        <w:t>cd frontend</w:t>
+      </w:r>
     </w:p>
     <w:p>
       <w:pPr>
@@ -12270,7 +10419,6 @@
           <w:lang w:eastAsia="es-419"/>
         </w:rPr>
       </w:pPr>
-      <w:proofErr w:type="spellStart"/>
       <w:r>
         <w:rPr>
           <w:rFonts w:ascii="Courier New" w:eastAsia="Times New Roman" w:hAnsi="Courier New" w:cs="Courier New"/>
@@ -12278,29 +10426,8 @@
           <w:szCs w:val="20"/>
           <w:lang w:eastAsia="es-419"/>
         </w:rPr>
-        <w:t>npm</w:t>
-      </w:r>
-      <w:proofErr w:type="spellEnd"/>
-      <w:r>
-        <w:rPr>
-          <w:rFonts w:ascii="Courier New" w:eastAsia="Times New Roman" w:hAnsi="Courier New" w:cs="Courier New"/>
-          <w:sz w:val="20"/>
-          <w:szCs w:val="20"/>
-          <w:lang w:eastAsia="es-419"/>
-        </w:rPr>
-        <w:t xml:space="preserve"> </w:t>
-      </w:r>
-      <w:proofErr w:type="spellStart"/>
-      <w:r>
-        <w:rPr>
-          <w:rFonts w:ascii="Courier New" w:eastAsia="Times New Roman" w:hAnsi="Courier New" w:cs="Courier New"/>
-          <w:sz w:val="20"/>
-          <w:szCs w:val="20"/>
-          <w:lang w:eastAsia="es-419"/>
-        </w:rPr>
-        <w:t>install</w:t>
-      </w:r>
-      <w:proofErr w:type="spellEnd"/>
+        <w:t>npm install</w:t>
+      </w:r>
     </w:p>
     <w:p>
       <w:pPr>
@@ -12431,31 +10558,7 @@
           <w:szCs w:val="24"/>
           <w:lang w:eastAsia="es-419"/>
         </w:rPr>
-        <w:t>Generar versión de producción (</w:t>
-      </w:r>
-      <w:proofErr w:type="spellStart"/>
-      <w:r>
-        <w:rPr>
-          <w:rFonts w:ascii="Times New Roman" w:eastAsia="Times New Roman" w:hAnsi="Times New Roman" w:cs="Times New Roman"/>
-          <w:b/>
-          <w:bCs/>
-          <w:sz w:val="24"/>
-          <w:szCs w:val="24"/>
-          <w:lang w:eastAsia="es-419"/>
-        </w:rPr>
-        <w:t>build</w:t>
-      </w:r>
-      <w:proofErr w:type="spellEnd"/>
-      <w:r>
-        <w:rPr>
-          <w:rFonts w:ascii="Times New Roman" w:eastAsia="Times New Roman" w:hAnsi="Times New Roman" w:cs="Times New Roman"/>
-          <w:b/>
-          <w:bCs/>
-          <w:sz w:val="24"/>
-          <w:szCs w:val="24"/>
-          <w:lang w:eastAsia="es-419"/>
-        </w:rPr>
-        <w:t>)</w:t>
+        <w:t>Generar versión de producción (build)</w:t>
       </w:r>
     </w:p>
     <w:p>
@@ -12486,7 +10589,6 @@
           <w:lang w:eastAsia="es-419"/>
         </w:rPr>
       </w:pPr>
-      <w:proofErr w:type="spellStart"/>
       <w:r>
         <w:rPr>
           <w:rFonts w:ascii="Courier New" w:eastAsia="Times New Roman" w:hAnsi="Courier New" w:cs="Courier New"/>
@@ -12494,29 +10596,8 @@
           <w:szCs w:val="20"/>
           <w:lang w:eastAsia="es-419"/>
         </w:rPr>
-        <w:t>npm</w:t>
-      </w:r>
-      <w:proofErr w:type="spellEnd"/>
-      <w:r>
-        <w:rPr>
-          <w:rFonts w:ascii="Courier New" w:eastAsia="Times New Roman" w:hAnsi="Courier New" w:cs="Courier New"/>
-          <w:sz w:val="20"/>
-          <w:szCs w:val="20"/>
-          <w:lang w:eastAsia="es-419"/>
-        </w:rPr>
-        <w:t xml:space="preserve"> run </w:t>
-      </w:r>
-      <w:proofErr w:type="spellStart"/>
-      <w:r>
-        <w:rPr>
-          <w:rFonts w:ascii="Courier New" w:eastAsia="Times New Roman" w:hAnsi="Courier New" w:cs="Courier New"/>
-          <w:sz w:val="20"/>
-          <w:szCs w:val="20"/>
-          <w:lang w:eastAsia="es-419"/>
-        </w:rPr>
-        <w:t>build</w:t>
-      </w:r>
-      <w:proofErr w:type="spellEnd"/>
+        <w:t>npm run build</w:t>
+      </w:r>
     </w:p>
     <w:p>
       <w:pPr>
@@ -12574,47 +10655,16 @@
           <w:szCs w:val="20"/>
           <w:lang w:eastAsia="es-419"/>
         </w:rPr>
-        <w:t>/</w:t>
-      </w:r>
-      <w:proofErr w:type="spellStart"/>
-      <w:r>
-        <w:rPr>
-          <w:rFonts w:ascii="Courier New" w:eastAsia="Times New Roman" w:hAnsi="Courier New" w:cs="Courier New"/>
-          <w:sz w:val="20"/>
-          <w:szCs w:val="20"/>
-          <w:lang w:eastAsia="es-419"/>
-        </w:rPr>
-        <w:t>dist</w:t>
-      </w:r>
-      <w:proofErr w:type="spellEnd"/>
-      <w:r>
-        <w:rPr>
-          <w:rFonts w:ascii="Times New Roman" w:eastAsia="Times New Roman" w:hAnsi="Times New Roman" w:cs="Times New Roman"/>
-          <w:sz w:val="24"/>
-          <w:szCs w:val="24"/>
-          <w:lang w:eastAsia="es-419"/>
-        </w:rPr>
-        <w:t xml:space="preserve"> al servidor web (</w:t>
-      </w:r>
-      <w:proofErr w:type="spellStart"/>
-      <w:r>
-        <w:rPr>
-          <w:rFonts w:ascii="Times New Roman" w:eastAsia="Times New Roman" w:hAnsi="Times New Roman" w:cs="Times New Roman"/>
-          <w:sz w:val="24"/>
-          <w:szCs w:val="24"/>
-          <w:lang w:eastAsia="es-419"/>
-        </w:rPr>
-        <w:t>Nginx</w:t>
-      </w:r>
-      <w:proofErr w:type="spellEnd"/>
-      <w:r>
-        <w:rPr>
-          <w:rFonts w:ascii="Times New Roman" w:eastAsia="Times New Roman" w:hAnsi="Times New Roman" w:cs="Times New Roman"/>
-          <w:sz w:val="24"/>
-          <w:szCs w:val="24"/>
-          <w:lang w:eastAsia="es-419"/>
-        </w:rPr>
-        <w:t>).</w:t>
+        <w:t>/dist</w:t>
+      </w:r>
+      <w:r>
+        <w:rPr>
+          <w:rFonts w:ascii="Times New Roman" w:eastAsia="Times New Roman" w:hAnsi="Times New Roman" w:cs="Times New Roman"/>
+          <w:sz w:val="24"/>
+          <w:szCs w:val="24"/>
+          <w:lang w:eastAsia="es-419"/>
+        </w:rPr>
+        <w:t xml:space="preserve"> al servidor web (Nginx).</w:t>
       </w:r>
     </w:p>
     <w:p>
@@ -12640,31 +10690,7 @@
           <w:szCs w:val="24"/>
           <w:lang w:eastAsia="es-419"/>
         </w:rPr>
-        <w:t xml:space="preserve">Configurar </w:t>
-      </w:r>
-      <w:proofErr w:type="spellStart"/>
-      <w:r>
-        <w:rPr>
-          <w:rFonts w:ascii="Times New Roman" w:eastAsia="Times New Roman" w:hAnsi="Times New Roman" w:cs="Times New Roman"/>
-          <w:b/>
-          <w:bCs/>
-          <w:sz w:val="24"/>
-          <w:szCs w:val="24"/>
-          <w:lang w:eastAsia="es-419"/>
-        </w:rPr>
-        <w:t>Nginx</w:t>
-      </w:r>
-      <w:proofErr w:type="spellEnd"/>
-      <w:r>
-        <w:rPr>
-          <w:rFonts w:ascii="Times New Roman" w:eastAsia="Times New Roman" w:hAnsi="Times New Roman" w:cs="Times New Roman"/>
-          <w:b/>
-          <w:bCs/>
-          <w:sz w:val="24"/>
-          <w:szCs w:val="24"/>
-          <w:lang w:eastAsia="es-419"/>
-        </w:rPr>
-        <w:t xml:space="preserve"> (si aplica)</w:t>
+        <w:t>Configurar Nginx (si aplica)</w:t>
       </w:r>
     </w:p>
     <w:p>
@@ -12688,47 +10714,7 @@
           <w:szCs w:val="24"/>
           <w:lang w:eastAsia="es-419"/>
         </w:rPr>
-        <w:t xml:space="preserve">Asegurar que apunte al </w:t>
-      </w:r>
-      <w:proofErr w:type="spellStart"/>
-      <w:r>
-        <w:rPr>
-          <w:rFonts w:ascii="Times New Roman" w:eastAsia="Times New Roman" w:hAnsi="Times New Roman" w:cs="Times New Roman"/>
-          <w:sz w:val="24"/>
-          <w:szCs w:val="24"/>
-          <w:lang w:eastAsia="es-419"/>
-        </w:rPr>
-        <w:t>build</w:t>
-      </w:r>
-      <w:proofErr w:type="spellEnd"/>
-      <w:r>
-        <w:rPr>
-          <w:rFonts w:ascii="Times New Roman" w:eastAsia="Times New Roman" w:hAnsi="Times New Roman" w:cs="Times New Roman"/>
-          <w:sz w:val="24"/>
-          <w:szCs w:val="24"/>
-          <w:lang w:eastAsia="es-419"/>
-        </w:rPr>
-        <w:t xml:space="preserve"> del </w:t>
-      </w:r>
-      <w:proofErr w:type="spellStart"/>
-      <w:r>
-        <w:rPr>
-          <w:rFonts w:ascii="Times New Roman" w:eastAsia="Times New Roman" w:hAnsi="Times New Roman" w:cs="Times New Roman"/>
-          <w:sz w:val="24"/>
-          <w:szCs w:val="24"/>
-          <w:lang w:eastAsia="es-419"/>
-        </w:rPr>
-        <w:t>frontend</w:t>
-      </w:r>
-      <w:proofErr w:type="spellEnd"/>
-      <w:r>
-        <w:rPr>
-          <w:rFonts w:ascii="Times New Roman" w:eastAsia="Times New Roman" w:hAnsi="Times New Roman" w:cs="Times New Roman"/>
-          <w:sz w:val="24"/>
-          <w:szCs w:val="24"/>
-          <w:lang w:eastAsia="es-419"/>
-        </w:rPr>
-        <w:t>.</w:t>
+        <w:t>Asegurar que apunte al build del frontend.</w:t>
       </w:r>
     </w:p>
     <w:p>
@@ -12792,59 +10778,8 @@
           <w:szCs w:val="20"/>
           <w:lang w:eastAsia="es-419"/>
         </w:rPr>
-        <w:t xml:space="preserve">sudo </w:t>
-      </w:r>
-      <w:proofErr w:type="spellStart"/>
-      <w:r>
-        <w:rPr>
-          <w:rFonts w:ascii="Courier New" w:eastAsia="Times New Roman" w:hAnsi="Courier New" w:cs="Courier New"/>
-          <w:sz w:val="20"/>
-          <w:szCs w:val="20"/>
-          <w:lang w:eastAsia="es-419"/>
-        </w:rPr>
-        <w:t>systemctl</w:t>
-      </w:r>
-      <w:proofErr w:type="spellEnd"/>
-      <w:r>
-        <w:rPr>
-          <w:rFonts w:ascii="Courier New" w:eastAsia="Times New Roman" w:hAnsi="Courier New" w:cs="Courier New"/>
-          <w:sz w:val="20"/>
-          <w:szCs w:val="20"/>
-          <w:lang w:eastAsia="es-419"/>
-        </w:rPr>
-        <w:t xml:space="preserve"> </w:t>
-      </w:r>
-      <w:proofErr w:type="spellStart"/>
-      <w:r>
-        <w:rPr>
-          <w:rFonts w:ascii="Courier New" w:eastAsia="Times New Roman" w:hAnsi="Courier New" w:cs="Courier New"/>
-          <w:sz w:val="20"/>
-          <w:szCs w:val="20"/>
-          <w:lang w:eastAsia="es-419"/>
-        </w:rPr>
-        <w:t>restart</w:t>
-      </w:r>
-      <w:proofErr w:type="spellEnd"/>
-      <w:r>
-        <w:rPr>
-          <w:rFonts w:ascii="Courier New" w:eastAsia="Times New Roman" w:hAnsi="Courier New" w:cs="Courier New"/>
-          <w:sz w:val="20"/>
-          <w:szCs w:val="20"/>
-          <w:lang w:eastAsia="es-419"/>
-        </w:rPr>
-        <w:t xml:space="preserve"> </w:t>
-      </w:r>
-      <w:proofErr w:type="spellStart"/>
-      <w:r>
-        <w:rPr>
-          <w:rFonts w:ascii="Courier New" w:eastAsia="Times New Roman" w:hAnsi="Courier New" w:cs="Courier New"/>
-          <w:sz w:val="20"/>
-          <w:szCs w:val="20"/>
-          <w:lang w:eastAsia="es-419"/>
-        </w:rPr>
-        <w:t>nginx</w:t>
-      </w:r>
-      <w:proofErr w:type="spellEnd"/>
+        <w:t>sudo systemctl restart nginx</w:t>
+      </w:r>
     </w:p>
     <w:p>
       <w:pPr>
@@ -12967,25 +10902,14 @@
           <w:lang w:eastAsia="es-419"/>
         </w:rPr>
       </w:pPr>
-      <w:proofErr w:type="spellStart"/>
-      <w:r>
-        <w:rPr>
-          <w:rFonts w:ascii="Times New Roman" w:eastAsia="Times New Roman" w:hAnsi="Times New Roman" w:cs="Times New Roman"/>
-          <w:sz w:val="24"/>
-          <w:szCs w:val="24"/>
-          <w:lang w:eastAsia="es-419"/>
-        </w:rPr>
-        <w:t>Login</w:t>
-      </w:r>
-      <w:proofErr w:type="spellEnd"/>
-      <w:r>
-        <w:rPr>
-          <w:rFonts w:ascii="Times New Roman" w:eastAsia="Times New Roman" w:hAnsi="Times New Roman" w:cs="Times New Roman"/>
-          <w:sz w:val="24"/>
-          <w:szCs w:val="24"/>
-          <w:lang w:eastAsia="es-419"/>
-        </w:rPr>
-        <w:t xml:space="preserve"> correcto de usuarios.</w:t>
+      <w:r>
+        <w:rPr>
+          <w:rFonts w:ascii="Times New Roman" w:eastAsia="Times New Roman" w:hAnsi="Times New Roman" w:cs="Times New Roman"/>
+          <w:sz w:val="24"/>
+          <w:szCs w:val="24"/>
+          <w:lang w:eastAsia="es-419"/>
+        </w:rPr>
+        <w:t>Login correcto de usuarios.</w:t>
       </w:r>
     </w:p>
     <w:p>
@@ -13208,27 +11132,7 @@
           <w:lang w:eastAsia="es-419"/>
         </w:rPr>
         <w:lastRenderedPageBreak/>
-        <w:t xml:space="preserve">Validar </w:t>
-      </w:r>
-      <w:proofErr w:type="spellStart"/>
-      <w:r>
-        <w:rPr>
-          <w:rFonts w:ascii="Times New Roman" w:eastAsia="Times New Roman" w:hAnsi="Times New Roman" w:cs="Times New Roman"/>
-          <w:sz w:val="24"/>
-          <w:szCs w:val="24"/>
-          <w:lang w:eastAsia="es-419"/>
-        </w:rPr>
-        <w:t>endpoints</w:t>
-      </w:r>
-      <w:proofErr w:type="spellEnd"/>
-      <w:r>
-        <w:rPr>
-          <w:rFonts w:ascii="Times New Roman" w:eastAsia="Times New Roman" w:hAnsi="Times New Roman" w:cs="Times New Roman"/>
-          <w:sz w:val="24"/>
-          <w:szCs w:val="24"/>
-          <w:lang w:eastAsia="es-419"/>
-        </w:rPr>
-        <w:t xml:space="preserve"> principales.</w:t>
+        <w:t>Validar endpoints principales.</w:t>
       </w:r>
     </w:p>
     <w:p>
@@ -13475,7 +11379,6 @@
         </w:rPr>
         <w:t xml:space="preserve">Instalar Node.js, </w:t>
       </w:r>
-      <w:proofErr w:type="spellStart"/>
       <w:r>
         <w:rPr>
           <w:rFonts w:ascii="Times New Roman" w:eastAsia="Times New Roman" w:hAnsi="Times New Roman" w:cs="Times New Roman"/>
@@ -13485,35 +11388,14 @@
         </w:rPr>
         <w:t>MariaDB</w:t>
       </w:r>
-      <w:proofErr w:type="spellEnd"/>
-      <w:r>
-        <w:rPr>
-          <w:rFonts w:ascii="Times New Roman" w:eastAsia="Times New Roman" w:hAnsi="Times New Roman" w:cs="Times New Roman"/>
-          <w:sz w:val="24"/>
-          <w:szCs w:val="24"/>
-          <w:lang w:eastAsia="es-419"/>
-        </w:rPr>
-        <w:t xml:space="preserve"> y </w:t>
-      </w:r>
-      <w:proofErr w:type="spellStart"/>
-      <w:r>
-        <w:rPr>
-          <w:rFonts w:ascii="Times New Roman" w:eastAsia="Times New Roman" w:hAnsi="Times New Roman" w:cs="Times New Roman"/>
-          <w:sz w:val="24"/>
-          <w:szCs w:val="24"/>
-          <w:lang w:eastAsia="es-419"/>
-        </w:rPr>
-        <w:t>Nginx</w:t>
-      </w:r>
-      <w:proofErr w:type="spellEnd"/>
-      <w:r>
-        <w:rPr>
-          <w:rFonts w:ascii="Times New Roman" w:eastAsia="Times New Roman" w:hAnsi="Times New Roman" w:cs="Times New Roman"/>
-          <w:sz w:val="24"/>
-          <w:szCs w:val="24"/>
-          <w:lang w:eastAsia="es-419"/>
-        </w:rPr>
-        <w:t>.</w:t>
+      <w:r>
+        <w:rPr>
+          <w:rFonts w:ascii="Times New Roman" w:eastAsia="Times New Roman" w:hAnsi="Times New Roman" w:cs="Times New Roman"/>
+          <w:sz w:val="24"/>
+          <w:szCs w:val="24"/>
+          <w:lang w:eastAsia="es-419"/>
+        </w:rPr>
+        <w:t xml:space="preserve"> y Nginx.</w:t>
       </w:r>
     </w:p>
     <w:p>
@@ -13561,47 +11443,7 @@
           <w:szCs w:val="24"/>
           <w:lang w:eastAsia="es-419"/>
         </w:rPr>
-        <w:t xml:space="preserve">Desplegar </w:t>
-      </w:r>
-      <w:proofErr w:type="spellStart"/>
-      <w:r>
-        <w:rPr>
-          <w:rFonts w:ascii="Times New Roman" w:eastAsia="Times New Roman" w:hAnsi="Times New Roman" w:cs="Times New Roman"/>
-          <w:sz w:val="24"/>
-          <w:szCs w:val="24"/>
-          <w:lang w:eastAsia="es-419"/>
-        </w:rPr>
-        <w:t>backend</w:t>
-      </w:r>
-      <w:proofErr w:type="spellEnd"/>
-      <w:r>
-        <w:rPr>
-          <w:rFonts w:ascii="Times New Roman" w:eastAsia="Times New Roman" w:hAnsi="Times New Roman" w:cs="Times New Roman"/>
-          <w:sz w:val="24"/>
-          <w:szCs w:val="24"/>
-          <w:lang w:eastAsia="es-419"/>
-        </w:rPr>
-        <w:t xml:space="preserve"> y </w:t>
-      </w:r>
-      <w:proofErr w:type="spellStart"/>
-      <w:r>
-        <w:rPr>
-          <w:rFonts w:ascii="Times New Roman" w:eastAsia="Times New Roman" w:hAnsi="Times New Roman" w:cs="Times New Roman"/>
-          <w:sz w:val="24"/>
-          <w:szCs w:val="24"/>
-          <w:lang w:eastAsia="es-419"/>
-        </w:rPr>
-        <w:t>frontend</w:t>
-      </w:r>
-      <w:proofErr w:type="spellEnd"/>
-      <w:r>
-        <w:rPr>
-          <w:rFonts w:ascii="Times New Roman" w:eastAsia="Times New Roman" w:hAnsi="Times New Roman" w:cs="Times New Roman"/>
-          <w:sz w:val="24"/>
-          <w:szCs w:val="24"/>
-          <w:lang w:eastAsia="es-419"/>
-        </w:rPr>
-        <w:t>.</w:t>
+        <w:t>Desplegar backend y frontend.</w:t>
       </w:r>
     </w:p>
     <w:p>
@@ -13714,27 +11556,7 @@
           <w:szCs w:val="24"/>
           <w:lang w:eastAsia="es-419"/>
         </w:rPr>
-        <w:t xml:space="preserve">Restaurar último </w:t>
-      </w:r>
-      <w:proofErr w:type="spellStart"/>
-      <w:r>
-        <w:rPr>
-          <w:rFonts w:ascii="Times New Roman" w:eastAsia="Times New Roman" w:hAnsi="Times New Roman" w:cs="Times New Roman"/>
-          <w:sz w:val="24"/>
-          <w:szCs w:val="24"/>
-          <w:lang w:eastAsia="es-419"/>
-        </w:rPr>
-        <w:t>backup</w:t>
-      </w:r>
-      <w:proofErr w:type="spellEnd"/>
-      <w:r>
-        <w:rPr>
-          <w:rFonts w:ascii="Times New Roman" w:eastAsia="Times New Roman" w:hAnsi="Times New Roman" w:cs="Times New Roman"/>
-          <w:sz w:val="24"/>
-          <w:szCs w:val="24"/>
-          <w:lang w:eastAsia="es-419"/>
-        </w:rPr>
-        <w:t xml:space="preserve"> disponible.</w:t>
+        <w:t>Restaurar último backup disponible.</w:t>
       </w:r>
     </w:p>
     <w:p>
@@ -13919,268 +11741,7 @@
           <w:szCs w:val="24"/>
           <w:lang w:eastAsia="es-419"/>
         </w:rPr>
-        <w:t xml:space="preserve">Uso de </w:t>
-      </w:r>
-      <w:proofErr w:type="spellStart"/>
-      <w:r>
-        <w:rPr>
-          <w:rFonts w:ascii="Times New Roman" w:eastAsia="Times New Roman" w:hAnsi="Times New Roman" w:cs="Times New Roman"/>
-          <w:sz w:val="24"/>
-          <w:szCs w:val="24"/>
-          <w:lang w:eastAsia="es-419"/>
-        </w:rPr>
-        <w:t>backup</w:t>
-      </w:r>
-      <w:proofErr w:type="spellEnd"/>
-      <w:r>
-        <w:rPr>
-          <w:rFonts w:ascii="Times New Roman" w:eastAsia="Times New Roman" w:hAnsi="Times New Roman" w:cs="Times New Roman"/>
-          <w:sz w:val="24"/>
-          <w:szCs w:val="24"/>
-          <w:lang w:eastAsia="es-419"/>
-        </w:rPr>
-        <w:t xml:space="preserve"> incremental.</w:t>
-      </w:r>
-    </w:p>
-    <w:p>
-      <w:pPr>
-        <w:spacing w:after="0" w:line="240" w:lineRule="auto"/>
-        <w:rPr>
-          <w:rFonts w:ascii="Times New Roman" w:eastAsia="Times New Roman" w:hAnsi="Times New Roman" w:cs="Times New Roman"/>
-          <w:sz w:val="24"/>
-          <w:szCs w:val="24"/>
-          <w:lang w:eastAsia="es-419"/>
-        </w:rPr>
-      </w:pPr>
-    </w:p>
-    <w:p>
-      <w:pPr>
-        <w:spacing w:before="100" w:beforeAutospacing="1" w:after="100" w:afterAutospacing="1" w:line="240" w:lineRule="auto"/>
-        <w:outlineLvl w:val="2"/>
-        <w:rPr>
-          <w:rFonts w:ascii="Times New Roman" w:eastAsia="Times New Roman" w:hAnsi="Times New Roman" w:cs="Times New Roman"/>
-          <w:b/>
-          <w:bCs/>
-          <w:sz w:val="27"/>
-          <w:szCs w:val="27"/>
-          <w:lang w:eastAsia="es-419"/>
-        </w:rPr>
-      </w:pPr>
-      <w:r>
-        <w:rPr>
-          <w:rFonts w:ascii="Times New Roman" w:eastAsia="Times New Roman" w:hAnsi="Times New Roman" w:cs="Times New Roman"/>
-          <w:b/>
-          <w:bCs/>
-          <w:sz w:val="27"/>
-          <w:szCs w:val="27"/>
-          <w:lang w:eastAsia="es-419"/>
-        </w:rPr>
-        <w:t>11.4 Problemas de despliegue</w:t>
-      </w:r>
-    </w:p>
-    <w:p>
-      <w:pPr>
-        <w:spacing w:before="100" w:beforeAutospacing="1" w:after="100" w:afterAutospacing="1" w:line="240" w:lineRule="auto"/>
-        <w:rPr>
-          <w:rFonts w:ascii="Times New Roman" w:eastAsia="Times New Roman" w:hAnsi="Times New Roman" w:cs="Times New Roman"/>
-          <w:sz w:val="24"/>
-          <w:szCs w:val="24"/>
-          <w:lang w:eastAsia="es-419"/>
-        </w:rPr>
-      </w:pPr>
-      <w:r>
-        <w:rPr>
-          <w:rFonts w:ascii="Times New Roman" w:eastAsia="Times New Roman" w:hAnsi="Times New Roman" w:cs="Times New Roman"/>
-          <w:b/>
-          <w:bCs/>
-          <w:sz w:val="24"/>
-          <w:szCs w:val="24"/>
-          <w:lang w:eastAsia="es-419"/>
-        </w:rPr>
-        <w:t>Causa:</w:t>
-      </w:r>
-      <w:r>
-        <w:rPr>
-          <w:rFonts w:ascii="Times New Roman" w:eastAsia="Times New Roman" w:hAnsi="Times New Roman" w:cs="Times New Roman"/>
-          <w:sz w:val="24"/>
-          <w:szCs w:val="24"/>
-          <w:lang w:eastAsia="es-419"/>
-        </w:rPr>
-        <w:t xml:space="preserve"> errores en actualización del sistema.</w:t>
-      </w:r>
-    </w:p>
-    <w:p>
-      <w:pPr>
-        <w:spacing w:before="100" w:beforeAutospacing="1" w:after="100" w:afterAutospacing="1" w:line="240" w:lineRule="auto"/>
-        <w:rPr>
-          <w:rFonts w:ascii="Times New Roman" w:eastAsia="Times New Roman" w:hAnsi="Times New Roman" w:cs="Times New Roman"/>
-          <w:sz w:val="24"/>
-          <w:szCs w:val="24"/>
-          <w:lang w:eastAsia="es-419"/>
-        </w:rPr>
-      </w:pPr>
-      <w:r>
-        <w:rPr>
-          <w:rFonts w:ascii="Times New Roman" w:eastAsia="Times New Roman" w:hAnsi="Times New Roman" w:cs="Times New Roman"/>
-          <w:b/>
-          <w:bCs/>
-          <w:sz w:val="24"/>
-          <w:szCs w:val="24"/>
-          <w:lang w:eastAsia="es-419"/>
-        </w:rPr>
-        <w:t>Solución:</w:t>
-      </w:r>
-    </w:p>
-    <w:p>
-      <w:pPr>
-        <w:numPr>
-          <w:ilvl w:val="0"/>
-          <w:numId w:val="61"/>
-        </w:numPr>
-        <w:spacing w:before="100" w:beforeAutospacing="1" w:after="100" w:afterAutospacing="1" w:line="240" w:lineRule="auto"/>
-        <w:rPr>
-          <w:rFonts w:ascii="Times New Roman" w:eastAsia="Times New Roman" w:hAnsi="Times New Roman" w:cs="Times New Roman"/>
-          <w:sz w:val="24"/>
-          <w:szCs w:val="24"/>
-          <w:lang w:eastAsia="es-419"/>
-        </w:rPr>
-      </w:pPr>
-      <w:r>
-        <w:rPr>
-          <w:rFonts w:ascii="Times New Roman" w:eastAsia="Times New Roman" w:hAnsi="Times New Roman" w:cs="Times New Roman"/>
-          <w:sz w:val="24"/>
-          <w:szCs w:val="24"/>
-          <w:lang w:eastAsia="es-419"/>
-        </w:rPr>
-        <w:t>Revertir versión desde GitHub:</w:t>
-      </w:r>
-    </w:p>
-    <w:p>
-      <w:pPr>
-        <w:tabs>
-          <w:tab w:val="left" w:pos="916"/>
-          <w:tab w:val="left" w:pos="1832"/>
-          <w:tab w:val="left" w:pos="2748"/>
-          <w:tab w:val="left" w:pos="3664"/>
-          <w:tab w:val="left" w:pos="4580"/>
-          <w:tab w:val="left" w:pos="5496"/>
-          <w:tab w:val="left" w:pos="6412"/>
-          <w:tab w:val="left" w:pos="7328"/>
-          <w:tab w:val="left" w:pos="8244"/>
-          <w:tab w:val="left" w:pos="9160"/>
-          <w:tab w:val="left" w:pos="10076"/>
-          <w:tab w:val="left" w:pos="10992"/>
-          <w:tab w:val="left" w:pos="11908"/>
-          <w:tab w:val="left" w:pos="12824"/>
-          <w:tab w:val="left" w:pos="13740"/>
-          <w:tab w:val="left" w:pos="14656"/>
-        </w:tabs>
-        <w:spacing w:after="0" w:line="240" w:lineRule="auto"/>
-        <w:rPr>
-          <w:rFonts w:ascii="Courier New" w:eastAsia="Times New Roman" w:hAnsi="Courier New" w:cs="Courier New"/>
-          <w:sz w:val="20"/>
-          <w:szCs w:val="20"/>
-          <w:lang w:eastAsia="es-419"/>
-        </w:rPr>
-      </w:pPr>
-      <w:proofErr w:type="spellStart"/>
-      <w:r>
-        <w:rPr>
-          <w:rFonts w:ascii="Courier New" w:eastAsia="Times New Roman" w:hAnsi="Courier New" w:cs="Courier New"/>
-          <w:sz w:val="20"/>
-          <w:szCs w:val="20"/>
-          <w:lang w:eastAsia="es-419"/>
-        </w:rPr>
-        <w:t>git</w:t>
-      </w:r>
-      <w:proofErr w:type="spellEnd"/>
-      <w:r>
-        <w:rPr>
-          <w:rFonts w:ascii="Courier New" w:eastAsia="Times New Roman" w:hAnsi="Courier New" w:cs="Courier New"/>
-          <w:sz w:val="20"/>
-          <w:szCs w:val="20"/>
-          <w:lang w:eastAsia="es-419"/>
-        </w:rPr>
-        <w:t xml:space="preserve"> </w:t>
-      </w:r>
-      <w:proofErr w:type="spellStart"/>
-      <w:r>
-        <w:rPr>
-          <w:rFonts w:ascii="Courier New" w:eastAsia="Times New Roman" w:hAnsi="Courier New" w:cs="Courier New"/>
-          <w:sz w:val="20"/>
-          <w:szCs w:val="20"/>
-          <w:lang w:eastAsia="es-419"/>
-        </w:rPr>
-        <w:t>checkout</w:t>
-      </w:r>
-      <w:proofErr w:type="spellEnd"/>
-      <w:r>
-        <w:rPr>
-          <w:rFonts w:ascii="Courier New" w:eastAsia="Times New Roman" w:hAnsi="Courier New" w:cs="Courier New"/>
-          <w:sz w:val="20"/>
-          <w:szCs w:val="20"/>
-          <w:lang w:eastAsia="es-419"/>
-        </w:rPr>
-        <w:t xml:space="preserve"> </w:t>
-      </w:r>
-      <w:proofErr w:type="spellStart"/>
-      <w:r>
-        <w:rPr>
-          <w:rFonts w:ascii="Courier New" w:eastAsia="Times New Roman" w:hAnsi="Courier New" w:cs="Courier New"/>
-          <w:sz w:val="20"/>
-          <w:szCs w:val="20"/>
-          <w:lang w:eastAsia="es-419"/>
-        </w:rPr>
-        <w:t>version_anterior</w:t>
-      </w:r>
-      <w:proofErr w:type="spellEnd"/>
-    </w:p>
-    <w:p>
-      <w:pPr>
-        <w:numPr>
-          <w:ilvl w:val="0"/>
-          <w:numId w:val="62"/>
-        </w:numPr>
-        <w:spacing w:before="100" w:beforeAutospacing="1" w:after="100" w:afterAutospacing="1" w:line="240" w:lineRule="auto"/>
-        <w:rPr>
-          <w:rFonts w:ascii="Times New Roman" w:eastAsia="Times New Roman" w:hAnsi="Times New Roman" w:cs="Times New Roman"/>
-          <w:sz w:val="24"/>
-          <w:szCs w:val="24"/>
-          <w:lang w:eastAsia="es-419"/>
-        </w:rPr>
-      </w:pPr>
-      <w:r>
-        <w:rPr>
-          <w:rFonts w:ascii="Times New Roman" w:eastAsia="Times New Roman" w:hAnsi="Times New Roman" w:cs="Times New Roman"/>
-          <w:sz w:val="24"/>
-          <w:szCs w:val="24"/>
-          <w:lang w:eastAsia="es-419"/>
-        </w:rPr>
-        <w:t>Reinstalar dependencias.</w:t>
-      </w:r>
-    </w:p>
-    <w:p>
-      <w:pPr>
-        <w:numPr>
-          <w:ilvl w:val="0"/>
-          <w:numId w:val="62"/>
-        </w:numPr>
-        <w:spacing w:before="100" w:beforeAutospacing="1" w:after="100" w:afterAutospacing="1" w:line="240" w:lineRule="auto"/>
-        <w:rPr>
-          <w:rFonts w:ascii="Times New Roman" w:eastAsia="Times New Roman" w:hAnsi="Times New Roman" w:cs="Times New Roman"/>
-          <w:sz w:val="24"/>
-          <w:szCs w:val="24"/>
-          <w:lang w:eastAsia="es-419"/>
-        </w:rPr>
-      </w:pPr>
-      <w:r>
-        <w:rPr>
-          <w:rFonts w:ascii="Times New Roman" w:eastAsia="Times New Roman" w:hAnsi="Times New Roman" w:cs="Times New Roman"/>
-          <w:sz w:val="24"/>
-          <w:szCs w:val="24"/>
-          <w:lang w:eastAsia="es-419"/>
-        </w:rPr>
-        <w:t>Reiniciar servicios.</w:t>
+        <w:t>Uso de backup incremental.</w:t>
       </w:r>
     </w:p>
     <w:p>
@@ -14267,27 +11828,7 @@
           <w:szCs w:val="24"/>
           <w:lang w:eastAsia="es-419"/>
         </w:rPr>
-        <w:t xml:space="preserve">de </w:t>
-      </w:r>
-      <w:proofErr w:type="gramStart"/>
-      <w:r>
-        <w:rPr>
-          <w:rFonts w:ascii="Times New Roman" w:eastAsia="Times New Roman" w:hAnsi="Times New Roman" w:cs="Times New Roman"/>
-          <w:sz w:val="24"/>
-          <w:szCs w:val="24"/>
-          <w:lang w:eastAsia="es-419"/>
-        </w:rPr>
-        <w:t>Abril</w:t>
-      </w:r>
-      <w:proofErr w:type="gramEnd"/>
-      <w:r>
-        <w:rPr>
-          <w:rFonts w:ascii="Times New Roman" w:eastAsia="Times New Roman" w:hAnsi="Times New Roman" w:cs="Times New Roman"/>
-          <w:sz w:val="24"/>
-          <w:szCs w:val="24"/>
-          <w:lang w:eastAsia="es-419"/>
-        </w:rPr>
-        <w:t xml:space="preserve"> de 2026</w:t>
+        <w:t>de Abril de 2026</w:t>
       </w:r>
       <w:r>
         <w:rPr>
@@ -14716,7 +12257,6 @@
           <w:szCs w:val="48"/>
           <w:lang w:eastAsia="es-419"/>
         </w:rPr>
-        <w:lastRenderedPageBreak/>
         <w:t>13. SEGURIDAD DEL RESPALDO</w:t>
       </w:r>
     </w:p>
@@ -14823,27 +12363,7 @@
           <w:szCs w:val="24"/>
           <w:lang w:eastAsia="es-419"/>
         </w:rPr>
-        <w:t xml:space="preserve">Solo administradores autorizados pueden acceder a los </w:t>
-      </w:r>
-      <w:proofErr w:type="spellStart"/>
-      <w:r>
-        <w:rPr>
-          <w:rFonts w:ascii="Times New Roman" w:eastAsia="Times New Roman" w:hAnsi="Times New Roman" w:cs="Times New Roman"/>
-          <w:sz w:val="24"/>
-          <w:szCs w:val="24"/>
-          <w:lang w:eastAsia="es-419"/>
-        </w:rPr>
-        <w:t>backups</w:t>
-      </w:r>
-      <w:proofErr w:type="spellEnd"/>
-      <w:r>
-        <w:rPr>
-          <w:rFonts w:ascii="Times New Roman" w:eastAsia="Times New Roman" w:hAnsi="Times New Roman" w:cs="Times New Roman"/>
-          <w:sz w:val="24"/>
-          <w:szCs w:val="24"/>
-          <w:lang w:eastAsia="es-419"/>
-        </w:rPr>
-        <w:t>.</w:t>
+        <w:t>Solo administradores autorizados pueden acceder a los backups.</w:t>
       </w:r>
     </w:p>
     <w:p>
@@ -14893,17 +12413,7 @@
           <w:szCs w:val="24"/>
           <w:lang w:eastAsia="es-419"/>
         </w:rPr>
-        <w:t xml:space="preserve">Protección de credenciales en </w:t>
-      </w:r>
-      <w:proofErr w:type="gramStart"/>
-      <w:r>
-        <w:rPr>
-          <w:rFonts w:ascii="Times New Roman" w:eastAsia="Times New Roman" w:hAnsi="Times New Roman" w:cs="Times New Roman"/>
-          <w:sz w:val="24"/>
-          <w:szCs w:val="24"/>
-          <w:lang w:eastAsia="es-419"/>
-        </w:rPr>
-        <w:t xml:space="preserve">archivos </w:t>
+        <w:t xml:space="preserve">Protección de credenciales en archivos </w:t>
       </w:r>
       <w:r>
         <w:rPr>
@@ -14912,20 +12422,8 @@
           <w:szCs w:val="20"/>
           <w:lang w:eastAsia="es-419"/>
         </w:rPr>
-        <w:t>.</w:t>
-      </w:r>
-      <w:proofErr w:type="spellStart"/>
-      <w:r>
-        <w:rPr>
-          <w:rFonts w:ascii="Courier New" w:eastAsia="Times New Roman" w:hAnsi="Courier New" w:cs="Courier New"/>
-          <w:sz w:val="20"/>
-          <w:szCs w:val="20"/>
-          <w:lang w:eastAsia="es-419"/>
-        </w:rPr>
-        <w:t>env</w:t>
-      </w:r>
-      <w:proofErr w:type="spellEnd"/>
-      <w:proofErr w:type="gramEnd"/>
+        <w:t>.env</w:t>
+      </w:r>
       <w:r>
         <w:rPr>
           <w:rFonts w:ascii="Times New Roman" w:eastAsia="Times New Roman" w:hAnsi="Times New Roman" w:cs="Times New Roman"/>
@@ -15009,6 +12507,7 @@
           <w:szCs w:val="24"/>
           <w:lang w:eastAsia="es-419"/>
         </w:rPr>
+        <w:lastRenderedPageBreak/>
         <w:t>Autenticación JWT</w:t>
       </w:r>
     </w:p>
@@ -15278,7 +12777,7 @@
 </file>
 
 <file path=word/numbering.xml><?xml version="1.0" encoding="utf-8"?>
-<w:numbering xmlns:wpc="http://schemas.microsoft.com/office/word/2010/wordprocessingCanvas" xmlns:cx="http://schemas.microsoft.com/office/drawing/2014/chartex" xmlns:cx1="http://schemas.microsoft.com/office/drawing/2015/9/8/chartex" xmlns:cx2="http://schemas.microsoft.com/office/drawing/2015/10/21/chartex" xmlns:cx3="http://schemas.microsoft.com/office/drawing/2016/5/9/chartex" xmlns:cx4="http://schemas.microsoft.com/office/drawing/2016/5/10/chartex" xmlns:cx5="http://schemas.microsoft.com/office/drawing/2016/5/11/chartex" xmlns:cx6="http://schemas.microsoft.com/office/drawing/2016/5/12/chartex" xmlns:cx7="http://schemas.microsoft.com/office/drawing/2016/5/13/chartex" xmlns:cx8="http://schemas.microsoft.com/office/drawing/2016/5/14/chartex" xmlns:mc="http://schemas.openxmlformats.org/markup-compatibility/2006" xmlns:aink="http://schemas.microsoft.com/office/drawing/2016/ink" xmlns:am3d="http://schemas.microsoft.com/office/drawing/2017/model3d" xmlns:o="urn:schemas-microsoft-com:office:office" xmlns:r="http://schemas.openxmlformats.org/officeDocument/2006/relationships" xmlns:m="http://schemas.openxmlformats.org/officeDocument/2006/math" xmlns:v="urn:schemas-microsoft-com:vml" xmlns:wp14="http://schemas.microsoft.com/office/word/2010/wordprocessingDrawing" xmlns:wp="http://schemas.openxmlformats.org/drawingml/2006/wordprocessingDrawing" xmlns:w10="urn:schemas-microsoft-com:office:word" xmlns:w="http://schemas.openxmlformats.org/wordprocessingml/2006/main" xmlns:w14="http://schemas.microsoft.com/office/word/2010/wordml" xmlns:w15="http://schemas.microsoft.com/office/word/2012/wordml" xmlns:w16cex="http://schemas.microsoft.com/office/word/2018/wordml/cex" xmlns:w16cid="http://schemas.microsoft.com/office/word/2016/wordml/cid" xmlns:w16="http://schemas.microsoft.com/office/word/2018/wordml" xmlns:w16sdtdh="http://schemas.microsoft.com/office/word/2020/wordml/sdtdatahash" xmlns:w16se="http://schemas.microsoft.com/office/word/2015/wordml/symex" xmlns:wpg="http://schemas.microsoft.com/office/word/2010/wordprocessingGroup" xmlns:wpi="http://schemas.microsoft.com/office/word/2010/wordprocessingInk" xmlns:wne="http://schemas.microsoft.com/office/word/2006/wordml" xmlns:wps="http://schemas.microsoft.com/office/word/2010/wordprocessingShape" mc:Ignorable="w14 w15 w16se w16cid w16 w16cex w16sdtdh wp14">
+<w:numbering xmlns:wpc="http://schemas.microsoft.com/office/word/2010/wordprocessingCanvas" xmlns:cx="http://schemas.microsoft.com/office/drawing/2014/chartex" xmlns:cx1="http://schemas.microsoft.com/office/drawing/2015/9/8/chartex" xmlns:cx2="http://schemas.microsoft.com/office/drawing/2015/10/21/chartex" xmlns:cx3="http://schemas.microsoft.com/office/drawing/2016/5/9/chartex" xmlns:cx4="http://schemas.microsoft.com/office/drawing/2016/5/10/chartex" xmlns:cx5="http://schemas.microsoft.com/office/drawing/2016/5/11/chartex" xmlns:cx6="http://schemas.microsoft.com/office/drawing/2016/5/12/chartex" xmlns:cx7="http://schemas.microsoft.com/office/drawing/2016/5/13/chartex" xmlns:cx8="http://schemas.microsoft.com/office/drawing/2016/5/14/chartex" xmlns:mc="http://schemas.openxmlformats.org/markup-compatibility/2006" xmlns:aink="http://schemas.microsoft.com/office/drawing/2016/ink" xmlns:am3d="http://schemas.microsoft.com/office/drawing/2017/model3d" xmlns:o="urn:schemas-microsoft-com:office:office" xmlns:oel="http://schemas.microsoft.com/office/2019/extlst" xmlns:r="http://schemas.openxmlformats.org/officeDocument/2006/relationships" xmlns:m="http://schemas.openxmlformats.org/officeDocument/2006/math" xmlns:v="urn:schemas-microsoft-com:vml" xmlns:wp14="http://schemas.microsoft.com/office/word/2010/wordprocessingDrawing" xmlns:wp="http://schemas.openxmlformats.org/drawingml/2006/wordprocessingDrawing" xmlns:w10="urn:schemas-microsoft-com:office:word" xmlns:w="http://schemas.openxmlformats.org/wordprocessingml/2006/main" xmlns:w14="http://schemas.microsoft.com/office/word/2010/wordml" xmlns:w15="http://schemas.microsoft.com/office/word/2012/wordml" xmlns:w16cex="http://schemas.microsoft.com/office/word/2018/wordml/cex" xmlns:w16cid="http://schemas.microsoft.com/office/word/2016/wordml/cid" xmlns:w16="http://schemas.microsoft.com/office/word/2018/wordml" xmlns:w16du="http://schemas.microsoft.com/office/word/2023/wordml/word16du" xmlns:w16sdtdh="http://schemas.microsoft.com/office/word/2020/wordml/sdtdatahash" xmlns:w16se="http://schemas.microsoft.com/office/word/2015/wordml/symex" xmlns:wpg="http://schemas.microsoft.com/office/word/2010/wordprocessingGroup" xmlns:wpi="http://schemas.microsoft.com/office/word/2010/wordprocessingInk" xmlns:wne="http://schemas.microsoft.com/office/word/2006/wordml" xmlns:wps="http://schemas.microsoft.com/office/word/2010/wordprocessingShape" mc:Ignorable="w14 w15 w16se w16cid w16 w16cex w16sdtdh wp14">
   <w:abstractNum w:abstractNumId="0" w15:restartNumberingAfterBreak="0">
     <w:nsid w:val="00C36FAD"/>
     <w:multiLevelType w:val="multilevel"/>
@@ -24478,205 +21977,205 @@
       </w:rPr>
     </w:lvl>
   </w:abstractNum>
-  <w:num w:numId="1">
+  <w:num w:numId="1" w16cid:durableId="387414335">
     <w:abstractNumId w:val="47"/>
   </w:num>
-  <w:num w:numId="2">
+  <w:num w:numId="2" w16cid:durableId="176509884">
     <w:abstractNumId w:val="42"/>
   </w:num>
-  <w:num w:numId="3">
+  <w:num w:numId="3" w16cid:durableId="974867621">
     <w:abstractNumId w:val="19"/>
   </w:num>
-  <w:num w:numId="4">
+  <w:num w:numId="4" w16cid:durableId="589392050">
     <w:abstractNumId w:val="26"/>
   </w:num>
-  <w:num w:numId="5">
+  <w:num w:numId="5" w16cid:durableId="995574800">
     <w:abstractNumId w:val="54"/>
   </w:num>
-  <w:num w:numId="6">
+  <w:num w:numId="6" w16cid:durableId="243684721">
     <w:abstractNumId w:val="66"/>
   </w:num>
-  <w:num w:numId="7">
+  <w:num w:numId="7" w16cid:durableId="1479688428">
     <w:abstractNumId w:val="37"/>
   </w:num>
-  <w:num w:numId="8">
+  <w:num w:numId="8" w16cid:durableId="1012144659">
     <w:abstractNumId w:val="49"/>
   </w:num>
-  <w:num w:numId="9">
+  <w:num w:numId="9" w16cid:durableId="2117217125">
     <w:abstractNumId w:val="29"/>
   </w:num>
-  <w:num w:numId="10">
+  <w:num w:numId="10" w16cid:durableId="843670485">
     <w:abstractNumId w:val="2"/>
   </w:num>
-  <w:num w:numId="11">
+  <w:num w:numId="11" w16cid:durableId="41515396">
     <w:abstractNumId w:val="38"/>
   </w:num>
-  <w:num w:numId="12">
+  <w:num w:numId="12" w16cid:durableId="27799952">
     <w:abstractNumId w:val="25"/>
   </w:num>
-  <w:num w:numId="13">
+  <w:num w:numId="13" w16cid:durableId="718357926">
     <w:abstractNumId w:val="48"/>
   </w:num>
-  <w:num w:numId="14">
+  <w:num w:numId="14" w16cid:durableId="75324000">
     <w:abstractNumId w:val="5"/>
   </w:num>
-  <w:num w:numId="15">
+  <w:num w:numId="15" w16cid:durableId="1576011563">
     <w:abstractNumId w:val="46"/>
   </w:num>
-  <w:num w:numId="16">
+  <w:num w:numId="16" w16cid:durableId="1921596110">
     <w:abstractNumId w:val="34"/>
   </w:num>
-  <w:num w:numId="17">
+  <w:num w:numId="17" w16cid:durableId="1941719442">
     <w:abstractNumId w:val="11"/>
   </w:num>
-  <w:num w:numId="18">
+  <w:num w:numId="18" w16cid:durableId="704721649">
     <w:abstractNumId w:val="3"/>
   </w:num>
-  <w:num w:numId="19">
+  <w:num w:numId="19" w16cid:durableId="1909531668">
     <w:abstractNumId w:val="7"/>
   </w:num>
-  <w:num w:numId="20">
+  <w:num w:numId="20" w16cid:durableId="1282299113">
     <w:abstractNumId w:val="52"/>
   </w:num>
-  <w:num w:numId="21">
+  <w:num w:numId="21" w16cid:durableId="594897440">
     <w:abstractNumId w:val="53"/>
   </w:num>
-  <w:num w:numId="22">
+  <w:num w:numId="22" w16cid:durableId="1541475799">
     <w:abstractNumId w:val="16"/>
   </w:num>
-  <w:num w:numId="23">
+  <w:num w:numId="23" w16cid:durableId="885145076">
     <w:abstractNumId w:val="45"/>
   </w:num>
-  <w:num w:numId="24">
+  <w:num w:numId="24" w16cid:durableId="1392117161">
     <w:abstractNumId w:val="8"/>
   </w:num>
-  <w:num w:numId="25">
+  <w:num w:numId="25" w16cid:durableId="1422486808">
     <w:abstractNumId w:val="39"/>
   </w:num>
-  <w:num w:numId="26">
+  <w:num w:numId="26" w16cid:durableId="303242834">
     <w:abstractNumId w:val="22"/>
   </w:num>
-  <w:num w:numId="27">
+  <w:num w:numId="27" w16cid:durableId="414206744">
     <w:abstractNumId w:val="1"/>
   </w:num>
-  <w:num w:numId="28">
+  <w:num w:numId="28" w16cid:durableId="586428026">
     <w:abstractNumId w:val="50"/>
   </w:num>
-  <w:num w:numId="29">
+  <w:num w:numId="29" w16cid:durableId="1955600812">
     <w:abstractNumId w:val="57"/>
   </w:num>
-  <w:num w:numId="30">
+  <w:num w:numId="30" w16cid:durableId="124127736">
     <w:abstractNumId w:val="6"/>
   </w:num>
-  <w:num w:numId="31">
+  <w:num w:numId="31" w16cid:durableId="17976258">
     <w:abstractNumId w:val="32"/>
   </w:num>
-  <w:num w:numId="32">
+  <w:num w:numId="32" w16cid:durableId="1590698368">
     <w:abstractNumId w:val="20"/>
   </w:num>
-  <w:num w:numId="33">
+  <w:num w:numId="33" w16cid:durableId="420952885">
     <w:abstractNumId w:val="9"/>
   </w:num>
-  <w:num w:numId="34">
+  <w:num w:numId="34" w16cid:durableId="357662029">
     <w:abstractNumId w:val="4"/>
   </w:num>
-  <w:num w:numId="35">
+  <w:num w:numId="35" w16cid:durableId="1022052503">
     <w:abstractNumId w:val="21"/>
   </w:num>
-  <w:num w:numId="36">
+  <w:num w:numId="36" w16cid:durableId="1414932881">
     <w:abstractNumId w:val="33"/>
   </w:num>
-  <w:num w:numId="37">
+  <w:num w:numId="37" w16cid:durableId="386613797">
     <w:abstractNumId w:val="43"/>
   </w:num>
-  <w:num w:numId="38">
+  <w:num w:numId="38" w16cid:durableId="1425299441">
     <w:abstractNumId w:val="30"/>
   </w:num>
-  <w:num w:numId="39">
+  <w:num w:numId="39" w16cid:durableId="1605916775">
     <w:abstractNumId w:val="60"/>
   </w:num>
-  <w:num w:numId="40">
+  <w:num w:numId="40" w16cid:durableId="883835237">
     <w:abstractNumId w:val="55"/>
   </w:num>
-  <w:num w:numId="41">
+  <w:num w:numId="41" w16cid:durableId="1563565331">
     <w:abstractNumId w:val="15"/>
   </w:num>
-  <w:num w:numId="42">
+  <w:num w:numId="42" w16cid:durableId="1958681393">
     <w:abstractNumId w:val="31"/>
   </w:num>
-  <w:num w:numId="43">
+  <w:num w:numId="43" w16cid:durableId="975649407">
     <w:abstractNumId w:val="28"/>
   </w:num>
-  <w:num w:numId="44">
+  <w:num w:numId="44" w16cid:durableId="1874927002">
     <w:abstractNumId w:val="17"/>
   </w:num>
-  <w:num w:numId="45">
+  <w:num w:numId="45" w16cid:durableId="1929314637">
     <w:abstractNumId w:val="27"/>
   </w:num>
-  <w:num w:numId="46">
+  <w:num w:numId="46" w16cid:durableId="659651907">
     <w:abstractNumId w:val="13"/>
   </w:num>
-  <w:num w:numId="47">
+  <w:num w:numId="47" w16cid:durableId="9185773">
     <w:abstractNumId w:val="51"/>
   </w:num>
-  <w:num w:numId="48">
+  <w:num w:numId="48" w16cid:durableId="1735156112">
     <w:abstractNumId w:val="35"/>
   </w:num>
-  <w:num w:numId="49">
+  <w:num w:numId="49" w16cid:durableId="1816414521">
     <w:abstractNumId w:val="65"/>
   </w:num>
-  <w:num w:numId="50">
+  <w:num w:numId="50" w16cid:durableId="1805997947">
     <w:abstractNumId w:val="18"/>
   </w:num>
-  <w:num w:numId="51">
+  <w:num w:numId="51" w16cid:durableId="120609814">
     <w:abstractNumId w:val="40"/>
   </w:num>
-  <w:num w:numId="52">
+  <w:num w:numId="52" w16cid:durableId="1337616350">
     <w:abstractNumId w:val="12"/>
   </w:num>
-  <w:num w:numId="53">
+  <w:num w:numId="53" w16cid:durableId="1012146141">
     <w:abstractNumId w:val="44"/>
   </w:num>
-  <w:num w:numId="54">
+  <w:num w:numId="54" w16cid:durableId="1844582644">
     <w:abstractNumId w:val="61"/>
   </w:num>
-  <w:num w:numId="55">
+  <w:num w:numId="55" w16cid:durableId="1708722771">
     <w:abstractNumId w:val="41"/>
   </w:num>
-  <w:num w:numId="56">
+  <w:num w:numId="56" w16cid:durableId="929432434">
     <w:abstractNumId w:val="62"/>
   </w:num>
-  <w:num w:numId="57">
+  <w:num w:numId="57" w16cid:durableId="1164128508">
     <w:abstractNumId w:val="0"/>
   </w:num>
-  <w:num w:numId="58">
+  <w:num w:numId="58" w16cid:durableId="1002701624">
     <w:abstractNumId w:val="56"/>
   </w:num>
-  <w:num w:numId="59">
+  <w:num w:numId="59" w16cid:durableId="436023698">
     <w:abstractNumId w:val="58"/>
   </w:num>
-  <w:num w:numId="60">
+  <w:num w:numId="60" w16cid:durableId="1886793884">
     <w:abstractNumId w:val="59"/>
   </w:num>
-  <w:num w:numId="61">
+  <w:num w:numId="61" w16cid:durableId="122039798">
     <w:abstractNumId w:val="36"/>
   </w:num>
-  <w:num w:numId="62">
+  <w:num w:numId="62" w16cid:durableId="670063601">
     <w:abstractNumId w:val="14"/>
   </w:num>
-  <w:num w:numId="63">
+  <w:num w:numId="63" w16cid:durableId="278218256">
     <w:abstractNumId w:val="64"/>
   </w:num>
-  <w:num w:numId="64">
+  <w:num w:numId="64" w16cid:durableId="649097895">
     <w:abstractNumId w:val="10"/>
   </w:num>
-  <w:num w:numId="65">
+  <w:num w:numId="65" w16cid:durableId="112990866">
     <w:abstractNumId w:val="63"/>
   </w:num>
-  <w:num w:numId="66">
+  <w:num w:numId="66" w16cid:durableId="2066178702">
     <w:abstractNumId w:val="24"/>
   </w:num>
-  <w:num w:numId="67">
+  <w:num w:numId="67" w16cid:durableId="1020592822">
     <w:abstractNumId w:val="23"/>
   </w:num>
   <w:numIdMacAtCleanup w:val="66"/>

</xml_diff>